<commit_message>
Remove blank page Signed-off-by: swanandb2 <swanandb18@gmail.com>
</commit_message>
<xml_diff>
--- a/docs/FinalReport.docx
+++ b/docs/FinalReport.docx
@@ -6554,7 +6554,6 @@
               <w:t xml:space="preserve">No immediate action </w:t>
             </w:r>
             <w:proofErr w:type="spellStart"/>
-            <w:proofErr w:type="gramStart"/>
             <w:r>
               <w:rPr>
                 <w:rFonts w:cs="Segoe UI"/>
@@ -6562,7 +6561,6 @@
               <w:t>required.Consider</w:t>
             </w:r>
             <w:proofErr w:type="spellEnd"/>
-            <w:proofErr w:type="gramEnd"/>
             <w:r>
               <w:rPr>
                 <w:rFonts w:cs="Segoe UI"/>
@@ -6821,141 +6819,8 @@
                 <w:sz w:val="18"/>
                 <w:szCs w:val="18"/>
               </w:rPr>
-              <w:t>CVSS:3.1/</w:t>
-            </w:r>
-            <w:proofErr w:type="gramStart"/>
-            <w:r>
-              <w:rPr>
-                <w:rFonts w:ascii="Raleway" w:eastAsia="Ubuntu" w:hAnsi="Raleway" w:cs="Segoe UI"/>
-                <w:bCs/>
-                <w:caps w:val="0"/>
-                <w:color w:val="000000" w:themeColor="text1"/>
-                <w:sz w:val="18"/>
-                <w:szCs w:val="18"/>
-              </w:rPr>
-              <w:t>AV:N</w:t>
-            </w:r>
-            <w:proofErr w:type="gramEnd"/>
-            <w:r>
-              <w:rPr>
-                <w:rFonts w:ascii="Raleway" w:eastAsia="Ubuntu" w:hAnsi="Raleway" w:cs="Segoe UI"/>
-                <w:bCs/>
-                <w:caps w:val="0"/>
-                <w:color w:val="000000" w:themeColor="text1"/>
-                <w:sz w:val="18"/>
-                <w:szCs w:val="18"/>
-              </w:rPr>
-              <w:t>/</w:t>
-            </w:r>
-            <w:proofErr w:type="gramStart"/>
-            <w:r>
-              <w:rPr>
-                <w:rFonts w:ascii="Raleway" w:eastAsia="Ubuntu" w:hAnsi="Raleway" w:cs="Segoe UI"/>
-                <w:bCs/>
-                <w:caps w:val="0"/>
-                <w:color w:val="000000" w:themeColor="text1"/>
-                <w:sz w:val="18"/>
-                <w:szCs w:val="18"/>
-              </w:rPr>
-              <w:t>AC:L</w:t>
-            </w:r>
-            <w:proofErr w:type="gramEnd"/>
-            <w:r>
-              <w:rPr>
-                <w:rFonts w:ascii="Raleway" w:eastAsia="Ubuntu" w:hAnsi="Raleway" w:cs="Segoe UI"/>
-                <w:bCs/>
-                <w:caps w:val="0"/>
-                <w:color w:val="000000" w:themeColor="text1"/>
-                <w:sz w:val="18"/>
-                <w:szCs w:val="18"/>
-              </w:rPr>
-              <w:t>/</w:t>
-            </w:r>
-            <w:proofErr w:type="gramStart"/>
-            <w:r>
-              <w:rPr>
-                <w:rFonts w:ascii="Raleway" w:eastAsia="Ubuntu" w:hAnsi="Raleway" w:cs="Segoe UI"/>
-                <w:bCs/>
-                <w:caps w:val="0"/>
-                <w:color w:val="000000" w:themeColor="text1"/>
-                <w:sz w:val="18"/>
-                <w:szCs w:val="18"/>
-              </w:rPr>
-              <w:t>PR:L</w:t>
-            </w:r>
-            <w:proofErr w:type="gramEnd"/>
-            <w:r>
-              <w:rPr>
-                <w:rFonts w:ascii="Raleway" w:eastAsia="Ubuntu" w:hAnsi="Raleway" w:cs="Segoe UI"/>
-                <w:bCs/>
-                <w:caps w:val="0"/>
-                <w:color w:val="000000" w:themeColor="text1"/>
-                <w:sz w:val="18"/>
-                <w:szCs w:val="18"/>
-              </w:rPr>
-              <w:t>/</w:t>
-            </w:r>
-            <w:proofErr w:type="gramStart"/>
-            <w:r>
-              <w:rPr>
-                <w:rFonts w:ascii="Raleway" w:eastAsia="Ubuntu" w:hAnsi="Raleway" w:cs="Segoe UI"/>
-                <w:bCs/>
-                <w:caps w:val="0"/>
-                <w:color w:val="000000" w:themeColor="text1"/>
-                <w:sz w:val="18"/>
-                <w:szCs w:val="18"/>
-              </w:rPr>
-              <w:t>UI:N</w:t>
-            </w:r>
-            <w:proofErr w:type="gramEnd"/>
-            <w:r>
-              <w:rPr>
-                <w:rFonts w:ascii="Raleway" w:eastAsia="Ubuntu" w:hAnsi="Raleway" w:cs="Segoe UI"/>
-                <w:bCs/>
-                <w:caps w:val="0"/>
-                <w:color w:val="000000" w:themeColor="text1"/>
-                <w:sz w:val="18"/>
-                <w:szCs w:val="18"/>
-              </w:rPr>
-              <w:t>/</w:t>
-            </w:r>
-            <w:proofErr w:type="gramStart"/>
-            <w:r>
-              <w:rPr>
-                <w:rFonts w:ascii="Raleway" w:eastAsia="Ubuntu" w:hAnsi="Raleway" w:cs="Segoe UI"/>
-                <w:bCs/>
-                <w:caps w:val="0"/>
-                <w:color w:val="000000" w:themeColor="text1"/>
-                <w:sz w:val="18"/>
-                <w:szCs w:val="18"/>
-              </w:rPr>
-              <w:t>S:U</w:t>
-            </w:r>
-            <w:proofErr w:type="gramEnd"/>
-            <w:r>
-              <w:rPr>
-                <w:rFonts w:ascii="Raleway" w:eastAsia="Ubuntu" w:hAnsi="Raleway" w:cs="Segoe UI"/>
-                <w:bCs/>
-                <w:caps w:val="0"/>
-                <w:color w:val="000000" w:themeColor="text1"/>
-                <w:sz w:val="18"/>
-                <w:szCs w:val="18"/>
-              </w:rPr>
-              <w:t>/C:H/I:H/</w:t>
-            </w:r>
-            <w:proofErr w:type="gramStart"/>
-            <w:r>
-              <w:rPr>
-                <w:rFonts w:ascii="Raleway" w:eastAsia="Ubuntu" w:hAnsi="Raleway" w:cs="Segoe UI"/>
-                <w:bCs/>
-                <w:caps w:val="0"/>
-                <w:color w:val="000000" w:themeColor="text1"/>
-                <w:sz w:val="18"/>
-                <w:szCs w:val="18"/>
-              </w:rPr>
-              <w:t>A:L</w:t>
-            </w:r>
-            <w:proofErr w:type="gramEnd"/>
+              <w:t>CVSS:3.1/AV:N/AC:L/PR:L/UI:N/S:U/C:H/I:H/A:L</w:t>
+            </w:r>
           </w:p>
         </w:tc>
       </w:tr>
@@ -8146,18 +8011,8 @@
                 <w:sz w:val="16"/>
                 <w:szCs w:val="16"/>
               </w:rPr>
-              <w:t xml:space="preserve">CVSS v3.1 </w:t>
-            </w:r>
-            <w:proofErr w:type="gramStart"/>
-            <w:r>
-              <w:rPr>
-                <w:rFonts w:ascii="Raleway" w:hAnsi="Raleway" w:cs="Segoe UI"/>
-                <w:sz w:val="16"/>
-                <w:szCs w:val="16"/>
-              </w:rPr>
-              <w:t>Score</w:t>
-            </w:r>
-            <w:proofErr w:type="gramEnd"/>
+              <w:t>CVSS v3.1 Score</w:t>
+            </w:r>
           </w:p>
         </w:tc>
         <w:tc>
@@ -8255,141 +8110,8 @@
                 <w:sz w:val="18"/>
                 <w:szCs w:val="18"/>
               </w:rPr>
-              <w:t>CVSS:3.1/</w:t>
-            </w:r>
-            <w:proofErr w:type="gramStart"/>
-            <w:r>
-              <w:rPr>
-                <w:rFonts w:ascii="Raleway" w:eastAsia="Ubuntu" w:hAnsi="Raleway" w:cs="Segoe UI"/>
-                <w:bCs/>
-                <w:caps w:val="0"/>
-                <w:color w:val="000000" w:themeColor="text1"/>
-                <w:sz w:val="18"/>
-                <w:szCs w:val="18"/>
-              </w:rPr>
-              <w:t>AV:N</w:t>
-            </w:r>
-            <w:proofErr w:type="gramEnd"/>
-            <w:r>
-              <w:rPr>
-                <w:rFonts w:ascii="Raleway" w:eastAsia="Ubuntu" w:hAnsi="Raleway" w:cs="Segoe UI"/>
-                <w:bCs/>
-                <w:caps w:val="0"/>
-                <w:color w:val="000000" w:themeColor="text1"/>
-                <w:sz w:val="18"/>
-                <w:szCs w:val="18"/>
-              </w:rPr>
-              <w:t>/</w:t>
-            </w:r>
-            <w:proofErr w:type="gramStart"/>
-            <w:r>
-              <w:rPr>
-                <w:rFonts w:ascii="Raleway" w:eastAsia="Ubuntu" w:hAnsi="Raleway" w:cs="Segoe UI"/>
-                <w:bCs/>
-                <w:caps w:val="0"/>
-                <w:color w:val="000000" w:themeColor="text1"/>
-                <w:sz w:val="18"/>
-                <w:szCs w:val="18"/>
-              </w:rPr>
-              <w:t>AC:L</w:t>
-            </w:r>
-            <w:proofErr w:type="gramEnd"/>
-            <w:r>
-              <w:rPr>
-                <w:rFonts w:ascii="Raleway" w:eastAsia="Ubuntu" w:hAnsi="Raleway" w:cs="Segoe UI"/>
-                <w:bCs/>
-                <w:caps w:val="0"/>
-                <w:color w:val="000000" w:themeColor="text1"/>
-                <w:sz w:val="18"/>
-                <w:szCs w:val="18"/>
-              </w:rPr>
-              <w:t>/</w:t>
-            </w:r>
-            <w:proofErr w:type="gramStart"/>
-            <w:r>
-              <w:rPr>
-                <w:rFonts w:ascii="Raleway" w:eastAsia="Ubuntu" w:hAnsi="Raleway" w:cs="Segoe UI"/>
-                <w:bCs/>
-                <w:caps w:val="0"/>
-                <w:color w:val="000000" w:themeColor="text1"/>
-                <w:sz w:val="18"/>
-                <w:szCs w:val="18"/>
-              </w:rPr>
-              <w:t>PR:N</w:t>
-            </w:r>
-            <w:proofErr w:type="gramEnd"/>
-            <w:r>
-              <w:rPr>
-                <w:rFonts w:ascii="Raleway" w:eastAsia="Ubuntu" w:hAnsi="Raleway" w:cs="Segoe UI"/>
-                <w:bCs/>
-                <w:caps w:val="0"/>
-                <w:color w:val="000000" w:themeColor="text1"/>
-                <w:sz w:val="18"/>
-                <w:szCs w:val="18"/>
-              </w:rPr>
-              <w:t>/</w:t>
-            </w:r>
-            <w:proofErr w:type="gramStart"/>
-            <w:r>
-              <w:rPr>
-                <w:rFonts w:ascii="Raleway" w:eastAsia="Ubuntu" w:hAnsi="Raleway" w:cs="Segoe UI"/>
-                <w:bCs/>
-                <w:caps w:val="0"/>
-                <w:color w:val="000000" w:themeColor="text1"/>
-                <w:sz w:val="18"/>
-                <w:szCs w:val="18"/>
-              </w:rPr>
-              <w:t>UI:N</w:t>
-            </w:r>
-            <w:proofErr w:type="gramEnd"/>
-            <w:r>
-              <w:rPr>
-                <w:rFonts w:ascii="Raleway" w:eastAsia="Ubuntu" w:hAnsi="Raleway" w:cs="Segoe UI"/>
-                <w:bCs/>
-                <w:caps w:val="0"/>
-                <w:color w:val="000000" w:themeColor="text1"/>
-                <w:sz w:val="18"/>
-                <w:szCs w:val="18"/>
-              </w:rPr>
-              <w:t>/</w:t>
-            </w:r>
-            <w:proofErr w:type="gramStart"/>
-            <w:r>
-              <w:rPr>
-                <w:rFonts w:ascii="Raleway" w:eastAsia="Ubuntu" w:hAnsi="Raleway" w:cs="Segoe UI"/>
-                <w:bCs/>
-                <w:caps w:val="0"/>
-                <w:color w:val="000000" w:themeColor="text1"/>
-                <w:sz w:val="18"/>
-                <w:szCs w:val="18"/>
-              </w:rPr>
-              <w:t>S:U</w:t>
-            </w:r>
-            <w:proofErr w:type="gramEnd"/>
-            <w:r>
-              <w:rPr>
-                <w:rFonts w:ascii="Raleway" w:eastAsia="Ubuntu" w:hAnsi="Raleway" w:cs="Segoe UI"/>
-                <w:bCs/>
-                <w:caps w:val="0"/>
-                <w:color w:val="000000" w:themeColor="text1"/>
-                <w:sz w:val="18"/>
-                <w:szCs w:val="18"/>
-              </w:rPr>
-              <w:t>/C:H/I:H/</w:t>
-            </w:r>
-            <w:proofErr w:type="gramStart"/>
-            <w:r>
-              <w:rPr>
-                <w:rFonts w:ascii="Raleway" w:eastAsia="Ubuntu" w:hAnsi="Raleway" w:cs="Segoe UI"/>
-                <w:bCs/>
-                <w:caps w:val="0"/>
-                <w:color w:val="000000" w:themeColor="text1"/>
-                <w:sz w:val="18"/>
-                <w:szCs w:val="18"/>
-              </w:rPr>
-              <w:t>A:L</w:t>
-            </w:r>
-            <w:proofErr w:type="gramEnd"/>
+              <w:t>CVSS:3.1/AV:N/AC:L/PR:N/UI:N/S:U/C:H/I:H/A:L</w:t>
+            </w:r>
           </w:p>
         </w:tc>
       </w:tr>
@@ -9568,18 +9290,8 @@
                 <w:sz w:val="16"/>
                 <w:szCs w:val="16"/>
               </w:rPr>
-              <w:t xml:space="preserve">CVSS v3.1 </w:t>
-            </w:r>
-            <w:proofErr w:type="gramStart"/>
-            <w:r>
-              <w:rPr>
-                <w:rFonts w:ascii="Raleway" w:hAnsi="Raleway" w:cs="Segoe UI"/>
-                <w:sz w:val="16"/>
-                <w:szCs w:val="16"/>
-              </w:rPr>
-              <w:t>Score</w:t>
-            </w:r>
-            <w:proofErr w:type="gramEnd"/>
+              <w:t>CVSS v3.1 Score</w:t>
+            </w:r>
           </w:p>
         </w:tc>
         <w:tc>
@@ -9680,7 +9392,6 @@
               <w:t>CVSS:3.1/</w:t>
             </w:r>
             <w:hyperlink r:id="rId18" w:tgtFrame="_blank" w:history="1">
-              <w:proofErr w:type="gramStart"/>
               <w:r>
                 <w:rPr>
                   <w:rFonts w:ascii="Raleway" w:eastAsia="Ubuntu" w:hAnsi="Raleway" w:cs="Segoe UI"/>
@@ -9690,129 +9401,8 @@
                   <w:sz w:val="18"/>
                   <w:szCs w:val="18"/>
                 </w:rPr>
-                <w:t>AV:N</w:t>
+                <w:t>AV:N/AC:L/PR:N/UI:N/S:U/C:H/I:H/A:L</w:t>
               </w:r>
-              <w:proofErr w:type="gramEnd"/>
-              <w:r>
-                <w:rPr>
-                  <w:rFonts w:ascii="Raleway" w:eastAsia="Ubuntu" w:hAnsi="Raleway" w:cs="Segoe UI"/>
-                  <w:bCs/>
-                  <w:caps w:val="0"/>
-                  <w:color w:val="000000" w:themeColor="text1"/>
-                  <w:sz w:val="18"/>
-                  <w:szCs w:val="18"/>
-                </w:rPr>
-                <w:t>/</w:t>
-              </w:r>
-              <w:proofErr w:type="gramStart"/>
-              <w:r>
-                <w:rPr>
-                  <w:rFonts w:ascii="Raleway" w:eastAsia="Ubuntu" w:hAnsi="Raleway" w:cs="Segoe UI"/>
-                  <w:bCs/>
-                  <w:caps w:val="0"/>
-                  <w:color w:val="000000" w:themeColor="text1"/>
-                  <w:sz w:val="18"/>
-                  <w:szCs w:val="18"/>
-                </w:rPr>
-                <w:t>AC:L</w:t>
-              </w:r>
-              <w:proofErr w:type="gramEnd"/>
-              <w:r>
-                <w:rPr>
-                  <w:rFonts w:ascii="Raleway" w:eastAsia="Ubuntu" w:hAnsi="Raleway" w:cs="Segoe UI"/>
-                  <w:bCs/>
-                  <w:caps w:val="0"/>
-                  <w:color w:val="000000" w:themeColor="text1"/>
-                  <w:sz w:val="18"/>
-                  <w:szCs w:val="18"/>
-                </w:rPr>
-                <w:t>/</w:t>
-              </w:r>
-              <w:proofErr w:type="gramStart"/>
-              <w:r>
-                <w:rPr>
-                  <w:rFonts w:ascii="Raleway" w:eastAsia="Ubuntu" w:hAnsi="Raleway" w:cs="Segoe UI"/>
-                  <w:bCs/>
-                  <w:caps w:val="0"/>
-                  <w:color w:val="000000" w:themeColor="text1"/>
-                  <w:sz w:val="18"/>
-                  <w:szCs w:val="18"/>
-                </w:rPr>
-                <w:t>PR:N</w:t>
-              </w:r>
-              <w:proofErr w:type="gramEnd"/>
-              <w:r>
-                <w:rPr>
-                  <w:rFonts w:ascii="Raleway" w:eastAsia="Ubuntu" w:hAnsi="Raleway" w:cs="Segoe UI"/>
-                  <w:bCs/>
-                  <w:caps w:val="0"/>
-                  <w:color w:val="000000" w:themeColor="text1"/>
-                  <w:sz w:val="18"/>
-                  <w:szCs w:val="18"/>
-                </w:rPr>
-                <w:t>/</w:t>
-              </w:r>
-              <w:proofErr w:type="gramStart"/>
-              <w:r>
-                <w:rPr>
-                  <w:rFonts w:ascii="Raleway" w:eastAsia="Ubuntu" w:hAnsi="Raleway" w:cs="Segoe UI"/>
-                  <w:bCs/>
-                  <w:caps w:val="0"/>
-                  <w:color w:val="000000" w:themeColor="text1"/>
-                  <w:sz w:val="18"/>
-                  <w:szCs w:val="18"/>
-                </w:rPr>
-                <w:t>UI:N</w:t>
-              </w:r>
-              <w:proofErr w:type="gramEnd"/>
-              <w:r>
-                <w:rPr>
-                  <w:rFonts w:ascii="Raleway" w:eastAsia="Ubuntu" w:hAnsi="Raleway" w:cs="Segoe UI"/>
-                  <w:bCs/>
-                  <w:caps w:val="0"/>
-                  <w:color w:val="000000" w:themeColor="text1"/>
-                  <w:sz w:val="18"/>
-                  <w:szCs w:val="18"/>
-                </w:rPr>
-                <w:t>/</w:t>
-              </w:r>
-              <w:proofErr w:type="gramStart"/>
-              <w:r>
-                <w:rPr>
-                  <w:rFonts w:ascii="Raleway" w:eastAsia="Ubuntu" w:hAnsi="Raleway" w:cs="Segoe UI"/>
-                  <w:bCs/>
-                  <w:caps w:val="0"/>
-                  <w:color w:val="000000" w:themeColor="text1"/>
-                  <w:sz w:val="18"/>
-                  <w:szCs w:val="18"/>
-                </w:rPr>
-                <w:t>S:U</w:t>
-              </w:r>
-              <w:proofErr w:type="gramEnd"/>
-              <w:r>
-                <w:rPr>
-                  <w:rFonts w:ascii="Raleway" w:eastAsia="Ubuntu" w:hAnsi="Raleway" w:cs="Segoe UI"/>
-                  <w:bCs/>
-                  <w:caps w:val="0"/>
-                  <w:color w:val="000000" w:themeColor="text1"/>
-                  <w:sz w:val="18"/>
-                  <w:szCs w:val="18"/>
-                </w:rPr>
-                <w:t>/C:H/I:H/</w:t>
-              </w:r>
-              <w:proofErr w:type="gramStart"/>
-              <w:r>
-                <w:rPr>
-                  <w:rFonts w:ascii="Raleway" w:eastAsia="Ubuntu" w:hAnsi="Raleway" w:cs="Segoe UI"/>
-                  <w:bCs/>
-                  <w:caps w:val="0"/>
-                  <w:color w:val="000000" w:themeColor="text1"/>
-                  <w:sz w:val="18"/>
-                  <w:szCs w:val="18"/>
-                </w:rPr>
-                <w:t>A:L</w:t>
-              </w:r>
-              <w:proofErr w:type="gramEnd"/>
             </w:hyperlink>
           </w:p>
         </w:tc>
@@ -10883,18 +10473,8 @@
                 <w:sz w:val="16"/>
                 <w:szCs w:val="16"/>
               </w:rPr>
-              <w:t xml:space="preserve">CVSS v3.1 </w:t>
-            </w:r>
-            <w:proofErr w:type="gramStart"/>
-            <w:r>
-              <w:rPr>
-                <w:rFonts w:ascii="Raleway" w:hAnsi="Raleway" w:cs="Segoe UI"/>
-                <w:sz w:val="16"/>
-                <w:szCs w:val="16"/>
-              </w:rPr>
-              <w:t>Score</w:t>
-            </w:r>
-            <w:proofErr w:type="gramEnd"/>
+              <w:t>CVSS v3.1 Score</w:t>
+            </w:r>
           </w:p>
         </w:tc>
         <w:tc>
@@ -11005,7 +10585,6 @@
               </w:rPr>
               <w:t>/</w:t>
             </w:r>
-            <w:proofErr w:type="gramStart"/>
             <w:r>
               <w:rPr>
                 <w:rFonts w:ascii="Raleway" w:eastAsia="Ubuntu" w:hAnsi="Raleway" w:cs="Segoe UI"/>
@@ -11015,115 +10594,7 @@
                 <w:sz w:val="18"/>
                 <w:szCs w:val="18"/>
               </w:rPr>
-              <w:t>AV:N</w:t>
-            </w:r>
-            <w:proofErr w:type="gramEnd"/>
-            <w:r>
-              <w:rPr>
-                <w:rFonts w:ascii="Raleway" w:eastAsia="Ubuntu" w:hAnsi="Raleway" w:cs="Segoe UI"/>
-                <w:bCs/>
-                <w:caps w:val="0"/>
-                <w:color w:val="000000" w:themeColor="text1"/>
-                <w:sz w:val="18"/>
-                <w:szCs w:val="18"/>
-              </w:rPr>
-              <w:t>/</w:t>
-            </w:r>
-            <w:proofErr w:type="gramStart"/>
-            <w:r>
-              <w:rPr>
-                <w:rFonts w:ascii="Raleway" w:eastAsia="Ubuntu" w:hAnsi="Raleway" w:cs="Segoe UI"/>
-                <w:bCs/>
-                <w:caps w:val="0"/>
-                <w:color w:val="000000" w:themeColor="text1"/>
-                <w:sz w:val="18"/>
-                <w:szCs w:val="18"/>
-              </w:rPr>
-              <w:t>AC:L</w:t>
-            </w:r>
-            <w:proofErr w:type="gramEnd"/>
-            <w:r>
-              <w:rPr>
-                <w:rFonts w:ascii="Raleway" w:eastAsia="Ubuntu" w:hAnsi="Raleway" w:cs="Segoe UI"/>
-                <w:bCs/>
-                <w:caps w:val="0"/>
-                <w:color w:val="000000" w:themeColor="text1"/>
-                <w:sz w:val="18"/>
-                <w:szCs w:val="18"/>
-              </w:rPr>
-              <w:t>/</w:t>
-            </w:r>
-            <w:proofErr w:type="gramStart"/>
-            <w:r>
-              <w:rPr>
-                <w:rFonts w:ascii="Raleway" w:eastAsia="Ubuntu" w:hAnsi="Raleway" w:cs="Segoe UI"/>
-                <w:bCs/>
-                <w:caps w:val="0"/>
-                <w:color w:val="000000" w:themeColor="text1"/>
-                <w:sz w:val="18"/>
-                <w:szCs w:val="18"/>
-              </w:rPr>
-              <w:t>PR:N</w:t>
-            </w:r>
-            <w:proofErr w:type="gramEnd"/>
-            <w:r>
-              <w:rPr>
-                <w:rFonts w:ascii="Raleway" w:eastAsia="Ubuntu" w:hAnsi="Raleway" w:cs="Segoe UI"/>
-                <w:bCs/>
-                <w:caps w:val="0"/>
-                <w:color w:val="000000" w:themeColor="text1"/>
-                <w:sz w:val="18"/>
-                <w:szCs w:val="18"/>
-              </w:rPr>
-              <w:t>/</w:t>
-            </w:r>
-            <w:proofErr w:type="gramStart"/>
-            <w:r>
-              <w:rPr>
-                <w:rFonts w:ascii="Raleway" w:eastAsia="Ubuntu" w:hAnsi="Raleway" w:cs="Segoe UI"/>
-                <w:bCs/>
-                <w:caps w:val="0"/>
-                <w:color w:val="000000" w:themeColor="text1"/>
-                <w:sz w:val="18"/>
-                <w:szCs w:val="18"/>
-              </w:rPr>
-              <w:t>UI:N</w:t>
-            </w:r>
-            <w:proofErr w:type="gramEnd"/>
-            <w:r>
-              <w:rPr>
-                <w:rFonts w:ascii="Raleway" w:eastAsia="Ubuntu" w:hAnsi="Raleway" w:cs="Segoe UI"/>
-                <w:bCs/>
-                <w:caps w:val="0"/>
-                <w:color w:val="000000" w:themeColor="text1"/>
-                <w:sz w:val="18"/>
-                <w:szCs w:val="18"/>
-              </w:rPr>
-              <w:t>/</w:t>
-            </w:r>
-            <w:proofErr w:type="gramStart"/>
-            <w:r>
-              <w:rPr>
-                <w:rFonts w:ascii="Raleway" w:eastAsia="Ubuntu" w:hAnsi="Raleway" w:cs="Segoe UI"/>
-                <w:bCs/>
-                <w:caps w:val="0"/>
-                <w:color w:val="000000" w:themeColor="text1"/>
-                <w:sz w:val="18"/>
-                <w:szCs w:val="18"/>
-              </w:rPr>
-              <w:t>S:U</w:t>
-            </w:r>
-            <w:proofErr w:type="gramEnd"/>
-            <w:r>
-              <w:rPr>
-                <w:rFonts w:ascii="Raleway" w:eastAsia="Ubuntu" w:hAnsi="Raleway" w:cs="Segoe UI"/>
-                <w:bCs/>
-                <w:caps w:val="0"/>
-                <w:color w:val="000000" w:themeColor="text1"/>
-                <w:sz w:val="18"/>
-                <w:szCs w:val="18"/>
-              </w:rPr>
-              <w:t>/C:H/I:H/A:H</w:t>
+              <w:t>AV:N/AC:L/PR:N/UI:N/S:U/C:H/I:H/A:H</w:t>
             </w:r>
           </w:p>
         </w:tc>
@@ -12209,46 +11680,23 @@
     <w:p>
       <w:pPr>
         <w:spacing w:after="160" w:line="278" w:lineRule="auto"/>
-        <w:rPr>
-          <w:rFonts w:ascii="Raleway" w:eastAsiaTheme="majorEastAsia" w:hAnsi="Raleway" w:cstheme="majorBidi"/>
-          <w:b/>
-          <w:color w:val="DE713A"/>
-          <w:sz w:val="28"/>
-          <w:szCs w:val="40"/>
-        </w:rPr>
       </w:pPr>
       <w:bookmarkStart w:id="24" w:name="_Toc177730349"/>
+    </w:p>
+    <w:p>
+      <w:pPr>
+        <w:spacing w:after="160" w:line="278" w:lineRule="auto"/>
+        <w:rPr>
+          <w:rFonts w:ascii="Times New Roman" w:hAnsi="Times New Roman"/>
+        </w:rPr>
+      </w:pPr>
       <w:r>
         <w:br w:type="page"/>
       </w:r>
-    </w:p>
-    <w:p>
-      <w:pPr>
-        <w:spacing w:after="160" w:line="278" w:lineRule="auto"/>
-        <w:rPr>
-          <w:rFonts w:ascii="Raleway" w:eastAsiaTheme="majorEastAsia" w:hAnsi="Raleway" w:cstheme="majorBidi"/>
-          <w:b/>
-          <w:color w:val="DE713A"/>
-          <w:sz w:val="28"/>
-          <w:szCs w:val="40"/>
-        </w:rPr>
-      </w:pPr>
-      <w:r>
-        <w:lastRenderedPageBreak/>
-        <w:br w:type="page"/>
-      </w:r>
-    </w:p>
-    <w:p>
-      <w:pPr>
-        <w:pStyle w:val="Heading3"/>
-        <w:rPr>
-          <w:rFonts w:ascii="Times New Roman" w:hAnsi="Times New Roman" w:cs="Times New Roman"/>
-        </w:rPr>
-      </w:pPr>
       <w:bookmarkStart w:id="25" w:name="_Toc235567827"/>
       <w:r>
         <w:rPr>
-          <w:rFonts w:ascii="Times New Roman" w:hAnsi="Times New Roman" w:cs="Times New Roman"/>
+          <w:rFonts w:ascii="Times New Roman" w:hAnsi="Times New Roman"/>
         </w:rPr>
         <w:lastRenderedPageBreak/>
         <w:t>Arbitrary File Upload leading to RCE (Placement Portal)</w:t>
@@ -12312,18 +11760,8 @@
                 <w:sz w:val="16"/>
                 <w:szCs w:val="16"/>
               </w:rPr>
-              <w:t xml:space="preserve">CVSS v3.1 </w:t>
-            </w:r>
-            <w:proofErr w:type="gramStart"/>
-            <w:r>
-              <w:rPr>
-                <w:rFonts w:ascii="Raleway" w:hAnsi="Raleway" w:cs="Segoe UI"/>
-                <w:sz w:val="16"/>
-                <w:szCs w:val="16"/>
-              </w:rPr>
-              <w:t>Score</w:t>
-            </w:r>
-            <w:proofErr w:type="gramEnd"/>
+              <w:t>CVSS v3.1 Score</w:t>
+            </w:r>
           </w:p>
         </w:tc>
         <w:tc>
@@ -12434,7 +11872,6 @@
               </w:rPr>
               <w:t>/</w:t>
             </w:r>
-            <w:proofErr w:type="gramStart"/>
             <w:r>
               <w:rPr>
                 <w:rFonts w:ascii="Raleway" w:eastAsia="Ubuntu" w:hAnsi="Raleway" w:cs="Segoe UI"/>
@@ -12444,115 +11881,7 @@
                 <w:sz w:val="18"/>
                 <w:szCs w:val="18"/>
               </w:rPr>
-              <w:t>AV:N</w:t>
-            </w:r>
-            <w:proofErr w:type="gramEnd"/>
-            <w:r>
-              <w:rPr>
-                <w:rFonts w:ascii="Raleway" w:eastAsia="Ubuntu" w:hAnsi="Raleway" w:cs="Segoe UI"/>
-                <w:bCs/>
-                <w:caps w:val="0"/>
-                <w:color w:val="000000" w:themeColor="text1"/>
-                <w:sz w:val="18"/>
-                <w:szCs w:val="18"/>
-              </w:rPr>
-              <w:t>/</w:t>
-            </w:r>
-            <w:proofErr w:type="gramStart"/>
-            <w:r>
-              <w:rPr>
-                <w:rFonts w:ascii="Raleway" w:eastAsia="Ubuntu" w:hAnsi="Raleway" w:cs="Segoe UI"/>
-                <w:bCs/>
-                <w:caps w:val="0"/>
-                <w:color w:val="000000" w:themeColor="text1"/>
-                <w:sz w:val="18"/>
-                <w:szCs w:val="18"/>
-              </w:rPr>
-              <w:t>AC:L</w:t>
-            </w:r>
-            <w:proofErr w:type="gramEnd"/>
-            <w:r>
-              <w:rPr>
-                <w:rFonts w:ascii="Raleway" w:eastAsia="Ubuntu" w:hAnsi="Raleway" w:cs="Segoe UI"/>
-                <w:bCs/>
-                <w:caps w:val="0"/>
-                <w:color w:val="000000" w:themeColor="text1"/>
-                <w:sz w:val="18"/>
-                <w:szCs w:val="18"/>
-              </w:rPr>
-              <w:t>/</w:t>
-            </w:r>
-            <w:proofErr w:type="gramStart"/>
-            <w:r>
-              <w:rPr>
-                <w:rFonts w:ascii="Raleway" w:eastAsia="Ubuntu" w:hAnsi="Raleway" w:cs="Segoe UI"/>
-                <w:bCs/>
-                <w:caps w:val="0"/>
-                <w:color w:val="000000" w:themeColor="text1"/>
-                <w:sz w:val="18"/>
-                <w:szCs w:val="18"/>
-              </w:rPr>
-              <w:t>PR:N</w:t>
-            </w:r>
-            <w:proofErr w:type="gramEnd"/>
-            <w:r>
-              <w:rPr>
-                <w:rFonts w:ascii="Raleway" w:eastAsia="Ubuntu" w:hAnsi="Raleway" w:cs="Segoe UI"/>
-                <w:bCs/>
-                <w:caps w:val="0"/>
-                <w:color w:val="000000" w:themeColor="text1"/>
-                <w:sz w:val="18"/>
-                <w:szCs w:val="18"/>
-              </w:rPr>
-              <w:t>/</w:t>
-            </w:r>
-            <w:proofErr w:type="gramStart"/>
-            <w:r>
-              <w:rPr>
-                <w:rFonts w:ascii="Raleway" w:eastAsia="Ubuntu" w:hAnsi="Raleway" w:cs="Segoe UI"/>
-                <w:bCs/>
-                <w:caps w:val="0"/>
-                <w:color w:val="000000" w:themeColor="text1"/>
-                <w:sz w:val="18"/>
-                <w:szCs w:val="18"/>
-              </w:rPr>
-              <w:t>UI:N</w:t>
-            </w:r>
-            <w:proofErr w:type="gramEnd"/>
-            <w:r>
-              <w:rPr>
-                <w:rFonts w:ascii="Raleway" w:eastAsia="Ubuntu" w:hAnsi="Raleway" w:cs="Segoe UI"/>
-                <w:bCs/>
-                <w:caps w:val="0"/>
-                <w:color w:val="000000" w:themeColor="text1"/>
-                <w:sz w:val="18"/>
-                <w:szCs w:val="18"/>
-              </w:rPr>
-              <w:t>/</w:t>
-            </w:r>
-            <w:proofErr w:type="gramStart"/>
-            <w:r>
-              <w:rPr>
-                <w:rFonts w:ascii="Raleway" w:eastAsia="Ubuntu" w:hAnsi="Raleway" w:cs="Segoe UI"/>
-                <w:bCs/>
-                <w:caps w:val="0"/>
-                <w:color w:val="000000" w:themeColor="text1"/>
-                <w:sz w:val="18"/>
-                <w:szCs w:val="18"/>
-              </w:rPr>
-              <w:t>S:U</w:t>
-            </w:r>
-            <w:proofErr w:type="gramEnd"/>
-            <w:r>
-              <w:rPr>
-                <w:rFonts w:ascii="Raleway" w:eastAsia="Ubuntu" w:hAnsi="Raleway" w:cs="Segoe UI"/>
-                <w:bCs/>
-                <w:caps w:val="0"/>
-                <w:color w:val="000000" w:themeColor="text1"/>
-                <w:sz w:val="18"/>
-                <w:szCs w:val="18"/>
-              </w:rPr>
-              <w:t>/C:H/I:H/A:H</w:t>
+              <w:t>AV:N/AC:L/PR:N/UI:N/S:U/C:H/I:H/A:H</w:t>
             </w:r>
           </w:p>
         </w:tc>
@@ -13641,18 +12970,8 @@
                 <w:sz w:val="16"/>
                 <w:szCs w:val="16"/>
               </w:rPr>
-              <w:t xml:space="preserve">CVSS v3.1 </w:t>
-            </w:r>
-            <w:proofErr w:type="gramStart"/>
-            <w:r>
-              <w:rPr>
-                <w:rFonts w:ascii="Raleway" w:hAnsi="Raleway" w:cs="Segoe UI"/>
-                <w:sz w:val="16"/>
-                <w:szCs w:val="16"/>
-              </w:rPr>
-              <w:t>Score</w:t>
-            </w:r>
-            <w:proofErr w:type="gramEnd"/>
+              <w:t>CVSS v3.1 Score</w:t>
+            </w:r>
           </w:p>
         </w:tc>
         <w:tc>
@@ -13761,165 +13080,8 @@
                 <w:sz w:val="18"/>
                 <w:szCs w:val="18"/>
               </w:rPr>
-              <w:t>CVSS:3.1/</w:t>
-            </w:r>
-            <w:proofErr w:type="gramStart"/>
-            <w:r>
-              <w:rPr>
-                <w:rFonts w:ascii="Raleway" w:eastAsia="Ubuntu" w:hAnsi="Raleway" w:cs="Segoe UI"/>
-                <w:bCs/>
-                <w:caps w:val="0"/>
-                <w:color w:val="000000" w:themeColor="text1"/>
-                <w:sz w:val="18"/>
-                <w:szCs w:val="18"/>
-              </w:rPr>
-              <w:t>AV:N</w:t>
-            </w:r>
-            <w:proofErr w:type="gramEnd"/>
-            <w:r>
-              <w:rPr>
-                <w:rFonts w:ascii="Raleway" w:eastAsia="Ubuntu" w:hAnsi="Raleway" w:cs="Segoe UI"/>
-                <w:bCs/>
-                <w:caps w:val="0"/>
-                <w:color w:val="000000" w:themeColor="text1"/>
-                <w:sz w:val="18"/>
-                <w:szCs w:val="18"/>
-              </w:rPr>
-              <w:t>/</w:t>
-            </w:r>
-            <w:proofErr w:type="gramStart"/>
-            <w:r>
-              <w:rPr>
-                <w:rFonts w:ascii="Raleway" w:eastAsia="Ubuntu" w:hAnsi="Raleway" w:cs="Segoe UI"/>
-                <w:bCs/>
-                <w:caps w:val="0"/>
-                <w:color w:val="000000" w:themeColor="text1"/>
-                <w:sz w:val="18"/>
-                <w:szCs w:val="18"/>
-              </w:rPr>
-              <w:t>AC:L</w:t>
-            </w:r>
-            <w:proofErr w:type="gramEnd"/>
-            <w:r>
-              <w:rPr>
-                <w:rFonts w:ascii="Raleway" w:eastAsia="Ubuntu" w:hAnsi="Raleway" w:cs="Segoe UI"/>
-                <w:bCs/>
-                <w:caps w:val="0"/>
-                <w:color w:val="000000" w:themeColor="text1"/>
-                <w:sz w:val="18"/>
-                <w:szCs w:val="18"/>
-              </w:rPr>
-              <w:t>/</w:t>
-            </w:r>
-            <w:proofErr w:type="gramStart"/>
-            <w:r>
-              <w:rPr>
-                <w:rFonts w:ascii="Raleway" w:eastAsia="Ubuntu" w:hAnsi="Raleway" w:cs="Segoe UI"/>
-                <w:bCs/>
-                <w:caps w:val="0"/>
-                <w:color w:val="000000" w:themeColor="text1"/>
-                <w:sz w:val="18"/>
-                <w:szCs w:val="18"/>
-              </w:rPr>
-              <w:t>PR:N</w:t>
-            </w:r>
-            <w:proofErr w:type="gramEnd"/>
-            <w:r>
-              <w:rPr>
-                <w:rFonts w:ascii="Raleway" w:eastAsia="Ubuntu" w:hAnsi="Raleway" w:cs="Segoe UI"/>
-                <w:bCs/>
-                <w:caps w:val="0"/>
-                <w:color w:val="000000" w:themeColor="text1"/>
-                <w:sz w:val="18"/>
-                <w:szCs w:val="18"/>
-              </w:rPr>
-              <w:t>/</w:t>
-            </w:r>
-            <w:proofErr w:type="gramStart"/>
-            <w:r>
-              <w:rPr>
-                <w:rFonts w:ascii="Raleway" w:eastAsia="Ubuntu" w:hAnsi="Raleway" w:cs="Segoe UI"/>
-                <w:bCs/>
-                <w:caps w:val="0"/>
-                <w:color w:val="000000" w:themeColor="text1"/>
-                <w:sz w:val="18"/>
-                <w:szCs w:val="18"/>
-              </w:rPr>
-              <w:t>UI:N</w:t>
-            </w:r>
-            <w:proofErr w:type="gramEnd"/>
-            <w:r>
-              <w:rPr>
-                <w:rFonts w:ascii="Raleway" w:eastAsia="Ubuntu" w:hAnsi="Raleway" w:cs="Segoe UI"/>
-                <w:bCs/>
-                <w:caps w:val="0"/>
-                <w:color w:val="000000" w:themeColor="text1"/>
-                <w:sz w:val="18"/>
-                <w:szCs w:val="18"/>
-              </w:rPr>
-              <w:t>/</w:t>
-            </w:r>
-            <w:proofErr w:type="gramStart"/>
-            <w:r>
-              <w:rPr>
-                <w:rFonts w:ascii="Raleway" w:eastAsia="Ubuntu" w:hAnsi="Raleway" w:cs="Segoe UI"/>
-                <w:bCs/>
-                <w:caps w:val="0"/>
-                <w:color w:val="000000" w:themeColor="text1"/>
-                <w:sz w:val="18"/>
-                <w:szCs w:val="18"/>
-              </w:rPr>
-              <w:t>S:U</w:t>
-            </w:r>
-            <w:proofErr w:type="gramEnd"/>
-            <w:r>
-              <w:rPr>
-                <w:rFonts w:ascii="Raleway" w:eastAsia="Ubuntu" w:hAnsi="Raleway" w:cs="Segoe UI"/>
-                <w:bCs/>
-                <w:caps w:val="0"/>
-                <w:color w:val="000000" w:themeColor="text1"/>
-                <w:sz w:val="18"/>
-                <w:szCs w:val="18"/>
-              </w:rPr>
-              <w:t>/C:H/</w:t>
-            </w:r>
-            <w:proofErr w:type="gramStart"/>
-            <w:r>
-              <w:rPr>
-                <w:rFonts w:ascii="Raleway" w:eastAsia="Ubuntu" w:hAnsi="Raleway" w:cs="Segoe UI"/>
-                <w:bCs/>
-                <w:caps w:val="0"/>
-                <w:color w:val="000000" w:themeColor="text1"/>
-                <w:sz w:val="18"/>
-                <w:szCs w:val="18"/>
-              </w:rPr>
-              <w:t>I:N</w:t>
-            </w:r>
-            <w:proofErr w:type="gramEnd"/>
-            <w:r>
-              <w:rPr>
-                <w:rFonts w:ascii="Raleway" w:eastAsia="Ubuntu" w:hAnsi="Raleway" w:cs="Segoe UI"/>
-                <w:bCs/>
-                <w:caps w:val="0"/>
-                <w:color w:val="000000" w:themeColor="text1"/>
-                <w:sz w:val="18"/>
-                <w:szCs w:val="18"/>
-              </w:rPr>
-              <w:t>/</w:t>
-            </w:r>
-            <w:proofErr w:type="gramStart"/>
-            <w:r>
-              <w:rPr>
-                <w:rFonts w:ascii="Raleway" w:eastAsia="Ubuntu" w:hAnsi="Raleway" w:cs="Segoe UI"/>
-                <w:bCs/>
-                <w:caps w:val="0"/>
-                <w:color w:val="000000" w:themeColor="text1"/>
-                <w:sz w:val="18"/>
-                <w:szCs w:val="18"/>
-              </w:rPr>
-              <w:t>A:N</w:t>
-            </w:r>
-            <w:proofErr w:type="gramEnd"/>
+              <w:t>CVSS:3.1/AV:N/AC:L/PR:N/UI:N/S:U/C:H/I:N/A:N</w:t>
+            </w:r>
           </w:p>
         </w:tc>
       </w:tr>
@@ -14667,18 +13829,8 @@
                 <w:color w:val="DE713A"/>
                 <w:lang w:val="en-IN"/>
               </w:rPr>
-              <w:t>192.168.10.45 / dev-azure-</w:t>
-            </w:r>
-            <w:proofErr w:type="gramStart"/>
-            <w:r>
-              <w:rPr>
-                <w:rFonts w:ascii="Raleway" w:hAnsi="Raleway" w:cs="Segoe UI"/>
-                <w:color w:val="DE713A"/>
-                <w:lang w:val="en-IN"/>
-              </w:rPr>
-              <w:t>node01.campus.internal</w:t>
-            </w:r>
-            <w:proofErr w:type="gramEnd"/>
+              <w:t>192.168.10.45 / dev-azure-node01.campus.internal</w:t>
+            </w:r>
           </w:p>
           <w:p>
             <w:pPr>
@@ -14970,25 +14122,7 @@
           <w:sz w:val="20"/>
           <w:szCs w:val="20"/>
         </w:rPr>
-        <w:t>Nmap scan report for dev-azure-</w:t>
-      </w:r>
-      <w:proofErr w:type="gramStart"/>
-      <w:r>
-        <w:rPr>
-          <w:rFonts w:ascii="Raleway" w:hAnsi="Raleway"/>
-          <w:sz w:val="20"/>
-          <w:szCs w:val="20"/>
-        </w:rPr>
-        <w:t>node01.campus.internal</w:t>
-      </w:r>
-      <w:proofErr w:type="gramEnd"/>
-      <w:r>
-        <w:rPr>
-          <w:rFonts w:ascii="Raleway" w:hAnsi="Raleway"/>
-          <w:sz w:val="20"/>
-          <w:szCs w:val="20"/>
-        </w:rPr>
-        <w:t xml:space="preserve"> (192.168.10.45)</w:t>
+        <w:t>Nmap scan report for dev-azure-node01.campus.internal (192.168.10.45)</w:t>
       </w:r>
     </w:p>
     <w:p>
@@ -15040,25 +14174,7 @@
           <w:sz w:val="20"/>
           <w:szCs w:val="20"/>
         </w:rPr>
-        <w:t xml:space="preserve"> </w:t>
-      </w:r>
-      <w:proofErr w:type="gramStart"/>
-      <w:r>
-        <w:rPr>
-          <w:rFonts w:ascii="Raleway" w:hAnsi="Raleway"/>
-          <w:sz w:val="20"/>
-          <w:szCs w:val="20"/>
-        </w:rPr>
-        <w:t>open  ssh</w:t>
-      </w:r>
-      <w:proofErr w:type="gramEnd"/>
-      <w:r>
-        <w:rPr>
-          <w:rFonts w:ascii="Raleway" w:hAnsi="Raleway"/>
-          <w:sz w:val="20"/>
-          <w:szCs w:val="20"/>
-        </w:rPr>
-        <w:t xml:space="preserve">     OpenSSH 8.2p1 Ubuntu 4ubuntu0.5</w:t>
+        <w:t xml:space="preserve"> open  ssh     OpenSSH 8.2p1 Ubuntu 4ubuntu0.5</w:t>
       </w:r>
     </w:p>
     <w:p>
@@ -15094,25 +14210,7 @@
           <w:sz w:val="20"/>
           <w:szCs w:val="20"/>
         </w:rPr>
-        <w:t>|</w:t>
-      </w:r>
-      <w:proofErr w:type="gramStart"/>
-      <w:r>
-        <w:rPr>
-          <w:rFonts w:ascii="Raleway" w:hAnsi="Raleway"/>
-          <w:sz w:val="20"/>
-          <w:szCs w:val="20"/>
-        </w:rPr>
-        <w:t>_  Supported</w:t>
-      </w:r>
-      <w:proofErr w:type="gramEnd"/>
-      <w:r>
-        <w:rPr>
-          <w:rFonts w:ascii="Raleway" w:hAnsi="Raleway"/>
-          <w:sz w:val="20"/>
-          <w:szCs w:val="20"/>
-        </w:rPr>
-        <w:t xml:space="preserve"> authentication methods: </w:t>
+        <w:t xml:space="preserve">|_  Supported authentication methods: </w:t>
       </w:r>
       <w:proofErr w:type="spellStart"/>
       <w:r>
@@ -15423,18 +14521,8 @@
                 <w:sz w:val="16"/>
                 <w:szCs w:val="16"/>
               </w:rPr>
-              <w:t xml:space="preserve">CVSS v3.1 </w:t>
-            </w:r>
-            <w:proofErr w:type="gramStart"/>
-            <w:r>
-              <w:rPr>
-                <w:rFonts w:ascii="Raleway" w:hAnsi="Raleway" w:cs="Segoe UI"/>
-                <w:sz w:val="16"/>
-                <w:szCs w:val="16"/>
-              </w:rPr>
-              <w:t>Score</w:t>
-            </w:r>
-            <w:proofErr w:type="gramEnd"/>
+              <w:t>CVSS v3.1 Score</w:t>
+            </w:r>
           </w:p>
         </w:tc>
         <w:tc>
@@ -15532,103 +14620,7 @@
                 <w:sz w:val="18"/>
                 <w:szCs w:val="18"/>
               </w:rPr>
-              <w:t>CVSS:3.1/</w:t>
-            </w:r>
-            <w:proofErr w:type="gramStart"/>
-            <w:r>
-              <w:rPr>
-                <w:rFonts w:ascii="Raleway" w:eastAsia="Ubuntu" w:hAnsi="Raleway" w:cs="Segoe UI"/>
-                <w:bCs/>
-                <w:caps w:val="0"/>
-                <w:color w:val="000000" w:themeColor="text1"/>
-                <w:sz w:val="18"/>
-                <w:szCs w:val="18"/>
-              </w:rPr>
-              <w:t>AV:N</w:t>
-            </w:r>
-            <w:proofErr w:type="gramEnd"/>
-            <w:r>
-              <w:rPr>
-                <w:rFonts w:ascii="Raleway" w:eastAsia="Ubuntu" w:hAnsi="Raleway" w:cs="Segoe UI"/>
-                <w:bCs/>
-                <w:caps w:val="0"/>
-                <w:color w:val="000000" w:themeColor="text1"/>
-                <w:sz w:val="18"/>
-                <w:szCs w:val="18"/>
-              </w:rPr>
-              <w:t>/AC:H/</w:t>
-            </w:r>
-            <w:proofErr w:type="gramStart"/>
-            <w:r>
-              <w:rPr>
-                <w:rFonts w:ascii="Raleway" w:eastAsia="Ubuntu" w:hAnsi="Raleway" w:cs="Segoe UI"/>
-                <w:bCs/>
-                <w:caps w:val="0"/>
-                <w:color w:val="000000" w:themeColor="text1"/>
-                <w:sz w:val="18"/>
-                <w:szCs w:val="18"/>
-              </w:rPr>
-              <w:t>PR:N</w:t>
-            </w:r>
-            <w:proofErr w:type="gramEnd"/>
-            <w:r>
-              <w:rPr>
-                <w:rFonts w:ascii="Raleway" w:eastAsia="Ubuntu" w:hAnsi="Raleway" w:cs="Segoe UI"/>
-                <w:bCs/>
-                <w:caps w:val="0"/>
-                <w:color w:val="000000" w:themeColor="text1"/>
-                <w:sz w:val="18"/>
-                <w:szCs w:val="18"/>
-              </w:rPr>
-              <w:t>/</w:t>
-            </w:r>
-            <w:proofErr w:type="gramStart"/>
-            <w:r>
-              <w:rPr>
-                <w:rFonts w:ascii="Raleway" w:eastAsia="Ubuntu" w:hAnsi="Raleway" w:cs="Segoe UI"/>
-                <w:bCs/>
-                <w:caps w:val="0"/>
-                <w:color w:val="000000" w:themeColor="text1"/>
-                <w:sz w:val="18"/>
-                <w:szCs w:val="18"/>
-              </w:rPr>
-              <w:t>UI:N</w:t>
-            </w:r>
-            <w:proofErr w:type="gramEnd"/>
-            <w:r>
-              <w:rPr>
-                <w:rFonts w:ascii="Raleway" w:eastAsia="Ubuntu" w:hAnsi="Raleway" w:cs="Segoe UI"/>
-                <w:bCs/>
-                <w:caps w:val="0"/>
-                <w:color w:val="000000" w:themeColor="text1"/>
-                <w:sz w:val="18"/>
-                <w:szCs w:val="18"/>
-              </w:rPr>
-              <w:t>/</w:t>
-            </w:r>
-            <w:proofErr w:type="gramStart"/>
-            <w:r>
-              <w:rPr>
-                <w:rFonts w:ascii="Raleway" w:eastAsia="Ubuntu" w:hAnsi="Raleway" w:cs="Segoe UI"/>
-                <w:bCs/>
-                <w:caps w:val="0"/>
-                <w:color w:val="000000" w:themeColor="text1"/>
-                <w:sz w:val="18"/>
-                <w:szCs w:val="18"/>
-              </w:rPr>
-              <w:t>S:U</w:t>
-            </w:r>
-            <w:proofErr w:type="gramEnd"/>
-            <w:r>
-              <w:rPr>
-                <w:rFonts w:ascii="Raleway" w:eastAsia="Ubuntu" w:hAnsi="Raleway" w:cs="Segoe UI"/>
-                <w:bCs/>
-                <w:caps w:val="0"/>
-                <w:color w:val="000000" w:themeColor="text1"/>
-                <w:sz w:val="18"/>
-                <w:szCs w:val="18"/>
-              </w:rPr>
-              <w:t>/C:H/I:H/A:H</w:t>
+              <w:t>CVSS:3.1/AV:N/AC:H/PR:N/UI:N/S:U/C:H/I:H/A:H</w:t>
             </w:r>
           </w:p>
         </w:tc>
@@ -16737,9 +15729,9 @@
           <w:szCs w:val="20"/>
           <w:lang w:val="en-IN"/>
         </w:rPr>
-        <w:t xml:space="preserve"> </w:t>
-      </w:r>
-      <w:proofErr w:type="gramStart"/>
+        <w:t xml:space="preserve"> open  </w:t>
+      </w:r>
+      <w:proofErr w:type="spellStart"/>
       <w:r>
         <w:rPr>
           <w:rFonts w:ascii="Raleway" w:hAnsi="Raleway"/>
@@ -16747,7 +15739,65 @@
           <w:szCs w:val="20"/>
           <w:lang w:val="en-IN"/>
         </w:rPr>
-        <w:t xml:space="preserve">open  </w:t>
+        <w:t>microsoft</w:t>
+      </w:r>
+      <w:proofErr w:type="spellEnd"/>
+      <w:r>
+        <w:rPr>
+          <w:rFonts w:ascii="Raleway" w:hAnsi="Raleway"/>
+          <w:sz w:val="20"/>
+          <w:szCs w:val="20"/>
+          <w:lang w:val="en-IN"/>
+        </w:rPr>
+        <w:t>-ds</w:t>
+      </w:r>
+    </w:p>
+    <w:p>
+      <w:pPr>
+        <w:rPr>
+          <w:rFonts w:ascii="Raleway" w:hAnsi="Raleway"/>
+          <w:sz w:val="20"/>
+          <w:szCs w:val="20"/>
+          <w:lang w:val="en-IN"/>
+        </w:rPr>
+      </w:pPr>
+    </w:p>
+    <w:p>
+      <w:pPr>
+        <w:rPr>
+          <w:rFonts w:ascii="Raleway" w:hAnsi="Raleway"/>
+          <w:sz w:val="20"/>
+          <w:szCs w:val="20"/>
+          <w:lang w:val="en-IN"/>
+        </w:rPr>
+      </w:pPr>
+      <w:r>
+        <w:rPr>
+          <w:rFonts w:ascii="Raleway" w:hAnsi="Raleway"/>
+          <w:sz w:val="20"/>
+          <w:szCs w:val="20"/>
+          <w:lang w:val="en-IN"/>
+        </w:rPr>
+        <w:t>Host script results:</w:t>
+      </w:r>
+    </w:p>
+    <w:p>
+      <w:pPr>
+        <w:rPr>
+          <w:rFonts w:ascii="Raleway" w:hAnsi="Raleway"/>
+          <w:sz w:val="20"/>
+          <w:szCs w:val="20"/>
+          <w:lang w:val="en-IN"/>
+        </w:rPr>
+      </w:pPr>
+      <w:r>
+        <w:rPr>
+          <w:rFonts w:ascii="Raleway" w:hAnsi="Raleway"/>
+          <w:sz w:val="20"/>
+          <w:szCs w:val="20"/>
+          <w:lang w:val="en-IN"/>
+        </w:rPr>
+        <w:t xml:space="preserve">| </w:t>
       </w:r>
       <w:proofErr w:type="spellStart"/>
       <w:r>
@@ -16757,10 +15807,9 @@
           <w:szCs w:val="20"/>
           <w:lang w:val="en-IN"/>
         </w:rPr>
-        <w:t>microsoft</w:t>
+        <w:t>smb</w:t>
       </w:r>
       <w:proofErr w:type="spellEnd"/>
-      <w:proofErr w:type="gramEnd"/>
       <w:r>
         <w:rPr>
           <w:rFonts w:ascii="Raleway" w:hAnsi="Raleway"/>
@@ -16768,7 +15817,7 @@
           <w:szCs w:val="20"/>
           <w:lang w:val="en-IN"/>
         </w:rPr>
-        <w:t>-ds</w:t>
+        <w:t xml:space="preserve">-security-mode: </w:t>
       </w:r>
     </w:p>
     <w:p>
@@ -16780,16 +15829,16 @@
           <w:lang w:val="en-IN"/>
         </w:rPr>
       </w:pPr>
-    </w:p>
-    <w:p>
-      <w:pPr>
+      <w:r>
         <w:rPr>
           <w:rFonts w:ascii="Raleway" w:hAnsi="Raleway"/>
           <w:sz w:val="20"/>
           <w:szCs w:val="20"/>
           <w:lang w:val="en-IN"/>
         </w:rPr>
-      </w:pPr>
+        <w:t xml:space="preserve">|   </w:t>
+      </w:r>
+      <w:proofErr w:type="spellStart"/>
       <w:r>
         <w:rPr>
           <w:rFonts w:ascii="Raleway" w:hAnsi="Raleway"/>
@@ -16797,26 +15846,36 @@
           <w:szCs w:val="20"/>
           <w:lang w:val="en-IN"/>
         </w:rPr>
-        <w:t>Host script results:</w:t>
-      </w:r>
-    </w:p>
-    <w:p>
-      <w:pPr>
+        <w:t>account_used</w:t>
+      </w:r>
+      <w:proofErr w:type="spellEnd"/>
+      <w:r>
         <w:rPr>
           <w:rFonts w:ascii="Raleway" w:hAnsi="Raleway"/>
           <w:sz w:val="20"/>
           <w:szCs w:val="20"/>
           <w:lang w:val="en-IN"/>
         </w:rPr>
-      </w:pPr>
-      <w:r>
+        <w:t>: guest</w:t>
+      </w:r>
+    </w:p>
+    <w:p>
+      <w:pPr>
         <w:rPr>
           <w:rFonts w:ascii="Raleway" w:hAnsi="Raleway"/>
           <w:sz w:val="20"/>
           <w:szCs w:val="20"/>
           <w:lang w:val="en-IN"/>
         </w:rPr>
-        <w:t xml:space="preserve">| </w:t>
+      </w:pPr>
+      <w:r>
+        <w:rPr>
+          <w:rFonts w:ascii="Raleway" w:hAnsi="Raleway"/>
+          <w:sz w:val="20"/>
+          <w:szCs w:val="20"/>
+          <w:lang w:val="en-IN"/>
+        </w:rPr>
+        <w:t xml:space="preserve">|   </w:t>
       </w:r>
       <w:proofErr w:type="spellStart"/>
       <w:r>
@@ -16826,7 +15885,7 @@
           <w:szCs w:val="20"/>
           <w:lang w:val="en-IN"/>
         </w:rPr>
-        <w:t>smb</w:t>
+        <w:t>authentication_level</w:t>
       </w:r>
       <w:proofErr w:type="spellEnd"/>
       <w:r>
@@ -16836,7 +15895,7 @@
           <w:szCs w:val="20"/>
           <w:lang w:val="en-IN"/>
         </w:rPr>
-        <w:t xml:space="preserve">-security-mode: </w:t>
+        <w:t>: user</w:t>
       </w:r>
     </w:p>
     <w:p>
@@ -16865,7 +15924,7 @@
           <w:szCs w:val="20"/>
           <w:lang w:val="en-IN"/>
         </w:rPr>
-        <w:t>account_used</w:t>
+        <w:t>challenge_response</w:t>
       </w:r>
       <w:proofErr w:type="spellEnd"/>
       <w:r>
@@ -16875,7 +15934,7 @@
           <w:szCs w:val="20"/>
           <w:lang w:val="en-IN"/>
         </w:rPr>
-        <w:t>: guest</w:t>
+        <w:t>: supported</w:t>
       </w:r>
     </w:p>
     <w:p>
@@ -16894,7 +15953,7 @@
           <w:szCs w:val="20"/>
           <w:lang w:val="en-IN"/>
         </w:rPr>
-        <w:t xml:space="preserve">|   </w:t>
+        <w:t xml:space="preserve">|_  </w:t>
       </w:r>
       <w:proofErr w:type="spellStart"/>
       <w:r>
@@ -16904,105 +15963,7 @@
           <w:szCs w:val="20"/>
           <w:lang w:val="en-IN"/>
         </w:rPr>
-        <w:t>authentication_level</w:t>
-      </w:r>
-      <w:proofErr w:type="spellEnd"/>
-      <w:r>
-        <w:rPr>
-          <w:rFonts w:ascii="Raleway" w:hAnsi="Raleway"/>
-          <w:sz w:val="20"/>
-          <w:szCs w:val="20"/>
-          <w:lang w:val="en-IN"/>
-        </w:rPr>
-        <w:t>: user</w:t>
-      </w:r>
-    </w:p>
-    <w:p>
-      <w:pPr>
-        <w:rPr>
-          <w:rFonts w:ascii="Raleway" w:hAnsi="Raleway"/>
-          <w:sz w:val="20"/>
-          <w:szCs w:val="20"/>
-          <w:lang w:val="en-IN"/>
-        </w:rPr>
-      </w:pPr>
-      <w:r>
-        <w:rPr>
-          <w:rFonts w:ascii="Raleway" w:hAnsi="Raleway"/>
-          <w:sz w:val="20"/>
-          <w:szCs w:val="20"/>
-          <w:lang w:val="en-IN"/>
-        </w:rPr>
-        <w:t xml:space="preserve">|   </w:t>
-      </w:r>
-      <w:proofErr w:type="spellStart"/>
-      <w:r>
-        <w:rPr>
-          <w:rFonts w:ascii="Raleway" w:hAnsi="Raleway"/>
-          <w:sz w:val="20"/>
-          <w:szCs w:val="20"/>
-          <w:lang w:val="en-IN"/>
-        </w:rPr>
-        <w:t>challenge_response</w:t>
-      </w:r>
-      <w:proofErr w:type="spellEnd"/>
-      <w:r>
-        <w:rPr>
-          <w:rFonts w:ascii="Raleway" w:hAnsi="Raleway"/>
-          <w:sz w:val="20"/>
-          <w:szCs w:val="20"/>
-          <w:lang w:val="en-IN"/>
-        </w:rPr>
-        <w:t>: supported</w:t>
-      </w:r>
-    </w:p>
-    <w:p>
-      <w:pPr>
-        <w:rPr>
-          <w:rFonts w:ascii="Raleway" w:hAnsi="Raleway"/>
-          <w:sz w:val="20"/>
-          <w:szCs w:val="20"/>
-          <w:lang w:val="en-IN"/>
-        </w:rPr>
-      </w:pPr>
-      <w:r>
-        <w:rPr>
-          <w:rFonts w:ascii="Raleway" w:hAnsi="Raleway"/>
-          <w:sz w:val="20"/>
-          <w:szCs w:val="20"/>
-          <w:lang w:val="en-IN"/>
-        </w:rPr>
-        <w:t>|</w:t>
-      </w:r>
-      <w:proofErr w:type="gramStart"/>
-      <w:r>
-        <w:rPr>
-          <w:rFonts w:ascii="Raleway" w:hAnsi="Raleway"/>
-          <w:sz w:val="20"/>
-          <w:szCs w:val="20"/>
-          <w:lang w:val="en-IN"/>
-        </w:rPr>
-        <w:t xml:space="preserve">_  </w:t>
-      </w:r>
-      <w:proofErr w:type="spellStart"/>
-      <w:r>
-        <w:rPr>
-          <w:rFonts w:ascii="Raleway" w:hAnsi="Raleway"/>
-          <w:sz w:val="20"/>
-          <w:szCs w:val="20"/>
-          <w:lang w:val="en-IN"/>
-        </w:rPr>
-        <w:t>message</w:t>
-      </w:r>
-      <w:proofErr w:type="gramEnd"/>
-      <w:r>
-        <w:rPr>
-          <w:rFonts w:ascii="Raleway" w:hAnsi="Raleway"/>
-          <w:sz w:val="20"/>
-          <w:szCs w:val="20"/>
-          <w:lang w:val="en-IN"/>
-        </w:rPr>
-        <w:t>_signing</w:t>
+        <w:t>message_signing</w:t>
       </w:r>
       <w:proofErr w:type="spellEnd"/>
       <w:r>
@@ -17253,18 +16214,8 @@
                 <w:sz w:val="16"/>
                 <w:szCs w:val="16"/>
               </w:rPr>
-              <w:t xml:space="preserve">CVSS v3.1 </w:t>
-            </w:r>
-            <w:proofErr w:type="gramStart"/>
-            <w:r>
-              <w:rPr>
-                <w:rFonts w:ascii="Raleway" w:hAnsi="Raleway" w:cs="Segoe UI"/>
-                <w:sz w:val="16"/>
-                <w:szCs w:val="16"/>
-              </w:rPr>
-              <w:t>Score</w:t>
-            </w:r>
-            <w:proofErr w:type="gramEnd"/>
+              <w:t>CVSS v3.1 Score</w:t>
+            </w:r>
           </w:p>
         </w:tc>
         <w:tc>
@@ -17362,165 +16313,8 @@
                 <w:sz w:val="18"/>
                 <w:szCs w:val="18"/>
               </w:rPr>
-              <w:t>CVSS:3.1/</w:t>
-            </w:r>
-            <w:proofErr w:type="gramStart"/>
-            <w:r>
-              <w:rPr>
-                <w:rFonts w:ascii="Raleway" w:eastAsia="Ubuntu" w:hAnsi="Raleway" w:cs="Segoe UI"/>
-                <w:bCs/>
-                <w:caps w:val="0"/>
-                <w:color w:val="000000" w:themeColor="text1"/>
-                <w:sz w:val="18"/>
-                <w:szCs w:val="18"/>
-              </w:rPr>
-              <w:t>AV:N</w:t>
-            </w:r>
-            <w:proofErr w:type="gramEnd"/>
-            <w:r>
-              <w:rPr>
-                <w:rFonts w:ascii="Raleway" w:eastAsia="Ubuntu" w:hAnsi="Raleway" w:cs="Segoe UI"/>
-                <w:bCs/>
-                <w:caps w:val="0"/>
-                <w:color w:val="000000" w:themeColor="text1"/>
-                <w:sz w:val="18"/>
-                <w:szCs w:val="18"/>
-              </w:rPr>
-              <w:t>/</w:t>
-            </w:r>
-            <w:proofErr w:type="gramStart"/>
-            <w:r>
-              <w:rPr>
-                <w:rFonts w:ascii="Raleway" w:eastAsia="Ubuntu" w:hAnsi="Raleway" w:cs="Segoe UI"/>
-                <w:bCs/>
-                <w:caps w:val="0"/>
-                <w:color w:val="000000" w:themeColor="text1"/>
-                <w:sz w:val="18"/>
-                <w:szCs w:val="18"/>
-              </w:rPr>
-              <w:t>AC:L</w:t>
-            </w:r>
-            <w:proofErr w:type="gramEnd"/>
-            <w:r>
-              <w:rPr>
-                <w:rFonts w:ascii="Raleway" w:eastAsia="Ubuntu" w:hAnsi="Raleway" w:cs="Segoe UI"/>
-                <w:bCs/>
-                <w:caps w:val="0"/>
-                <w:color w:val="000000" w:themeColor="text1"/>
-                <w:sz w:val="18"/>
-                <w:szCs w:val="18"/>
-              </w:rPr>
-              <w:t>/</w:t>
-            </w:r>
-            <w:proofErr w:type="gramStart"/>
-            <w:r>
-              <w:rPr>
-                <w:rFonts w:ascii="Raleway" w:eastAsia="Ubuntu" w:hAnsi="Raleway" w:cs="Segoe UI"/>
-                <w:bCs/>
-                <w:caps w:val="0"/>
-                <w:color w:val="000000" w:themeColor="text1"/>
-                <w:sz w:val="18"/>
-                <w:szCs w:val="18"/>
-              </w:rPr>
-              <w:t>PR:N</w:t>
-            </w:r>
-            <w:proofErr w:type="gramEnd"/>
-            <w:r>
-              <w:rPr>
-                <w:rFonts w:ascii="Raleway" w:eastAsia="Ubuntu" w:hAnsi="Raleway" w:cs="Segoe UI"/>
-                <w:bCs/>
-                <w:caps w:val="0"/>
-                <w:color w:val="000000" w:themeColor="text1"/>
-                <w:sz w:val="18"/>
-                <w:szCs w:val="18"/>
-              </w:rPr>
-              <w:t>/</w:t>
-            </w:r>
-            <w:proofErr w:type="gramStart"/>
-            <w:r>
-              <w:rPr>
-                <w:rFonts w:ascii="Raleway" w:eastAsia="Ubuntu" w:hAnsi="Raleway" w:cs="Segoe UI"/>
-                <w:bCs/>
-                <w:caps w:val="0"/>
-                <w:color w:val="000000" w:themeColor="text1"/>
-                <w:sz w:val="18"/>
-                <w:szCs w:val="18"/>
-              </w:rPr>
-              <w:t>UI:R</w:t>
-            </w:r>
-            <w:proofErr w:type="gramEnd"/>
-            <w:r>
-              <w:rPr>
-                <w:rFonts w:ascii="Raleway" w:eastAsia="Ubuntu" w:hAnsi="Raleway" w:cs="Segoe UI"/>
-                <w:bCs/>
-                <w:caps w:val="0"/>
-                <w:color w:val="000000" w:themeColor="text1"/>
-                <w:sz w:val="18"/>
-                <w:szCs w:val="18"/>
-              </w:rPr>
-              <w:t>/S:C/</w:t>
-            </w:r>
-            <w:proofErr w:type="gramStart"/>
-            <w:r>
-              <w:rPr>
-                <w:rFonts w:ascii="Raleway" w:eastAsia="Ubuntu" w:hAnsi="Raleway" w:cs="Segoe UI"/>
-                <w:bCs/>
-                <w:caps w:val="0"/>
-                <w:color w:val="000000" w:themeColor="text1"/>
-                <w:sz w:val="18"/>
-                <w:szCs w:val="18"/>
-              </w:rPr>
-              <w:t>C:L</w:t>
-            </w:r>
-            <w:proofErr w:type="gramEnd"/>
-            <w:r>
-              <w:rPr>
-                <w:rFonts w:ascii="Raleway" w:eastAsia="Ubuntu" w:hAnsi="Raleway" w:cs="Segoe UI"/>
-                <w:bCs/>
-                <w:caps w:val="0"/>
-                <w:color w:val="000000" w:themeColor="text1"/>
-                <w:sz w:val="18"/>
-                <w:szCs w:val="18"/>
-              </w:rPr>
-              <w:t>/</w:t>
-            </w:r>
-            <w:proofErr w:type="gramStart"/>
-            <w:r>
-              <w:rPr>
-                <w:rFonts w:ascii="Raleway" w:eastAsia="Ubuntu" w:hAnsi="Raleway" w:cs="Segoe UI"/>
-                <w:bCs/>
-                <w:caps w:val="0"/>
-                <w:color w:val="000000" w:themeColor="text1"/>
-                <w:sz w:val="18"/>
-                <w:szCs w:val="18"/>
-              </w:rPr>
-              <w:t>I:L</w:t>
-            </w:r>
-            <w:proofErr w:type="gramEnd"/>
-            <w:r>
-              <w:rPr>
-                <w:rFonts w:ascii="Raleway" w:eastAsia="Ubuntu" w:hAnsi="Raleway" w:cs="Segoe UI"/>
-                <w:bCs/>
-                <w:caps w:val="0"/>
-                <w:color w:val="000000" w:themeColor="text1"/>
-                <w:sz w:val="18"/>
-                <w:szCs w:val="18"/>
-              </w:rPr>
-              <w:t>/</w:t>
-            </w:r>
-            <w:proofErr w:type="gramStart"/>
-            <w:r>
-              <w:rPr>
-                <w:rFonts w:ascii="Raleway" w:eastAsia="Ubuntu" w:hAnsi="Raleway" w:cs="Segoe UI"/>
-                <w:bCs/>
-                <w:caps w:val="0"/>
-                <w:color w:val="000000" w:themeColor="text1"/>
-                <w:sz w:val="18"/>
-                <w:szCs w:val="18"/>
-              </w:rPr>
-              <w:t>A:N</w:t>
-            </w:r>
-            <w:proofErr w:type="gramEnd"/>
+              <w:t>CVSS:3.1/AV:N/AC:L/PR:N/UI:R/S:C/C:L/I:L/A:N</w:t>
+            </w:r>
           </w:p>
         </w:tc>
       </w:tr>
@@ -18321,18 +17115,8 @@
                 <w:color w:val="DE713A"/>
                 <w:lang w:val="en-IN"/>
               </w:rPr>
-              <w:t>/</w:t>
-            </w:r>
-            <w:proofErr w:type="gramStart"/>
-            <w:r>
-              <w:rPr>
-                <w:rFonts w:ascii="Raleway" w:hAnsi="Raleway" w:cs="Segoe UI"/>
-                <w:color w:val="DE713A"/>
-                <w:lang w:val="en-IN"/>
-              </w:rPr>
-              <w:t>search</w:t>
-            </w:r>
-            <w:proofErr w:type="gramEnd"/>
+              <w:t>/search</w:t>
+            </w:r>
           </w:p>
         </w:tc>
       </w:tr>
@@ -18753,25 +17537,7 @@
           <w:sz w:val="20"/>
           <w:szCs w:val="20"/>
         </w:rPr>
-        <w:t>=&lt;script&gt;alert(</w:t>
-      </w:r>
-      <w:proofErr w:type="gramStart"/>
-      <w:r>
-        <w:rPr>
-          <w:rFonts w:ascii="Raleway" w:hAnsi="Raleway"/>
-          <w:sz w:val="20"/>
-          <w:szCs w:val="20"/>
-        </w:rPr>
-        <w:t>1)&lt;</w:t>
-      </w:r>
-      <w:proofErr w:type="gramEnd"/>
-      <w:r>
-        <w:rPr>
-          <w:rFonts w:ascii="Raleway" w:hAnsi="Raleway"/>
-          <w:sz w:val="20"/>
-          <w:szCs w:val="20"/>
-        </w:rPr>
-        <w:t>/script&gt; HTTP/1.1</w:t>
+        <w:t>=&lt;script&gt;alert(1)&lt;/script&gt; HTTP/1.1</w:t>
       </w:r>
     </w:p>
     <w:p>
@@ -19080,18 +17846,8 @@
                 <w:sz w:val="16"/>
                 <w:szCs w:val="16"/>
               </w:rPr>
-              <w:t xml:space="preserve">CVSS v3.1 </w:t>
-            </w:r>
-            <w:proofErr w:type="gramStart"/>
-            <w:r>
-              <w:rPr>
-                <w:rFonts w:ascii="Raleway" w:hAnsi="Raleway" w:cs="Segoe UI"/>
-                <w:sz w:val="16"/>
-                <w:szCs w:val="16"/>
-              </w:rPr>
-              <w:t>Score</w:t>
-            </w:r>
-            <w:proofErr w:type="gramEnd"/>
+              <w:t>CVSS v3.1 Score</w:t>
+            </w:r>
           </w:p>
         </w:tc>
         <w:tc>
@@ -19189,127 +17945,7 @@
                 <w:sz w:val="18"/>
                 <w:szCs w:val="18"/>
               </w:rPr>
-              <w:t>CVSS:3.1/</w:t>
-            </w:r>
-            <w:proofErr w:type="gramStart"/>
-            <w:r>
-              <w:rPr>
-                <w:rFonts w:ascii="Raleway" w:eastAsia="Ubuntu" w:hAnsi="Raleway" w:cs="Segoe UI"/>
-                <w:bCs/>
-                <w:caps w:val="0"/>
-                <w:color w:val="000000" w:themeColor="text1"/>
-                <w:sz w:val="18"/>
-                <w:szCs w:val="18"/>
-              </w:rPr>
-              <w:t>AV:N</w:t>
-            </w:r>
-            <w:proofErr w:type="gramEnd"/>
-            <w:r>
-              <w:rPr>
-                <w:rFonts w:ascii="Raleway" w:eastAsia="Ubuntu" w:hAnsi="Raleway" w:cs="Segoe UI"/>
-                <w:bCs/>
-                <w:caps w:val="0"/>
-                <w:color w:val="000000" w:themeColor="text1"/>
-                <w:sz w:val="18"/>
-                <w:szCs w:val="18"/>
-              </w:rPr>
-              <w:t>/</w:t>
-            </w:r>
-            <w:proofErr w:type="gramStart"/>
-            <w:r>
-              <w:rPr>
-                <w:rFonts w:ascii="Raleway" w:eastAsia="Ubuntu" w:hAnsi="Raleway" w:cs="Segoe UI"/>
-                <w:bCs/>
-                <w:caps w:val="0"/>
-                <w:color w:val="000000" w:themeColor="text1"/>
-                <w:sz w:val="18"/>
-                <w:szCs w:val="18"/>
-              </w:rPr>
-              <w:t>AC:L</w:t>
-            </w:r>
-            <w:proofErr w:type="gramEnd"/>
-            <w:r>
-              <w:rPr>
-                <w:rFonts w:ascii="Raleway" w:eastAsia="Ubuntu" w:hAnsi="Raleway" w:cs="Segoe UI"/>
-                <w:bCs/>
-                <w:caps w:val="0"/>
-                <w:color w:val="000000" w:themeColor="text1"/>
-                <w:sz w:val="18"/>
-                <w:szCs w:val="18"/>
-              </w:rPr>
-              <w:t>/</w:t>
-            </w:r>
-            <w:proofErr w:type="gramStart"/>
-            <w:r>
-              <w:rPr>
-                <w:rFonts w:ascii="Raleway" w:eastAsia="Ubuntu" w:hAnsi="Raleway" w:cs="Segoe UI"/>
-                <w:bCs/>
-                <w:caps w:val="0"/>
-                <w:color w:val="000000" w:themeColor="text1"/>
-                <w:sz w:val="18"/>
-                <w:szCs w:val="18"/>
-              </w:rPr>
-              <w:t>PR:N</w:t>
-            </w:r>
-            <w:proofErr w:type="gramEnd"/>
-            <w:r>
-              <w:rPr>
-                <w:rFonts w:ascii="Raleway" w:eastAsia="Ubuntu" w:hAnsi="Raleway" w:cs="Segoe UI"/>
-                <w:bCs/>
-                <w:caps w:val="0"/>
-                <w:color w:val="000000" w:themeColor="text1"/>
-                <w:sz w:val="18"/>
-                <w:szCs w:val="18"/>
-              </w:rPr>
-              <w:t>/</w:t>
-            </w:r>
-            <w:proofErr w:type="gramStart"/>
-            <w:r>
-              <w:rPr>
-                <w:rFonts w:ascii="Raleway" w:eastAsia="Ubuntu" w:hAnsi="Raleway" w:cs="Segoe UI"/>
-                <w:bCs/>
-                <w:caps w:val="0"/>
-                <w:color w:val="000000" w:themeColor="text1"/>
-                <w:sz w:val="18"/>
-                <w:szCs w:val="18"/>
-              </w:rPr>
-              <w:t>UI:N</w:t>
-            </w:r>
-            <w:proofErr w:type="gramEnd"/>
-            <w:r>
-              <w:rPr>
-                <w:rFonts w:ascii="Raleway" w:eastAsia="Ubuntu" w:hAnsi="Raleway" w:cs="Segoe UI"/>
-                <w:bCs/>
-                <w:caps w:val="0"/>
-                <w:color w:val="000000" w:themeColor="text1"/>
-                <w:sz w:val="18"/>
-                <w:szCs w:val="18"/>
-              </w:rPr>
-              <w:t>/</w:t>
-            </w:r>
-            <w:proofErr w:type="gramStart"/>
-            <w:r>
-              <w:rPr>
-                <w:rFonts w:ascii="Raleway" w:eastAsia="Ubuntu" w:hAnsi="Raleway" w:cs="Segoe UI"/>
-                <w:bCs/>
-                <w:caps w:val="0"/>
-                <w:color w:val="000000" w:themeColor="text1"/>
-                <w:sz w:val="18"/>
-                <w:szCs w:val="18"/>
-              </w:rPr>
-              <w:t>S:U</w:t>
-            </w:r>
-            <w:proofErr w:type="gramEnd"/>
-            <w:r>
-              <w:rPr>
-                <w:rFonts w:ascii="Raleway" w:eastAsia="Ubuntu" w:hAnsi="Raleway" w:cs="Segoe UI"/>
-                <w:bCs/>
-                <w:caps w:val="0"/>
-                <w:color w:val="000000" w:themeColor="text1"/>
-                <w:sz w:val="18"/>
-                <w:szCs w:val="18"/>
-              </w:rPr>
-              <w:t>/C:H/I:H/A:H</w:t>
+              <w:t>CVSS:3.1/AV:N/AC:L/PR:N/UI:N/S:U/C:H/I:H/A:H</w:t>
             </w:r>
           </w:p>
         </w:tc>
@@ -20026,7 +18662,6 @@
               </w:rPr>
               <w:t>/</w:t>
             </w:r>
-            <w:proofErr w:type="gramStart"/>
             <w:r>
               <w:rPr>
                 <w:rFonts w:ascii="Raleway" w:hAnsi="Raleway" w:cs="Segoe UI"/>
@@ -20035,7 +18670,6 @@
               </w:rPr>
               <w:t>login</w:t>
             </w:r>
-            <w:proofErr w:type="gramEnd"/>
           </w:p>
         </w:tc>
       </w:tr>
@@ -22495,7 +21129,7 @@
             </wp:anchor>
           </w:drawing>
         </mc:Choice>
-        <mc:Fallback xmlns:arto="http://schemas.microsoft.com/office/word/2006/arto" xmlns:a14="http://schemas.microsoft.com/office/drawing/2010/main" xmlns:a="http://schemas.openxmlformats.org/drawingml/2006/main">
+        <mc:Fallback xmlns:a="http://schemas.openxmlformats.org/drawingml/2006/main" xmlns:a14="http://schemas.microsoft.com/office/drawing/2010/main" xmlns:arto="http://schemas.microsoft.com/office/word/2006/arto">
           <w:pict w14:anchorId="38CA5F0A">
             <v:line id="Line 4" style="position:absolute;flip:y;z-index:251658241;visibility:visible;mso-wrap-style:square;mso-width-percent:0;mso-height-percent:0;mso-wrap-distance-left:9pt;mso-wrap-distance-top:0;mso-wrap-distance-right:9pt;mso-wrap-distance-bottom:0;mso-position-horizontal:absolute;mso-position-horizontal-relative:text;mso-position-vertical:absolute;mso-position-vertical-relative:text;mso-width-percent:0;mso-height-percent:0;mso-width-relative:page;mso-height-relative:page" o:spid="_x0000_s1026" strokecolor="#f93" from="-3.65pt,-4.3pt" to="504.55pt,-4.3pt" w14:anchorId="5A3C3AEC" o:gfxdata="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">
               <o:lock v:ext="edit" shapetype="f"/>
@@ -23221,7 +21855,7 @@
             </wp:anchor>
           </w:drawing>
         </mc:Choice>
-        <mc:Fallback xmlns:arto="http://schemas.microsoft.com/office/word/2006/arto" xmlns:a14="http://schemas.microsoft.com/office/drawing/2010/main" xmlns:pic="http://schemas.openxmlformats.org/drawingml/2006/picture" xmlns:a="http://schemas.openxmlformats.org/drawingml/2006/main">
+        <mc:Fallback xmlns:a="http://schemas.openxmlformats.org/drawingml/2006/main" xmlns:pic="http://schemas.openxmlformats.org/drawingml/2006/picture" xmlns:a14="http://schemas.microsoft.com/office/drawing/2010/main" xmlns:arto="http://schemas.microsoft.com/office/word/2006/arto">
           <w:pict w14:anchorId="5A5AE9C6">
             <v:line id="Line 2" style="position:absolute;flip:y;z-index:251658240;visibility:visible;mso-wrap-style:square;mso-width-percent:0;mso-height-percent:0;mso-wrap-distance-left:9pt;mso-wrap-distance-top:0;mso-wrap-distance-right:9pt;mso-wrap-distance-bottom:0;mso-position-horizontal:absolute;mso-position-horizontal-relative:text;mso-position-vertical:absolute;mso-position-vertical-relative:text;mso-width-percent:0;mso-height-percent:0;mso-width-relative:page;mso-height-relative:page" o:spid="_x0000_s1026" strokecolor="#f93" from="-3.65pt,11.85pt" to="509.9pt,11.85pt" w14:anchorId="405F419A" o:gfxdata="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">
               <o:lock v:ext="edit" shapetype="f"/>

</xml_diff>

<commit_message>
Updated Scope and Tools used
Signed-off-by: swanandb2 <swanandb18@gmail.com>
</commit_message>
<xml_diff>
--- a/docs/FinalReport.docx
+++ b/docs/FinalReport.docx
@@ -5809,9 +5809,9 @@
       <w:pPr>
         <w:spacing w:after="160" w:line="278" w:lineRule="auto"/>
         <w:rPr>
-          <w:rFonts w:ascii="Raleway" w:hAnsi="Raleway" w:cs="Segoe UI"/>
-          <w:sz w:val="22"/>
-          <w:szCs w:val="22"/>
+          <w:rFonts w:ascii="Raleway" w:hAnsi="Raleway"/>
+          <w:sz w:val="20"/>
+          <w:szCs w:val="20"/>
         </w:rPr>
       </w:pPr>
       <w:r>
@@ -5857,23 +5857,535 @@
         </w:rPr>
         <w:t xml:space="preserve"> which is intended for applications requiring strong assurance in high-risk environments. This standard served as a baseline for verifying that the system’s security architecture aligns with expected security objectives.</w:t>
       </w:r>
-      <w:r>
-        <w:rPr>
-          <w:rFonts w:ascii="Raleway" w:hAnsi="Raleway" w:cs="Segoe UI"/>
-          <w:sz w:val="22"/>
-          <w:szCs w:val="22"/>
-        </w:rPr>
-        <w:br w:type="page"/>
-      </w:r>
-    </w:p>
-    <w:p>
-      <w:pPr>
-        <w:pStyle w:val="Heading2"/>
-      </w:pPr>
       <w:bookmarkStart w:id="13" w:name="_Toc177730345"/>
       <w:bookmarkStart w:id="14" w:name="_Toc235567821"/>
-      <w:r>
+    </w:p>
+    <w:p>
+      <w:pPr>
+        <w:spacing w:after="160" w:line="278" w:lineRule="auto"/>
+        <w:rPr>
+          <w:rFonts w:ascii="Raleway" w:hAnsi="Raleway"/>
+          <w:sz w:val="20"/>
+          <w:szCs w:val="20"/>
+        </w:rPr>
+      </w:pPr>
+      <w:r>
+        <w:rPr>
+          <w:rFonts w:ascii="Raleway" w:eastAsiaTheme="majorEastAsia" w:hAnsi="Raleway" w:cstheme="majorBidi"/>
+          <w:b/>
+          <w:color w:val="DE713A"/>
+          <w:szCs w:val="32"/>
+        </w:rPr>
+        <w:t>Scope of Assessment</w:t>
+      </w:r>
+    </w:p>
+    <w:p>
+      <w:pPr>
+        <w:pStyle w:val="BodyText"/>
+        <w:spacing w:before="0" w:after="0" w:line="276" w:lineRule="auto"/>
+        <w:rPr>
+          <w:rFonts w:cs="Segoe UI"/>
+          <w:szCs w:val="22"/>
+        </w:rPr>
+      </w:pPr>
+      <w:r>
+        <w:rPr>
+          <w:rFonts w:cs="Segoe UI"/>
+          <w:szCs w:val="22"/>
+        </w:rPr>
+        <w:t>The scope for this Security assessment includes, but is not limited to, the following tests:</w:t>
+      </w:r>
+    </w:p>
+    <w:p>
+      <w:pPr>
+        <w:pStyle w:val="BodyText"/>
+        <w:numPr>
+          <w:ilvl w:val="0"/>
+          <w:numId w:val="23"/>
+        </w:numPr>
+        <w:spacing w:before="0" w:after="0" w:line="276" w:lineRule="auto"/>
+        <w:rPr>
+          <w:rFonts w:cs="Segoe UI"/>
+          <w:szCs w:val="22"/>
+        </w:rPr>
+      </w:pPr>
+      <w:r>
+        <w:rPr>
+          <w:rFonts w:cs="Segoe UI"/>
+          <w:szCs w:val="22"/>
+        </w:rPr>
+        <w:t xml:space="preserve">Information Gathering </w:t>
+      </w:r>
+    </w:p>
+    <w:p>
+      <w:pPr>
+        <w:pStyle w:val="BodyText"/>
+        <w:numPr>
+          <w:ilvl w:val="0"/>
+          <w:numId w:val="23"/>
+        </w:numPr>
+        <w:spacing w:before="0" w:after="0" w:line="276" w:lineRule="auto"/>
+        <w:rPr>
+          <w:rFonts w:cs="Segoe UI"/>
+          <w:szCs w:val="22"/>
+        </w:rPr>
+      </w:pPr>
+      <w:r>
+        <w:rPr>
+          <w:rFonts w:cs="Segoe UI"/>
+          <w:szCs w:val="22"/>
+        </w:rPr>
+        <w:t xml:space="preserve">Configuration Management </w:t>
+      </w:r>
+    </w:p>
+    <w:p>
+      <w:pPr>
+        <w:pStyle w:val="BodyText"/>
+        <w:numPr>
+          <w:ilvl w:val="0"/>
+          <w:numId w:val="23"/>
+        </w:numPr>
+        <w:spacing w:before="0" w:after="0" w:line="276" w:lineRule="auto"/>
+        <w:rPr>
+          <w:rFonts w:cs="Segoe UI"/>
+          <w:szCs w:val="22"/>
+        </w:rPr>
+      </w:pPr>
+      <w:r>
+        <w:rPr>
+          <w:rFonts w:cs="Segoe UI"/>
+          <w:szCs w:val="22"/>
+        </w:rPr>
+        <w:t xml:space="preserve">Business Logic </w:t>
+      </w:r>
+    </w:p>
+    <w:p>
+      <w:pPr>
+        <w:pStyle w:val="BodyText"/>
+        <w:numPr>
+          <w:ilvl w:val="0"/>
+          <w:numId w:val="23"/>
+        </w:numPr>
+        <w:spacing w:before="0" w:after="0" w:line="276" w:lineRule="auto"/>
+        <w:rPr>
+          <w:rFonts w:cs="Segoe UI"/>
+          <w:szCs w:val="22"/>
+        </w:rPr>
+      </w:pPr>
+      <w:r>
+        <w:rPr>
+          <w:rFonts w:cs="Segoe UI"/>
+          <w:szCs w:val="22"/>
+        </w:rPr>
+        <w:t xml:space="preserve">Authentication </w:t>
+      </w:r>
+    </w:p>
+    <w:p>
+      <w:pPr>
+        <w:pStyle w:val="BodyText"/>
+        <w:numPr>
+          <w:ilvl w:val="0"/>
+          <w:numId w:val="23"/>
+        </w:numPr>
+        <w:spacing w:before="0" w:after="0" w:line="276" w:lineRule="auto"/>
+        <w:rPr>
+          <w:rFonts w:cs="Segoe UI"/>
+          <w:szCs w:val="22"/>
+        </w:rPr>
+      </w:pPr>
+      <w:r>
+        <w:rPr>
+          <w:rFonts w:cs="Segoe UI"/>
+          <w:szCs w:val="22"/>
+        </w:rPr>
+        <w:t xml:space="preserve">Authorization </w:t>
+      </w:r>
+    </w:p>
+    <w:p>
+      <w:pPr>
+        <w:pStyle w:val="BodyText"/>
+        <w:numPr>
+          <w:ilvl w:val="0"/>
+          <w:numId w:val="23"/>
+        </w:numPr>
+        <w:spacing w:before="0" w:after="0" w:line="276" w:lineRule="auto"/>
+        <w:rPr>
+          <w:rFonts w:cs="Segoe UI"/>
+          <w:szCs w:val="22"/>
+        </w:rPr>
+      </w:pPr>
+      <w:r>
+        <w:rPr>
+          <w:rFonts w:cs="Segoe UI"/>
+          <w:szCs w:val="22"/>
+        </w:rPr>
+        <w:t xml:space="preserve">Session Management </w:t>
+      </w:r>
+    </w:p>
+    <w:p>
+      <w:pPr>
+        <w:pStyle w:val="BodyText"/>
+        <w:numPr>
+          <w:ilvl w:val="0"/>
+          <w:numId w:val="23"/>
+        </w:numPr>
+        <w:spacing w:before="0" w:after="0" w:line="276" w:lineRule="auto"/>
+        <w:rPr>
+          <w:rFonts w:cs="Segoe UI"/>
+          <w:szCs w:val="22"/>
+        </w:rPr>
+      </w:pPr>
+      <w:r>
+        <w:rPr>
+          <w:rFonts w:cs="Segoe UI"/>
+          <w:szCs w:val="22"/>
+        </w:rPr>
+        <w:t>Data Validation, Governance, and Transfer.</w:t>
+      </w:r>
+    </w:p>
+    <w:p>
+      <w:pPr>
+        <w:pStyle w:val="BodyText"/>
+        <w:spacing w:before="0" w:after="0" w:line="276" w:lineRule="auto"/>
+        <w:ind w:left="360"/>
+        <w:rPr>
+          <w:rFonts w:cs="Segoe UI"/>
+          <w:szCs w:val="22"/>
+          <w:lang w:val="en-IN"/>
+        </w:rPr>
+      </w:pPr>
+      <w:r>
+        <w:rPr>
+          <w:rFonts w:cs="Segoe UI"/>
+          <w:szCs w:val="22"/>
+          <w:lang w:val="en-IN"/>
+        </w:rPr>
+        <w:t>As this is a production system, we did not perform the following tests as it could potentially impact customers.</w:t>
+      </w:r>
+    </w:p>
+    <w:p>
+      <w:pPr>
+        <w:pStyle w:val="BodyText"/>
+        <w:numPr>
+          <w:ilvl w:val="0"/>
+          <w:numId w:val="25"/>
+        </w:numPr>
+        <w:spacing w:before="0" w:after="0" w:line="276" w:lineRule="auto"/>
+        <w:rPr>
+          <w:rFonts w:cs="Segoe UI"/>
+          <w:szCs w:val="22"/>
+          <w:lang w:val="en-IN"/>
+        </w:rPr>
+      </w:pPr>
+      <w:r>
+        <w:rPr>
+          <w:rFonts w:cs="Segoe UI"/>
+          <w:szCs w:val="22"/>
+          <w:lang w:val="en-IN"/>
+        </w:rPr>
+        <w:t xml:space="preserve">Denial of Service (DoS) Attacks </w:t>
+      </w:r>
+    </w:p>
+    <w:p>
+      <w:pPr>
+        <w:pStyle w:val="BodyText"/>
+        <w:numPr>
+          <w:ilvl w:val="0"/>
+          <w:numId w:val="25"/>
+        </w:numPr>
+        <w:spacing w:before="0" w:after="0" w:line="276" w:lineRule="auto"/>
+        <w:rPr>
+          <w:rFonts w:cs="Segoe UI"/>
+          <w:szCs w:val="22"/>
+          <w:lang w:val="en-IN"/>
+        </w:rPr>
+      </w:pPr>
+      <w:r>
+        <w:rPr>
+          <w:rFonts w:cs="Segoe UI"/>
+          <w:szCs w:val="22"/>
+          <w:lang w:val="en-IN"/>
+        </w:rPr>
+        <w:t xml:space="preserve">Brute Force Attacks </w:t>
+      </w:r>
+    </w:p>
+    <w:p>
+      <w:pPr>
+        <w:pStyle w:val="BodyText"/>
+        <w:numPr>
+          <w:ilvl w:val="0"/>
+          <w:numId w:val="25"/>
+        </w:numPr>
+        <w:spacing w:before="0" w:after="0" w:line="276" w:lineRule="auto"/>
+        <w:rPr>
+          <w:rFonts w:cs="Segoe UI"/>
+          <w:szCs w:val="22"/>
+          <w:lang w:val="en-IN"/>
+        </w:rPr>
+      </w:pPr>
+      <w:r>
+        <w:rPr>
+          <w:rFonts w:cs="Segoe UI"/>
+          <w:szCs w:val="22"/>
+          <w:lang w:val="en-IN"/>
+        </w:rPr>
+        <w:t xml:space="preserve">Data Manipulation or Deletion </w:t>
+      </w:r>
+    </w:p>
+    <w:p>
+      <w:pPr>
+        <w:pStyle w:val="BodyText"/>
+        <w:numPr>
+          <w:ilvl w:val="0"/>
+          <w:numId w:val="25"/>
+        </w:numPr>
+        <w:spacing w:before="0" w:after="0" w:line="276" w:lineRule="auto"/>
+        <w:rPr>
+          <w:rFonts w:cs="Segoe UI"/>
+          <w:szCs w:val="22"/>
+          <w:lang w:val="en-IN"/>
+        </w:rPr>
+      </w:pPr>
+      <w:r>
+        <w:rPr>
+          <w:rFonts w:cs="Segoe UI"/>
+          <w:szCs w:val="22"/>
+          <w:lang w:val="en-IN"/>
+        </w:rPr>
+        <w:t xml:space="preserve">Excessive Traffic Generation </w:t>
+      </w:r>
+    </w:p>
+    <w:p>
+      <w:pPr>
+        <w:pStyle w:val="BodyText"/>
+        <w:numPr>
+          <w:ilvl w:val="0"/>
+          <w:numId w:val="25"/>
+        </w:numPr>
+        <w:spacing w:before="0" w:after="0" w:line="276" w:lineRule="auto"/>
+        <w:rPr>
+          <w:rFonts w:cs="Segoe UI"/>
+          <w:szCs w:val="22"/>
+          <w:lang w:val="en-IN"/>
+        </w:rPr>
+      </w:pPr>
+      <w:r>
+        <w:rPr>
+          <w:rFonts w:cs="Segoe UI"/>
+          <w:szCs w:val="22"/>
+          <w:lang w:val="en-IN"/>
+        </w:rPr>
+        <w:t xml:space="preserve">Unverified Third-Party Tools or Scripts </w:t>
+      </w:r>
+    </w:p>
+    <w:p>
+      <w:pPr>
+        <w:pStyle w:val="BodyText"/>
+        <w:numPr>
+          <w:ilvl w:val="0"/>
+          <w:numId w:val="25"/>
+        </w:numPr>
+        <w:spacing w:before="0" w:after="0" w:line="276" w:lineRule="auto"/>
+        <w:rPr>
+          <w:rFonts w:cs="Segoe UI"/>
+          <w:szCs w:val="22"/>
+          <w:lang w:val="en-IN"/>
+        </w:rPr>
+      </w:pPr>
+      <w:r>
+        <w:rPr>
+          <w:rFonts w:cs="Segoe UI"/>
+          <w:szCs w:val="22"/>
+          <w:lang w:val="en-IN"/>
+        </w:rPr>
+        <w:t>Security Tests without Proper Authorization</w:t>
+      </w:r>
+    </w:p>
+    <w:p>
+      <w:pPr>
+        <w:pStyle w:val="BodyText"/>
+        <w:spacing w:before="0" w:after="0" w:line="276" w:lineRule="auto"/>
+        <w:ind w:left="720"/>
+        <w:rPr>
+          <w:rFonts w:cs="Segoe UI"/>
+          <w:szCs w:val="22"/>
+        </w:rPr>
+      </w:pPr>
+    </w:p>
+    <w:p>
+      <w:pPr>
+        <w:pStyle w:val="BodyText"/>
+        <w:spacing w:before="0" w:after="0" w:line="276" w:lineRule="auto"/>
+        <w:ind w:left="720"/>
+        <w:rPr>
+          <w:rFonts w:cs="Segoe UI"/>
+          <w:szCs w:val="22"/>
+        </w:rPr>
+      </w:pPr>
+    </w:p>
+    <w:p>
+      <w:pPr>
+        <w:spacing w:after="160" w:line="278" w:lineRule="auto"/>
+        <w:rPr>
+          <w:rFonts w:ascii="Raleway" w:eastAsiaTheme="majorEastAsia" w:hAnsi="Raleway" w:cstheme="majorBidi"/>
+          <w:b/>
+          <w:color w:val="DE713A"/>
+          <w:szCs w:val="32"/>
+        </w:rPr>
+      </w:pPr>
+    </w:p>
+    <w:p>
+      <w:pPr>
+        <w:spacing w:after="160" w:line="278" w:lineRule="auto"/>
+        <w:rPr>
+          <w:rFonts w:ascii="Raleway" w:eastAsiaTheme="majorEastAsia" w:hAnsi="Raleway" w:cstheme="majorBidi"/>
+          <w:b/>
+          <w:color w:val="DE713A"/>
+          <w:szCs w:val="32"/>
+        </w:rPr>
+      </w:pPr>
+    </w:p>
+    <w:p>
+      <w:pPr>
+        <w:spacing w:after="160" w:line="278" w:lineRule="auto"/>
+        <w:rPr>
+          <w:rFonts w:ascii="Raleway" w:eastAsiaTheme="majorEastAsia" w:hAnsi="Raleway" w:cstheme="majorBidi"/>
+          <w:b/>
+          <w:color w:val="DE713A"/>
+          <w:szCs w:val="32"/>
+        </w:rPr>
+      </w:pPr>
+      <w:r>
+        <w:rPr>
+          <w:rFonts w:ascii="Raleway" w:eastAsiaTheme="majorEastAsia" w:hAnsi="Raleway" w:cstheme="majorBidi"/>
+          <w:b/>
+          <w:color w:val="DE713A"/>
+          <w:szCs w:val="32"/>
+        </w:rPr>
         <w:lastRenderedPageBreak/>
+        <w:t>Tools Used</w:t>
+      </w:r>
+    </w:p>
+    <w:p>
+      <w:pPr>
+        <w:pStyle w:val="BodyText"/>
+        <w:spacing w:before="0" w:after="0" w:line="276" w:lineRule="auto"/>
+        <w:rPr>
+          <w:rFonts w:cs="Segoe UI"/>
+          <w:szCs w:val="22"/>
+          <w:lang w:val="en-IN"/>
+        </w:rPr>
+      </w:pPr>
+      <w:r>
+        <w:rPr>
+          <w:rFonts w:cs="Segoe UI"/>
+          <w:szCs w:val="22"/>
+          <w:lang w:val="en-IN"/>
+        </w:rPr>
+        <w:t>For</w:t>
+      </w:r>
+      <w:r>
+        <w:rPr>
+          <w:rFonts w:cs="Segoe UI"/>
+          <w:szCs w:val="22"/>
+          <w:lang w:val="en-IN"/>
+        </w:rPr>
+        <w:t xml:space="preserve"> penetration testing team uses a combination of manual testing and commercial/open-source tools as part of its penetration testing methodology. This is accompanied by custom scripts to ensure optimum results.</w:t>
+      </w:r>
+    </w:p>
+    <w:p>
+      <w:pPr>
+        <w:pStyle w:val="BodyText"/>
+        <w:spacing w:before="0" w:after="0" w:line="276" w:lineRule="auto"/>
+        <w:rPr>
+          <w:rFonts w:cs="Segoe UI"/>
+          <w:szCs w:val="22"/>
+          <w:lang w:val="en-IN"/>
+        </w:rPr>
+      </w:pPr>
+      <w:r>
+        <w:rPr>
+          <w:rFonts w:cs="Segoe UI"/>
+          <w:szCs w:val="22"/>
+          <w:lang w:val="en-IN"/>
+        </w:rPr>
+        <w:t>The following tools are used for the testing:</w:t>
+      </w:r>
+    </w:p>
+    <w:p>
+      <w:pPr>
+        <w:pStyle w:val="BodyText"/>
+        <w:numPr>
+          <w:ilvl w:val="0"/>
+          <w:numId w:val="24"/>
+        </w:numPr>
+        <w:spacing w:before="0" w:after="0" w:line="276" w:lineRule="auto"/>
+        <w:rPr>
+          <w:rFonts w:cs="Segoe UI"/>
+          <w:szCs w:val="22"/>
+          <w:lang w:val="en-IN"/>
+        </w:rPr>
+      </w:pPr>
+      <w:r>
+        <w:rPr>
+          <w:rFonts w:cs="Segoe UI"/>
+          <w:szCs w:val="22"/>
+          <w:lang w:val="en-IN"/>
+        </w:rPr>
+        <w:t xml:space="preserve">Burp Suite </w:t>
+      </w:r>
+    </w:p>
+    <w:p>
+      <w:pPr>
+        <w:pStyle w:val="BodyText"/>
+        <w:numPr>
+          <w:ilvl w:val="0"/>
+          <w:numId w:val="24"/>
+        </w:numPr>
+        <w:spacing w:before="0" w:after="0" w:line="276" w:lineRule="auto"/>
+        <w:rPr>
+          <w:rFonts w:cs="Segoe UI"/>
+          <w:szCs w:val="22"/>
+          <w:lang w:val="en-IN"/>
+        </w:rPr>
+      </w:pPr>
+      <w:r>
+        <w:rPr>
+          <w:rFonts w:cs="Segoe UI"/>
+          <w:szCs w:val="22"/>
+          <w:lang w:val="en-IN"/>
+        </w:rPr>
+        <w:t xml:space="preserve">Nmap </w:t>
+      </w:r>
+    </w:p>
+    <w:p>
+      <w:pPr>
+        <w:pStyle w:val="BodyText"/>
+        <w:numPr>
+          <w:ilvl w:val="0"/>
+          <w:numId w:val="24"/>
+        </w:numPr>
+        <w:spacing w:before="0" w:after="0" w:line="276" w:lineRule="auto"/>
+        <w:rPr>
+          <w:rFonts w:cs="Segoe UI"/>
+          <w:szCs w:val="22"/>
+          <w:lang w:val="en-IN"/>
+        </w:rPr>
+      </w:pPr>
+      <w:r>
+        <w:rPr>
+          <w:rFonts w:cs="Segoe UI"/>
+          <w:szCs w:val="22"/>
+          <w:lang w:val="en-IN"/>
+        </w:rPr>
+        <w:t>Kali Linux</w:t>
+      </w:r>
+    </w:p>
+    <w:p>
+      <w:pPr>
+        <w:pStyle w:val="Heading1"/>
+      </w:pPr>
+      <w:r>
         <w:t>Risk</w:t>
       </w:r>
       <w:r>
@@ -6554,6 +7066,7 @@
               <w:t xml:space="preserve">No immediate action </w:t>
             </w:r>
             <w:proofErr w:type="spellStart"/>
+            <w:proofErr w:type="gramStart"/>
             <w:r>
               <w:rPr>
                 <w:rFonts w:cs="Segoe UI"/>
@@ -6561,6 +7074,7 @@
               <w:t>required.Consider</w:t>
             </w:r>
             <w:proofErr w:type="spellEnd"/>
+            <w:proofErr w:type="gramEnd"/>
             <w:r>
               <w:rPr>
                 <w:rFonts w:cs="Segoe UI"/>
@@ -6819,8 +7333,141 @@
                 <w:sz w:val="18"/>
                 <w:szCs w:val="18"/>
               </w:rPr>
-              <w:t>CVSS:3.1/AV:N/AC:L/PR:L/UI:N/S:U/C:H/I:H/A:L</w:t>
-            </w:r>
+              <w:t>CVSS:3.1/</w:t>
+            </w:r>
+            <w:proofErr w:type="gramStart"/>
+            <w:r>
+              <w:rPr>
+                <w:rFonts w:ascii="Raleway" w:eastAsia="Ubuntu" w:hAnsi="Raleway" w:cs="Segoe UI"/>
+                <w:bCs/>
+                <w:caps w:val="0"/>
+                <w:color w:val="000000" w:themeColor="text1"/>
+                <w:sz w:val="18"/>
+                <w:szCs w:val="18"/>
+              </w:rPr>
+              <w:t>AV:N</w:t>
+            </w:r>
+            <w:proofErr w:type="gramEnd"/>
+            <w:r>
+              <w:rPr>
+                <w:rFonts w:ascii="Raleway" w:eastAsia="Ubuntu" w:hAnsi="Raleway" w:cs="Segoe UI"/>
+                <w:bCs/>
+                <w:caps w:val="0"/>
+                <w:color w:val="000000" w:themeColor="text1"/>
+                <w:sz w:val="18"/>
+                <w:szCs w:val="18"/>
+              </w:rPr>
+              <w:t>/</w:t>
+            </w:r>
+            <w:proofErr w:type="gramStart"/>
+            <w:r>
+              <w:rPr>
+                <w:rFonts w:ascii="Raleway" w:eastAsia="Ubuntu" w:hAnsi="Raleway" w:cs="Segoe UI"/>
+                <w:bCs/>
+                <w:caps w:val="0"/>
+                <w:color w:val="000000" w:themeColor="text1"/>
+                <w:sz w:val="18"/>
+                <w:szCs w:val="18"/>
+              </w:rPr>
+              <w:t>AC:L</w:t>
+            </w:r>
+            <w:proofErr w:type="gramEnd"/>
+            <w:r>
+              <w:rPr>
+                <w:rFonts w:ascii="Raleway" w:eastAsia="Ubuntu" w:hAnsi="Raleway" w:cs="Segoe UI"/>
+                <w:bCs/>
+                <w:caps w:val="0"/>
+                <w:color w:val="000000" w:themeColor="text1"/>
+                <w:sz w:val="18"/>
+                <w:szCs w:val="18"/>
+              </w:rPr>
+              <w:t>/</w:t>
+            </w:r>
+            <w:proofErr w:type="gramStart"/>
+            <w:r>
+              <w:rPr>
+                <w:rFonts w:ascii="Raleway" w:eastAsia="Ubuntu" w:hAnsi="Raleway" w:cs="Segoe UI"/>
+                <w:bCs/>
+                <w:caps w:val="0"/>
+                <w:color w:val="000000" w:themeColor="text1"/>
+                <w:sz w:val="18"/>
+                <w:szCs w:val="18"/>
+              </w:rPr>
+              <w:t>PR:L</w:t>
+            </w:r>
+            <w:proofErr w:type="gramEnd"/>
+            <w:r>
+              <w:rPr>
+                <w:rFonts w:ascii="Raleway" w:eastAsia="Ubuntu" w:hAnsi="Raleway" w:cs="Segoe UI"/>
+                <w:bCs/>
+                <w:caps w:val="0"/>
+                <w:color w:val="000000" w:themeColor="text1"/>
+                <w:sz w:val="18"/>
+                <w:szCs w:val="18"/>
+              </w:rPr>
+              <w:t>/</w:t>
+            </w:r>
+            <w:proofErr w:type="gramStart"/>
+            <w:r>
+              <w:rPr>
+                <w:rFonts w:ascii="Raleway" w:eastAsia="Ubuntu" w:hAnsi="Raleway" w:cs="Segoe UI"/>
+                <w:bCs/>
+                <w:caps w:val="0"/>
+                <w:color w:val="000000" w:themeColor="text1"/>
+                <w:sz w:val="18"/>
+                <w:szCs w:val="18"/>
+              </w:rPr>
+              <w:t>UI:N</w:t>
+            </w:r>
+            <w:proofErr w:type="gramEnd"/>
+            <w:r>
+              <w:rPr>
+                <w:rFonts w:ascii="Raleway" w:eastAsia="Ubuntu" w:hAnsi="Raleway" w:cs="Segoe UI"/>
+                <w:bCs/>
+                <w:caps w:val="0"/>
+                <w:color w:val="000000" w:themeColor="text1"/>
+                <w:sz w:val="18"/>
+                <w:szCs w:val="18"/>
+              </w:rPr>
+              <w:t>/</w:t>
+            </w:r>
+            <w:proofErr w:type="gramStart"/>
+            <w:r>
+              <w:rPr>
+                <w:rFonts w:ascii="Raleway" w:eastAsia="Ubuntu" w:hAnsi="Raleway" w:cs="Segoe UI"/>
+                <w:bCs/>
+                <w:caps w:val="0"/>
+                <w:color w:val="000000" w:themeColor="text1"/>
+                <w:sz w:val="18"/>
+                <w:szCs w:val="18"/>
+              </w:rPr>
+              <w:t>S:U</w:t>
+            </w:r>
+            <w:proofErr w:type="gramEnd"/>
+            <w:r>
+              <w:rPr>
+                <w:rFonts w:ascii="Raleway" w:eastAsia="Ubuntu" w:hAnsi="Raleway" w:cs="Segoe UI"/>
+                <w:bCs/>
+                <w:caps w:val="0"/>
+                <w:color w:val="000000" w:themeColor="text1"/>
+                <w:sz w:val="18"/>
+                <w:szCs w:val="18"/>
+              </w:rPr>
+              <w:t>/C:H/I:H/</w:t>
+            </w:r>
+            <w:proofErr w:type="gramStart"/>
+            <w:r>
+              <w:rPr>
+                <w:rFonts w:ascii="Raleway" w:eastAsia="Ubuntu" w:hAnsi="Raleway" w:cs="Segoe UI"/>
+                <w:bCs/>
+                <w:caps w:val="0"/>
+                <w:color w:val="000000" w:themeColor="text1"/>
+                <w:sz w:val="18"/>
+                <w:szCs w:val="18"/>
+              </w:rPr>
+              <w:t>A:L</w:t>
+            </w:r>
+            <w:proofErr w:type="gramEnd"/>
           </w:p>
         </w:tc>
       </w:tr>
@@ -8011,8 +8658,18 @@
                 <w:sz w:val="16"/>
                 <w:szCs w:val="16"/>
               </w:rPr>
-              <w:t>CVSS v3.1 Score</w:t>
-            </w:r>
+              <w:t xml:space="preserve">CVSS v3.1 </w:t>
+            </w:r>
+            <w:proofErr w:type="gramStart"/>
+            <w:r>
+              <w:rPr>
+                <w:rFonts w:ascii="Raleway" w:hAnsi="Raleway" w:cs="Segoe UI"/>
+                <w:sz w:val="16"/>
+                <w:szCs w:val="16"/>
+              </w:rPr>
+              <w:t>Score</w:t>
+            </w:r>
+            <w:proofErr w:type="gramEnd"/>
           </w:p>
         </w:tc>
         <w:tc>
@@ -8110,8 +8767,141 @@
                 <w:sz w:val="18"/>
                 <w:szCs w:val="18"/>
               </w:rPr>
-              <w:t>CVSS:3.1/AV:N/AC:L/PR:N/UI:N/S:U/C:H/I:H/A:L</w:t>
-            </w:r>
+              <w:t>CVSS:3.1/</w:t>
+            </w:r>
+            <w:proofErr w:type="gramStart"/>
+            <w:r>
+              <w:rPr>
+                <w:rFonts w:ascii="Raleway" w:eastAsia="Ubuntu" w:hAnsi="Raleway" w:cs="Segoe UI"/>
+                <w:bCs/>
+                <w:caps w:val="0"/>
+                <w:color w:val="000000" w:themeColor="text1"/>
+                <w:sz w:val="18"/>
+                <w:szCs w:val="18"/>
+              </w:rPr>
+              <w:t>AV:N</w:t>
+            </w:r>
+            <w:proofErr w:type="gramEnd"/>
+            <w:r>
+              <w:rPr>
+                <w:rFonts w:ascii="Raleway" w:eastAsia="Ubuntu" w:hAnsi="Raleway" w:cs="Segoe UI"/>
+                <w:bCs/>
+                <w:caps w:val="0"/>
+                <w:color w:val="000000" w:themeColor="text1"/>
+                <w:sz w:val="18"/>
+                <w:szCs w:val="18"/>
+              </w:rPr>
+              <w:t>/</w:t>
+            </w:r>
+            <w:proofErr w:type="gramStart"/>
+            <w:r>
+              <w:rPr>
+                <w:rFonts w:ascii="Raleway" w:eastAsia="Ubuntu" w:hAnsi="Raleway" w:cs="Segoe UI"/>
+                <w:bCs/>
+                <w:caps w:val="0"/>
+                <w:color w:val="000000" w:themeColor="text1"/>
+                <w:sz w:val="18"/>
+                <w:szCs w:val="18"/>
+              </w:rPr>
+              <w:t>AC:L</w:t>
+            </w:r>
+            <w:proofErr w:type="gramEnd"/>
+            <w:r>
+              <w:rPr>
+                <w:rFonts w:ascii="Raleway" w:eastAsia="Ubuntu" w:hAnsi="Raleway" w:cs="Segoe UI"/>
+                <w:bCs/>
+                <w:caps w:val="0"/>
+                <w:color w:val="000000" w:themeColor="text1"/>
+                <w:sz w:val="18"/>
+                <w:szCs w:val="18"/>
+              </w:rPr>
+              <w:t>/</w:t>
+            </w:r>
+            <w:proofErr w:type="gramStart"/>
+            <w:r>
+              <w:rPr>
+                <w:rFonts w:ascii="Raleway" w:eastAsia="Ubuntu" w:hAnsi="Raleway" w:cs="Segoe UI"/>
+                <w:bCs/>
+                <w:caps w:val="0"/>
+                <w:color w:val="000000" w:themeColor="text1"/>
+                <w:sz w:val="18"/>
+                <w:szCs w:val="18"/>
+              </w:rPr>
+              <w:t>PR:N</w:t>
+            </w:r>
+            <w:proofErr w:type="gramEnd"/>
+            <w:r>
+              <w:rPr>
+                <w:rFonts w:ascii="Raleway" w:eastAsia="Ubuntu" w:hAnsi="Raleway" w:cs="Segoe UI"/>
+                <w:bCs/>
+                <w:caps w:val="0"/>
+                <w:color w:val="000000" w:themeColor="text1"/>
+                <w:sz w:val="18"/>
+                <w:szCs w:val="18"/>
+              </w:rPr>
+              <w:t>/</w:t>
+            </w:r>
+            <w:proofErr w:type="gramStart"/>
+            <w:r>
+              <w:rPr>
+                <w:rFonts w:ascii="Raleway" w:eastAsia="Ubuntu" w:hAnsi="Raleway" w:cs="Segoe UI"/>
+                <w:bCs/>
+                <w:caps w:val="0"/>
+                <w:color w:val="000000" w:themeColor="text1"/>
+                <w:sz w:val="18"/>
+                <w:szCs w:val="18"/>
+              </w:rPr>
+              <w:t>UI:N</w:t>
+            </w:r>
+            <w:proofErr w:type="gramEnd"/>
+            <w:r>
+              <w:rPr>
+                <w:rFonts w:ascii="Raleway" w:eastAsia="Ubuntu" w:hAnsi="Raleway" w:cs="Segoe UI"/>
+                <w:bCs/>
+                <w:caps w:val="0"/>
+                <w:color w:val="000000" w:themeColor="text1"/>
+                <w:sz w:val="18"/>
+                <w:szCs w:val="18"/>
+              </w:rPr>
+              <w:t>/</w:t>
+            </w:r>
+            <w:proofErr w:type="gramStart"/>
+            <w:r>
+              <w:rPr>
+                <w:rFonts w:ascii="Raleway" w:eastAsia="Ubuntu" w:hAnsi="Raleway" w:cs="Segoe UI"/>
+                <w:bCs/>
+                <w:caps w:val="0"/>
+                <w:color w:val="000000" w:themeColor="text1"/>
+                <w:sz w:val="18"/>
+                <w:szCs w:val="18"/>
+              </w:rPr>
+              <w:t>S:U</w:t>
+            </w:r>
+            <w:proofErr w:type="gramEnd"/>
+            <w:r>
+              <w:rPr>
+                <w:rFonts w:ascii="Raleway" w:eastAsia="Ubuntu" w:hAnsi="Raleway" w:cs="Segoe UI"/>
+                <w:bCs/>
+                <w:caps w:val="0"/>
+                <w:color w:val="000000" w:themeColor="text1"/>
+                <w:sz w:val="18"/>
+                <w:szCs w:val="18"/>
+              </w:rPr>
+              <w:t>/C:H/I:H/</w:t>
+            </w:r>
+            <w:proofErr w:type="gramStart"/>
+            <w:r>
+              <w:rPr>
+                <w:rFonts w:ascii="Raleway" w:eastAsia="Ubuntu" w:hAnsi="Raleway" w:cs="Segoe UI"/>
+                <w:bCs/>
+                <w:caps w:val="0"/>
+                <w:color w:val="000000" w:themeColor="text1"/>
+                <w:sz w:val="18"/>
+                <w:szCs w:val="18"/>
+              </w:rPr>
+              <w:t>A:L</w:t>
+            </w:r>
+            <w:proofErr w:type="gramEnd"/>
           </w:p>
         </w:tc>
       </w:tr>
@@ -9290,8 +10080,18 @@
                 <w:sz w:val="16"/>
                 <w:szCs w:val="16"/>
               </w:rPr>
-              <w:t>CVSS v3.1 Score</w:t>
-            </w:r>
+              <w:t xml:space="preserve">CVSS v3.1 </w:t>
+            </w:r>
+            <w:proofErr w:type="gramStart"/>
+            <w:r>
+              <w:rPr>
+                <w:rFonts w:ascii="Raleway" w:hAnsi="Raleway" w:cs="Segoe UI"/>
+                <w:sz w:val="16"/>
+                <w:szCs w:val="16"/>
+              </w:rPr>
+              <w:t>Score</w:t>
+            </w:r>
+            <w:proofErr w:type="gramEnd"/>
           </w:p>
         </w:tc>
         <w:tc>
@@ -9392,6 +10192,7 @@
               <w:t>CVSS:3.1/</w:t>
             </w:r>
             <w:hyperlink r:id="rId18" w:tgtFrame="_blank" w:history="1">
+              <w:proofErr w:type="gramStart"/>
               <w:r>
                 <w:rPr>
                   <w:rFonts w:ascii="Raleway" w:eastAsia="Ubuntu" w:hAnsi="Raleway" w:cs="Segoe UI"/>
@@ -9401,8 +10202,129 @@
                   <w:sz w:val="18"/>
                   <w:szCs w:val="18"/>
                 </w:rPr>
-                <w:t>AV:N/AC:L/PR:N/UI:N/S:U/C:H/I:H/A:L</w:t>
+                <w:t>AV:N</w:t>
               </w:r>
+              <w:proofErr w:type="gramEnd"/>
+              <w:r>
+                <w:rPr>
+                  <w:rFonts w:ascii="Raleway" w:eastAsia="Ubuntu" w:hAnsi="Raleway" w:cs="Segoe UI"/>
+                  <w:bCs/>
+                  <w:caps w:val="0"/>
+                  <w:color w:val="000000" w:themeColor="text1"/>
+                  <w:sz w:val="18"/>
+                  <w:szCs w:val="18"/>
+                </w:rPr>
+                <w:t>/</w:t>
+              </w:r>
+              <w:proofErr w:type="gramStart"/>
+              <w:r>
+                <w:rPr>
+                  <w:rFonts w:ascii="Raleway" w:eastAsia="Ubuntu" w:hAnsi="Raleway" w:cs="Segoe UI"/>
+                  <w:bCs/>
+                  <w:caps w:val="0"/>
+                  <w:color w:val="000000" w:themeColor="text1"/>
+                  <w:sz w:val="18"/>
+                  <w:szCs w:val="18"/>
+                </w:rPr>
+                <w:t>AC:L</w:t>
+              </w:r>
+              <w:proofErr w:type="gramEnd"/>
+              <w:r>
+                <w:rPr>
+                  <w:rFonts w:ascii="Raleway" w:eastAsia="Ubuntu" w:hAnsi="Raleway" w:cs="Segoe UI"/>
+                  <w:bCs/>
+                  <w:caps w:val="0"/>
+                  <w:color w:val="000000" w:themeColor="text1"/>
+                  <w:sz w:val="18"/>
+                  <w:szCs w:val="18"/>
+                </w:rPr>
+                <w:t>/</w:t>
+              </w:r>
+              <w:proofErr w:type="gramStart"/>
+              <w:r>
+                <w:rPr>
+                  <w:rFonts w:ascii="Raleway" w:eastAsia="Ubuntu" w:hAnsi="Raleway" w:cs="Segoe UI"/>
+                  <w:bCs/>
+                  <w:caps w:val="0"/>
+                  <w:color w:val="000000" w:themeColor="text1"/>
+                  <w:sz w:val="18"/>
+                  <w:szCs w:val="18"/>
+                </w:rPr>
+                <w:t>PR:N</w:t>
+              </w:r>
+              <w:proofErr w:type="gramEnd"/>
+              <w:r>
+                <w:rPr>
+                  <w:rFonts w:ascii="Raleway" w:eastAsia="Ubuntu" w:hAnsi="Raleway" w:cs="Segoe UI"/>
+                  <w:bCs/>
+                  <w:caps w:val="0"/>
+                  <w:color w:val="000000" w:themeColor="text1"/>
+                  <w:sz w:val="18"/>
+                  <w:szCs w:val="18"/>
+                </w:rPr>
+                <w:t>/</w:t>
+              </w:r>
+              <w:proofErr w:type="gramStart"/>
+              <w:r>
+                <w:rPr>
+                  <w:rFonts w:ascii="Raleway" w:eastAsia="Ubuntu" w:hAnsi="Raleway" w:cs="Segoe UI"/>
+                  <w:bCs/>
+                  <w:caps w:val="0"/>
+                  <w:color w:val="000000" w:themeColor="text1"/>
+                  <w:sz w:val="18"/>
+                  <w:szCs w:val="18"/>
+                </w:rPr>
+                <w:t>UI:N</w:t>
+              </w:r>
+              <w:proofErr w:type="gramEnd"/>
+              <w:r>
+                <w:rPr>
+                  <w:rFonts w:ascii="Raleway" w:eastAsia="Ubuntu" w:hAnsi="Raleway" w:cs="Segoe UI"/>
+                  <w:bCs/>
+                  <w:caps w:val="0"/>
+                  <w:color w:val="000000" w:themeColor="text1"/>
+                  <w:sz w:val="18"/>
+                  <w:szCs w:val="18"/>
+                </w:rPr>
+                <w:t>/</w:t>
+              </w:r>
+              <w:proofErr w:type="gramStart"/>
+              <w:r>
+                <w:rPr>
+                  <w:rFonts w:ascii="Raleway" w:eastAsia="Ubuntu" w:hAnsi="Raleway" w:cs="Segoe UI"/>
+                  <w:bCs/>
+                  <w:caps w:val="0"/>
+                  <w:color w:val="000000" w:themeColor="text1"/>
+                  <w:sz w:val="18"/>
+                  <w:szCs w:val="18"/>
+                </w:rPr>
+                <w:t>S:U</w:t>
+              </w:r>
+              <w:proofErr w:type="gramEnd"/>
+              <w:r>
+                <w:rPr>
+                  <w:rFonts w:ascii="Raleway" w:eastAsia="Ubuntu" w:hAnsi="Raleway" w:cs="Segoe UI"/>
+                  <w:bCs/>
+                  <w:caps w:val="0"/>
+                  <w:color w:val="000000" w:themeColor="text1"/>
+                  <w:sz w:val="18"/>
+                  <w:szCs w:val="18"/>
+                </w:rPr>
+                <w:t>/C:H/I:H/</w:t>
+              </w:r>
+              <w:proofErr w:type="gramStart"/>
+              <w:r>
+                <w:rPr>
+                  <w:rFonts w:ascii="Raleway" w:eastAsia="Ubuntu" w:hAnsi="Raleway" w:cs="Segoe UI"/>
+                  <w:bCs/>
+                  <w:caps w:val="0"/>
+                  <w:color w:val="000000" w:themeColor="text1"/>
+                  <w:sz w:val="18"/>
+                  <w:szCs w:val="18"/>
+                </w:rPr>
+                <w:t>A:L</w:t>
+              </w:r>
+              <w:proofErr w:type="gramEnd"/>
             </w:hyperlink>
           </w:p>
         </w:tc>
@@ -10473,8 +11395,18 @@
                 <w:sz w:val="16"/>
                 <w:szCs w:val="16"/>
               </w:rPr>
-              <w:t>CVSS v3.1 Score</w:t>
-            </w:r>
+              <w:t xml:space="preserve">CVSS v3.1 </w:t>
+            </w:r>
+            <w:proofErr w:type="gramStart"/>
+            <w:r>
+              <w:rPr>
+                <w:rFonts w:ascii="Raleway" w:hAnsi="Raleway" w:cs="Segoe UI"/>
+                <w:sz w:val="16"/>
+                <w:szCs w:val="16"/>
+              </w:rPr>
+              <w:t>Score</w:t>
+            </w:r>
+            <w:proofErr w:type="gramEnd"/>
           </w:p>
         </w:tc>
         <w:tc>
@@ -10585,6 +11517,7 @@
               </w:rPr>
               <w:t>/</w:t>
             </w:r>
+            <w:proofErr w:type="gramStart"/>
             <w:r>
               <w:rPr>
                 <w:rFonts w:ascii="Raleway" w:eastAsia="Ubuntu" w:hAnsi="Raleway" w:cs="Segoe UI"/>
@@ -10594,7 +11527,115 @@
                 <w:sz w:val="18"/>
                 <w:szCs w:val="18"/>
               </w:rPr>
-              <w:t>AV:N/AC:L/PR:N/UI:N/S:U/C:H/I:H/A:H</w:t>
+              <w:t>AV:N</w:t>
+            </w:r>
+            <w:proofErr w:type="gramEnd"/>
+            <w:r>
+              <w:rPr>
+                <w:rFonts w:ascii="Raleway" w:eastAsia="Ubuntu" w:hAnsi="Raleway" w:cs="Segoe UI"/>
+                <w:bCs/>
+                <w:caps w:val="0"/>
+                <w:color w:val="000000" w:themeColor="text1"/>
+                <w:sz w:val="18"/>
+                <w:szCs w:val="18"/>
+              </w:rPr>
+              <w:t>/</w:t>
+            </w:r>
+            <w:proofErr w:type="gramStart"/>
+            <w:r>
+              <w:rPr>
+                <w:rFonts w:ascii="Raleway" w:eastAsia="Ubuntu" w:hAnsi="Raleway" w:cs="Segoe UI"/>
+                <w:bCs/>
+                <w:caps w:val="0"/>
+                <w:color w:val="000000" w:themeColor="text1"/>
+                <w:sz w:val="18"/>
+                <w:szCs w:val="18"/>
+              </w:rPr>
+              <w:t>AC:L</w:t>
+            </w:r>
+            <w:proofErr w:type="gramEnd"/>
+            <w:r>
+              <w:rPr>
+                <w:rFonts w:ascii="Raleway" w:eastAsia="Ubuntu" w:hAnsi="Raleway" w:cs="Segoe UI"/>
+                <w:bCs/>
+                <w:caps w:val="0"/>
+                <w:color w:val="000000" w:themeColor="text1"/>
+                <w:sz w:val="18"/>
+                <w:szCs w:val="18"/>
+              </w:rPr>
+              <w:t>/</w:t>
+            </w:r>
+            <w:proofErr w:type="gramStart"/>
+            <w:r>
+              <w:rPr>
+                <w:rFonts w:ascii="Raleway" w:eastAsia="Ubuntu" w:hAnsi="Raleway" w:cs="Segoe UI"/>
+                <w:bCs/>
+                <w:caps w:val="0"/>
+                <w:color w:val="000000" w:themeColor="text1"/>
+                <w:sz w:val="18"/>
+                <w:szCs w:val="18"/>
+              </w:rPr>
+              <w:t>PR:N</w:t>
+            </w:r>
+            <w:proofErr w:type="gramEnd"/>
+            <w:r>
+              <w:rPr>
+                <w:rFonts w:ascii="Raleway" w:eastAsia="Ubuntu" w:hAnsi="Raleway" w:cs="Segoe UI"/>
+                <w:bCs/>
+                <w:caps w:val="0"/>
+                <w:color w:val="000000" w:themeColor="text1"/>
+                <w:sz w:val="18"/>
+                <w:szCs w:val="18"/>
+              </w:rPr>
+              <w:t>/</w:t>
+            </w:r>
+            <w:proofErr w:type="gramStart"/>
+            <w:r>
+              <w:rPr>
+                <w:rFonts w:ascii="Raleway" w:eastAsia="Ubuntu" w:hAnsi="Raleway" w:cs="Segoe UI"/>
+                <w:bCs/>
+                <w:caps w:val="0"/>
+                <w:color w:val="000000" w:themeColor="text1"/>
+                <w:sz w:val="18"/>
+                <w:szCs w:val="18"/>
+              </w:rPr>
+              <w:t>UI:N</w:t>
+            </w:r>
+            <w:proofErr w:type="gramEnd"/>
+            <w:r>
+              <w:rPr>
+                <w:rFonts w:ascii="Raleway" w:eastAsia="Ubuntu" w:hAnsi="Raleway" w:cs="Segoe UI"/>
+                <w:bCs/>
+                <w:caps w:val="0"/>
+                <w:color w:val="000000" w:themeColor="text1"/>
+                <w:sz w:val="18"/>
+                <w:szCs w:val="18"/>
+              </w:rPr>
+              <w:t>/</w:t>
+            </w:r>
+            <w:proofErr w:type="gramStart"/>
+            <w:r>
+              <w:rPr>
+                <w:rFonts w:ascii="Raleway" w:eastAsia="Ubuntu" w:hAnsi="Raleway" w:cs="Segoe UI"/>
+                <w:bCs/>
+                <w:caps w:val="0"/>
+                <w:color w:val="000000" w:themeColor="text1"/>
+                <w:sz w:val="18"/>
+                <w:szCs w:val="18"/>
+              </w:rPr>
+              <w:t>S:U</w:t>
+            </w:r>
+            <w:proofErr w:type="gramEnd"/>
+            <w:r>
+              <w:rPr>
+                <w:rFonts w:ascii="Raleway" w:eastAsia="Ubuntu" w:hAnsi="Raleway" w:cs="Segoe UI"/>
+                <w:bCs/>
+                <w:caps w:val="0"/>
+                <w:color w:val="000000" w:themeColor="text1"/>
+                <w:sz w:val="18"/>
+                <w:szCs w:val="18"/>
+              </w:rPr>
+              <w:t>/C:H/I:H/A:H</w:t>
             </w:r>
           </w:p>
         </w:tc>
@@ -11760,8 +12801,18 @@
                 <w:sz w:val="16"/>
                 <w:szCs w:val="16"/>
               </w:rPr>
-              <w:t>CVSS v3.1 Score</w:t>
-            </w:r>
+              <w:t xml:space="preserve">CVSS v3.1 </w:t>
+            </w:r>
+            <w:proofErr w:type="gramStart"/>
+            <w:r>
+              <w:rPr>
+                <w:rFonts w:ascii="Raleway" w:hAnsi="Raleway" w:cs="Segoe UI"/>
+                <w:sz w:val="16"/>
+                <w:szCs w:val="16"/>
+              </w:rPr>
+              <w:t>Score</w:t>
+            </w:r>
+            <w:proofErr w:type="gramEnd"/>
           </w:p>
         </w:tc>
         <w:tc>
@@ -11872,6 +12923,7 @@
               </w:rPr>
               <w:t>/</w:t>
             </w:r>
+            <w:proofErr w:type="gramStart"/>
             <w:r>
               <w:rPr>
                 <w:rFonts w:ascii="Raleway" w:eastAsia="Ubuntu" w:hAnsi="Raleway" w:cs="Segoe UI"/>
@@ -11881,7 +12933,115 @@
                 <w:sz w:val="18"/>
                 <w:szCs w:val="18"/>
               </w:rPr>
-              <w:t>AV:N/AC:L/PR:N/UI:N/S:U/C:H/I:H/A:H</w:t>
+              <w:t>AV:N</w:t>
+            </w:r>
+            <w:proofErr w:type="gramEnd"/>
+            <w:r>
+              <w:rPr>
+                <w:rFonts w:ascii="Raleway" w:eastAsia="Ubuntu" w:hAnsi="Raleway" w:cs="Segoe UI"/>
+                <w:bCs/>
+                <w:caps w:val="0"/>
+                <w:color w:val="000000" w:themeColor="text1"/>
+                <w:sz w:val="18"/>
+                <w:szCs w:val="18"/>
+              </w:rPr>
+              <w:t>/</w:t>
+            </w:r>
+            <w:proofErr w:type="gramStart"/>
+            <w:r>
+              <w:rPr>
+                <w:rFonts w:ascii="Raleway" w:eastAsia="Ubuntu" w:hAnsi="Raleway" w:cs="Segoe UI"/>
+                <w:bCs/>
+                <w:caps w:val="0"/>
+                <w:color w:val="000000" w:themeColor="text1"/>
+                <w:sz w:val="18"/>
+                <w:szCs w:val="18"/>
+              </w:rPr>
+              <w:t>AC:L</w:t>
+            </w:r>
+            <w:proofErr w:type="gramEnd"/>
+            <w:r>
+              <w:rPr>
+                <w:rFonts w:ascii="Raleway" w:eastAsia="Ubuntu" w:hAnsi="Raleway" w:cs="Segoe UI"/>
+                <w:bCs/>
+                <w:caps w:val="0"/>
+                <w:color w:val="000000" w:themeColor="text1"/>
+                <w:sz w:val="18"/>
+                <w:szCs w:val="18"/>
+              </w:rPr>
+              <w:t>/</w:t>
+            </w:r>
+            <w:proofErr w:type="gramStart"/>
+            <w:r>
+              <w:rPr>
+                <w:rFonts w:ascii="Raleway" w:eastAsia="Ubuntu" w:hAnsi="Raleway" w:cs="Segoe UI"/>
+                <w:bCs/>
+                <w:caps w:val="0"/>
+                <w:color w:val="000000" w:themeColor="text1"/>
+                <w:sz w:val="18"/>
+                <w:szCs w:val="18"/>
+              </w:rPr>
+              <w:t>PR:N</w:t>
+            </w:r>
+            <w:proofErr w:type="gramEnd"/>
+            <w:r>
+              <w:rPr>
+                <w:rFonts w:ascii="Raleway" w:eastAsia="Ubuntu" w:hAnsi="Raleway" w:cs="Segoe UI"/>
+                <w:bCs/>
+                <w:caps w:val="0"/>
+                <w:color w:val="000000" w:themeColor="text1"/>
+                <w:sz w:val="18"/>
+                <w:szCs w:val="18"/>
+              </w:rPr>
+              <w:t>/</w:t>
+            </w:r>
+            <w:proofErr w:type="gramStart"/>
+            <w:r>
+              <w:rPr>
+                <w:rFonts w:ascii="Raleway" w:eastAsia="Ubuntu" w:hAnsi="Raleway" w:cs="Segoe UI"/>
+                <w:bCs/>
+                <w:caps w:val="0"/>
+                <w:color w:val="000000" w:themeColor="text1"/>
+                <w:sz w:val="18"/>
+                <w:szCs w:val="18"/>
+              </w:rPr>
+              <w:t>UI:N</w:t>
+            </w:r>
+            <w:proofErr w:type="gramEnd"/>
+            <w:r>
+              <w:rPr>
+                <w:rFonts w:ascii="Raleway" w:eastAsia="Ubuntu" w:hAnsi="Raleway" w:cs="Segoe UI"/>
+                <w:bCs/>
+                <w:caps w:val="0"/>
+                <w:color w:val="000000" w:themeColor="text1"/>
+                <w:sz w:val="18"/>
+                <w:szCs w:val="18"/>
+              </w:rPr>
+              <w:t>/</w:t>
+            </w:r>
+            <w:proofErr w:type="gramStart"/>
+            <w:r>
+              <w:rPr>
+                <w:rFonts w:ascii="Raleway" w:eastAsia="Ubuntu" w:hAnsi="Raleway" w:cs="Segoe UI"/>
+                <w:bCs/>
+                <w:caps w:val="0"/>
+                <w:color w:val="000000" w:themeColor="text1"/>
+                <w:sz w:val="18"/>
+                <w:szCs w:val="18"/>
+              </w:rPr>
+              <w:t>S:U</w:t>
+            </w:r>
+            <w:proofErr w:type="gramEnd"/>
+            <w:r>
+              <w:rPr>
+                <w:rFonts w:ascii="Raleway" w:eastAsia="Ubuntu" w:hAnsi="Raleway" w:cs="Segoe UI"/>
+                <w:bCs/>
+                <w:caps w:val="0"/>
+                <w:color w:val="000000" w:themeColor="text1"/>
+                <w:sz w:val="18"/>
+                <w:szCs w:val="18"/>
+              </w:rPr>
+              <w:t>/C:H/I:H/A:H</w:t>
             </w:r>
           </w:p>
         </w:tc>
@@ -12970,8 +14130,18 @@
                 <w:sz w:val="16"/>
                 <w:szCs w:val="16"/>
               </w:rPr>
-              <w:t>CVSS v3.1 Score</w:t>
-            </w:r>
+              <w:t xml:space="preserve">CVSS v3.1 </w:t>
+            </w:r>
+            <w:proofErr w:type="gramStart"/>
+            <w:r>
+              <w:rPr>
+                <w:rFonts w:ascii="Raleway" w:hAnsi="Raleway" w:cs="Segoe UI"/>
+                <w:sz w:val="16"/>
+                <w:szCs w:val="16"/>
+              </w:rPr>
+              <w:t>Score</w:t>
+            </w:r>
+            <w:proofErr w:type="gramEnd"/>
           </w:p>
         </w:tc>
         <w:tc>
@@ -13080,8 +14250,165 @@
                 <w:sz w:val="18"/>
                 <w:szCs w:val="18"/>
               </w:rPr>
-              <w:t>CVSS:3.1/AV:N/AC:L/PR:N/UI:N/S:U/C:H/I:N/A:N</w:t>
-            </w:r>
+              <w:t>CVSS:3.1/</w:t>
+            </w:r>
+            <w:proofErr w:type="gramStart"/>
+            <w:r>
+              <w:rPr>
+                <w:rFonts w:ascii="Raleway" w:eastAsia="Ubuntu" w:hAnsi="Raleway" w:cs="Segoe UI"/>
+                <w:bCs/>
+                <w:caps w:val="0"/>
+                <w:color w:val="000000" w:themeColor="text1"/>
+                <w:sz w:val="18"/>
+                <w:szCs w:val="18"/>
+              </w:rPr>
+              <w:t>AV:N</w:t>
+            </w:r>
+            <w:proofErr w:type="gramEnd"/>
+            <w:r>
+              <w:rPr>
+                <w:rFonts w:ascii="Raleway" w:eastAsia="Ubuntu" w:hAnsi="Raleway" w:cs="Segoe UI"/>
+                <w:bCs/>
+                <w:caps w:val="0"/>
+                <w:color w:val="000000" w:themeColor="text1"/>
+                <w:sz w:val="18"/>
+                <w:szCs w:val="18"/>
+              </w:rPr>
+              <w:t>/</w:t>
+            </w:r>
+            <w:proofErr w:type="gramStart"/>
+            <w:r>
+              <w:rPr>
+                <w:rFonts w:ascii="Raleway" w:eastAsia="Ubuntu" w:hAnsi="Raleway" w:cs="Segoe UI"/>
+                <w:bCs/>
+                <w:caps w:val="0"/>
+                <w:color w:val="000000" w:themeColor="text1"/>
+                <w:sz w:val="18"/>
+                <w:szCs w:val="18"/>
+              </w:rPr>
+              <w:t>AC:L</w:t>
+            </w:r>
+            <w:proofErr w:type="gramEnd"/>
+            <w:r>
+              <w:rPr>
+                <w:rFonts w:ascii="Raleway" w:eastAsia="Ubuntu" w:hAnsi="Raleway" w:cs="Segoe UI"/>
+                <w:bCs/>
+                <w:caps w:val="0"/>
+                <w:color w:val="000000" w:themeColor="text1"/>
+                <w:sz w:val="18"/>
+                <w:szCs w:val="18"/>
+              </w:rPr>
+              <w:t>/</w:t>
+            </w:r>
+            <w:proofErr w:type="gramStart"/>
+            <w:r>
+              <w:rPr>
+                <w:rFonts w:ascii="Raleway" w:eastAsia="Ubuntu" w:hAnsi="Raleway" w:cs="Segoe UI"/>
+                <w:bCs/>
+                <w:caps w:val="0"/>
+                <w:color w:val="000000" w:themeColor="text1"/>
+                <w:sz w:val="18"/>
+                <w:szCs w:val="18"/>
+              </w:rPr>
+              <w:t>PR:N</w:t>
+            </w:r>
+            <w:proofErr w:type="gramEnd"/>
+            <w:r>
+              <w:rPr>
+                <w:rFonts w:ascii="Raleway" w:eastAsia="Ubuntu" w:hAnsi="Raleway" w:cs="Segoe UI"/>
+                <w:bCs/>
+                <w:caps w:val="0"/>
+                <w:color w:val="000000" w:themeColor="text1"/>
+                <w:sz w:val="18"/>
+                <w:szCs w:val="18"/>
+              </w:rPr>
+              <w:t>/</w:t>
+            </w:r>
+            <w:proofErr w:type="gramStart"/>
+            <w:r>
+              <w:rPr>
+                <w:rFonts w:ascii="Raleway" w:eastAsia="Ubuntu" w:hAnsi="Raleway" w:cs="Segoe UI"/>
+                <w:bCs/>
+                <w:caps w:val="0"/>
+                <w:color w:val="000000" w:themeColor="text1"/>
+                <w:sz w:val="18"/>
+                <w:szCs w:val="18"/>
+              </w:rPr>
+              <w:t>UI:N</w:t>
+            </w:r>
+            <w:proofErr w:type="gramEnd"/>
+            <w:r>
+              <w:rPr>
+                <w:rFonts w:ascii="Raleway" w:eastAsia="Ubuntu" w:hAnsi="Raleway" w:cs="Segoe UI"/>
+                <w:bCs/>
+                <w:caps w:val="0"/>
+                <w:color w:val="000000" w:themeColor="text1"/>
+                <w:sz w:val="18"/>
+                <w:szCs w:val="18"/>
+              </w:rPr>
+              <w:t>/</w:t>
+            </w:r>
+            <w:proofErr w:type="gramStart"/>
+            <w:r>
+              <w:rPr>
+                <w:rFonts w:ascii="Raleway" w:eastAsia="Ubuntu" w:hAnsi="Raleway" w:cs="Segoe UI"/>
+                <w:bCs/>
+                <w:caps w:val="0"/>
+                <w:color w:val="000000" w:themeColor="text1"/>
+                <w:sz w:val="18"/>
+                <w:szCs w:val="18"/>
+              </w:rPr>
+              <w:t>S:U</w:t>
+            </w:r>
+            <w:proofErr w:type="gramEnd"/>
+            <w:r>
+              <w:rPr>
+                <w:rFonts w:ascii="Raleway" w:eastAsia="Ubuntu" w:hAnsi="Raleway" w:cs="Segoe UI"/>
+                <w:bCs/>
+                <w:caps w:val="0"/>
+                <w:color w:val="000000" w:themeColor="text1"/>
+                <w:sz w:val="18"/>
+                <w:szCs w:val="18"/>
+              </w:rPr>
+              <w:t>/C:H/</w:t>
+            </w:r>
+            <w:proofErr w:type="gramStart"/>
+            <w:r>
+              <w:rPr>
+                <w:rFonts w:ascii="Raleway" w:eastAsia="Ubuntu" w:hAnsi="Raleway" w:cs="Segoe UI"/>
+                <w:bCs/>
+                <w:caps w:val="0"/>
+                <w:color w:val="000000" w:themeColor="text1"/>
+                <w:sz w:val="18"/>
+                <w:szCs w:val="18"/>
+              </w:rPr>
+              <w:t>I:N</w:t>
+            </w:r>
+            <w:proofErr w:type="gramEnd"/>
+            <w:r>
+              <w:rPr>
+                <w:rFonts w:ascii="Raleway" w:eastAsia="Ubuntu" w:hAnsi="Raleway" w:cs="Segoe UI"/>
+                <w:bCs/>
+                <w:caps w:val="0"/>
+                <w:color w:val="000000" w:themeColor="text1"/>
+                <w:sz w:val="18"/>
+                <w:szCs w:val="18"/>
+              </w:rPr>
+              <w:t>/</w:t>
+            </w:r>
+            <w:proofErr w:type="gramStart"/>
+            <w:r>
+              <w:rPr>
+                <w:rFonts w:ascii="Raleway" w:eastAsia="Ubuntu" w:hAnsi="Raleway" w:cs="Segoe UI"/>
+                <w:bCs/>
+                <w:caps w:val="0"/>
+                <w:color w:val="000000" w:themeColor="text1"/>
+                <w:sz w:val="18"/>
+                <w:szCs w:val="18"/>
+              </w:rPr>
+              <w:t>A:N</w:t>
+            </w:r>
+            <w:proofErr w:type="gramEnd"/>
           </w:p>
         </w:tc>
       </w:tr>
@@ -13829,7 +15156,15 @@
                 <w:color w:val="DE713A"/>
                 <w:lang w:val="en-IN"/>
               </w:rPr>
-              <w:t>192.168.10.45 / dev-azure-node01.campus.internal</w:t>
+              <w:t>192.168.10.45 / dev-azure-</w:t>
+            </w:r>
+            <w:r>
+              <w:rPr>
+                <w:rFonts w:ascii="Raleway" w:hAnsi="Raleway" w:cs="Segoe UI"/>
+                <w:color w:val="DE713A"/>
+                <w:lang w:val="en-IN"/>
+              </w:rPr>
+              <w:t>node01.campus. internal</w:t>
             </w:r>
           </w:p>
           <w:p>
@@ -14122,7 +15457,25 @@
           <w:sz w:val="20"/>
           <w:szCs w:val="20"/>
         </w:rPr>
-        <w:t>Nmap scan report for dev-azure-node01.campus.internal (192.168.10.45)</w:t>
+        <w:t>Nmap scan report for dev-azure-</w:t>
+      </w:r>
+      <w:proofErr w:type="gramStart"/>
+      <w:r>
+        <w:rPr>
+          <w:rFonts w:ascii="Raleway" w:hAnsi="Raleway"/>
+          <w:sz w:val="20"/>
+          <w:szCs w:val="20"/>
+        </w:rPr>
+        <w:t>node01.campus.internal</w:t>
+      </w:r>
+      <w:proofErr w:type="gramEnd"/>
+      <w:r>
+        <w:rPr>
+          <w:rFonts w:ascii="Raleway" w:hAnsi="Raleway"/>
+          <w:sz w:val="20"/>
+          <w:szCs w:val="20"/>
+        </w:rPr>
+        <w:t xml:space="preserve"> (192.168.10.45)</w:t>
       </w:r>
     </w:p>
     <w:p>
@@ -14174,7 +15527,25 @@
           <w:sz w:val="20"/>
           <w:szCs w:val="20"/>
         </w:rPr>
-        <w:t xml:space="preserve"> open  ssh     OpenSSH 8.2p1 Ubuntu 4ubuntu0.5</w:t>
+        <w:t xml:space="preserve"> </w:t>
+      </w:r>
+      <w:proofErr w:type="gramStart"/>
+      <w:r>
+        <w:rPr>
+          <w:rFonts w:ascii="Raleway" w:hAnsi="Raleway"/>
+          <w:sz w:val="20"/>
+          <w:szCs w:val="20"/>
+        </w:rPr>
+        <w:t>open  ssh</w:t>
+      </w:r>
+      <w:proofErr w:type="gramEnd"/>
+      <w:r>
+        <w:rPr>
+          <w:rFonts w:ascii="Raleway" w:hAnsi="Raleway"/>
+          <w:sz w:val="20"/>
+          <w:szCs w:val="20"/>
+        </w:rPr>
+        <w:t xml:space="preserve">     OpenSSH 8.2p1 Ubuntu 4ubuntu0.5</w:t>
       </w:r>
     </w:p>
     <w:p>
@@ -14210,7 +15581,25 @@
           <w:sz w:val="20"/>
           <w:szCs w:val="20"/>
         </w:rPr>
-        <w:t xml:space="preserve">|_  Supported authentication methods: </w:t>
+        <w:t>|</w:t>
+      </w:r>
+      <w:proofErr w:type="gramStart"/>
+      <w:r>
+        <w:rPr>
+          <w:rFonts w:ascii="Raleway" w:hAnsi="Raleway"/>
+          <w:sz w:val="20"/>
+          <w:szCs w:val="20"/>
+        </w:rPr>
+        <w:t>_  Supported</w:t>
+      </w:r>
+      <w:proofErr w:type="gramEnd"/>
+      <w:r>
+        <w:rPr>
+          <w:rFonts w:ascii="Raleway" w:hAnsi="Raleway"/>
+          <w:sz w:val="20"/>
+          <w:szCs w:val="20"/>
+        </w:rPr>
+        <w:t xml:space="preserve"> authentication methods: </w:t>
       </w:r>
       <w:proofErr w:type="spellStart"/>
       <w:r>
@@ -14521,8 +15910,18 @@
                 <w:sz w:val="16"/>
                 <w:szCs w:val="16"/>
               </w:rPr>
-              <w:t>CVSS v3.1 Score</w:t>
-            </w:r>
+              <w:t xml:space="preserve">CVSS v3.1 </w:t>
+            </w:r>
+            <w:proofErr w:type="gramStart"/>
+            <w:r>
+              <w:rPr>
+                <w:rFonts w:ascii="Raleway" w:hAnsi="Raleway" w:cs="Segoe UI"/>
+                <w:sz w:val="16"/>
+                <w:szCs w:val="16"/>
+              </w:rPr>
+              <w:t>Score</w:t>
+            </w:r>
+            <w:proofErr w:type="gramEnd"/>
           </w:p>
         </w:tc>
         <w:tc>
@@ -14620,7 +16019,103 @@
                 <w:sz w:val="18"/>
                 <w:szCs w:val="18"/>
               </w:rPr>
-              <w:t>CVSS:3.1/AV:N/AC:H/PR:N/UI:N/S:U/C:H/I:H/A:H</w:t>
+              <w:t>CVSS:3.1/</w:t>
+            </w:r>
+            <w:proofErr w:type="gramStart"/>
+            <w:r>
+              <w:rPr>
+                <w:rFonts w:ascii="Raleway" w:eastAsia="Ubuntu" w:hAnsi="Raleway" w:cs="Segoe UI"/>
+                <w:bCs/>
+                <w:caps w:val="0"/>
+                <w:color w:val="000000" w:themeColor="text1"/>
+                <w:sz w:val="18"/>
+                <w:szCs w:val="18"/>
+              </w:rPr>
+              <w:t>AV:N</w:t>
+            </w:r>
+            <w:proofErr w:type="gramEnd"/>
+            <w:r>
+              <w:rPr>
+                <w:rFonts w:ascii="Raleway" w:eastAsia="Ubuntu" w:hAnsi="Raleway" w:cs="Segoe UI"/>
+                <w:bCs/>
+                <w:caps w:val="0"/>
+                <w:color w:val="000000" w:themeColor="text1"/>
+                <w:sz w:val="18"/>
+                <w:szCs w:val="18"/>
+              </w:rPr>
+              <w:t>/AC:H/</w:t>
+            </w:r>
+            <w:proofErr w:type="gramStart"/>
+            <w:r>
+              <w:rPr>
+                <w:rFonts w:ascii="Raleway" w:eastAsia="Ubuntu" w:hAnsi="Raleway" w:cs="Segoe UI"/>
+                <w:bCs/>
+                <w:caps w:val="0"/>
+                <w:color w:val="000000" w:themeColor="text1"/>
+                <w:sz w:val="18"/>
+                <w:szCs w:val="18"/>
+              </w:rPr>
+              <w:t>PR:N</w:t>
+            </w:r>
+            <w:proofErr w:type="gramEnd"/>
+            <w:r>
+              <w:rPr>
+                <w:rFonts w:ascii="Raleway" w:eastAsia="Ubuntu" w:hAnsi="Raleway" w:cs="Segoe UI"/>
+                <w:bCs/>
+                <w:caps w:val="0"/>
+                <w:color w:val="000000" w:themeColor="text1"/>
+                <w:sz w:val="18"/>
+                <w:szCs w:val="18"/>
+              </w:rPr>
+              <w:t>/</w:t>
+            </w:r>
+            <w:proofErr w:type="gramStart"/>
+            <w:r>
+              <w:rPr>
+                <w:rFonts w:ascii="Raleway" w:eastAsia="Ubuntu" w:hAnsi="Raleway" w:cs="Segoe UI"/>
+                <w:bCs/>
+                <w:caps w:val="0"/>
+                <w:color w:val="000000" w:themeColor="text1"/>
+                <w:sz w:val="18"/>
+                <w:szCs w:val="18"/>
+              </w:rPr>
+              <w:t>UI:N</w:t>
+            </w:r>
+            <w:proofErr w:type="gramEnd"/>
+            <w:r>
+              <w:rPr>
+                <w:rFonts w:ascii="Raleway" w:eastAsia="Ubuntu" w:hAnsi="Raleway" w:cs="Segoe UI"/>
+                <w:bCs/>
+                <w:caps w:val="0"/>
+                <w:color w:val="000000" w:themeColor="text1"/>
+                <w:sz w:val="18"/>
+                <w:szCs w:val="18"/>
+              </w:rPr>
+              <w:t>/</w:t>
+            </w:r>
+            <w:proofErr w:type="gramStart"/>
+            <w:r>
+              <w:rPr>
+                <w:rFonts w:ascii="Raleway" w:eastAsia="Ubuntu" w:hAnsi="Raleway" w:cs="Segoe UI"/>
+                <w:bCs/>
+                <w:caps w:val="0"/>
+                <w:color w:val="000000" w:themeColor="text1"/>
+                <w:sz w:val="18"/>
+                <w:szCs w:val="18"/>
+              </w:rPr>
+              <w:t>S:U</w:t>
+            </w:r>
+            <w:proofErr w:type="gramEnd"/>
+            <w:r>
+              <w:rPr>
+                <w:rFonts w:ascii="Raleway" w:eastAsia="Ubuntu" w:hAnsi="Raleway" w:cs="Segoe UI"/>
+                <w:bCs/>
+                <w:caps w:val="0"/>
+                <w:color w:val="000000" w:themeColor="text1"/>
+                <w:sz w:val="18"/>
+                <w:szCs w:val="18"/>
+              </w:rPr>
+              <w:t>/C:H/I:H/A:H</w:t>
             </w:r>
           </w:p>
         </w:tc>
@@ -15729,7 +17224,17 @@
           <w:szCs w:val="20"/>
           <w:lang w:val="en-IN"/>
         </w:rPr>
-        <w:t xml:space="preserve"> open  </w:t>
+        <w:t xml:space="preserve"> </w:t>
+      </w:r>
+      <w:proofErr w:type="gramStart"/>
+      <w:r>
+        <w:rPr>
+          <w:rFonts w:ascii="Raleway" w:hAnsi="Raleway"/>
+          <w:sz w:val="20"/>
+          <w:szCs w:val="20"/>
+          <w:lang w:val="en-IN"/>
+        </w:rPr>
+        <w:t xml:space="preserve">open  </w:t>
       </w:r>
       <w:proofErr w:type="spellStart"/>
       <w:r>
@@ -15742,6 +17247,7 @@
         <w:t>microsoft</w:t>
       </w:r>
       <w:proofErr w:type="spellEnd"/>
+      <w:proofErr w:type="gramEnd"/>
       <w:r>
         <w:rPr>
           <w:rFonts w:ascii="Raleway" w:hAnsi="Raleway"/>
@@ -15953,7 +17459,17 @@
           <w:szCs w:val="20"/>
           <w:lang w:val="en-IN"/>
         </w:rPr>
-        <w:t xml:space="preserve">|_  </w:t>
+        <w:t>|</w:t>
+      </w:r>
+      <w:proofErr w:type="gramStart"/>
+      <w:r>
+        <w:rPr>
+          <w:rFonts w:ascii="Raleway" w:hAnsi="Raleway"/>
+          <w:sz w:val="20"/>
+          <w:szCs w:val="20"/>
+          <w:lang w:val="en-IN"/>
+        </w:rPr>
+        <w:t xml:space="preserve">_  </w:t>
       </w:r>
       <w:proofErr w:type="spellStart"/>
       <w:r>
@@ -15963,7 +17479,17 @@
           <w:szCs w:val="20"/>
           <w:lang w:val="en-IN"/>
         </w:rPr>
-        <w:t>message_signing</w:t>
+        <w:t>message</w:t>
+      </w:r>
+      <w:proofErr w:type="gramEnd"/>
+      <w:r>
+        <w:rPr>
+          <w:rFonts w:ascii="Raleway" w:hAnsi="Raleway"/>
+          <w:sz w:val="20"/>
+          <w:szCs w:val="20"/>
+          <w:lang w:val="en-IN"/>
+        </w:rPr>
+        <w:t>_signing</w:t>
       </w:r>
       <w:proofErr w:type="spellEnd"/>
       <w:r>
@@ -16214,8 +17740,18 @@
                 <w:sz w:val="16"/>
                 <w:szCs w:val="16"/>
               </w:rPr>
-              <w:t>CVSS v3.1 Score</w:t>
-            </w:r>
+              <w:t xml:space="preserve">CVSS v3.1 </w:t>
+            </w:r>
+            <w:proofErr w:type="gramStart"/>
+            <w:r>
+              <w:rPr>
+                <w:rFonts w:ascii="Raleway" w:hAnsi="Raleway" w:cs="Segoe UI"/>
+                <w:sz w:val="16"/>
+                <w:szCs w:val="16"/>
+              </w:rPr>
+              <w:t>Score</w:t>
+            </w:r>
+            <w:proofErr w:type="gramEnd"/>
           </w:p>
         </w:tc>
         <w:tc>
@@ -16313,8 +17849,165 @@
                 <w:sz w:val="18"/>
                 <w:szCs w:val="18"/>
               </w:rPr>
-              <w:t>CVSS:3.1/AV:N/AC:L/PR:N/UI:R/S:C/C:L/I:L/A:N</w:t>
-            </w:r>
+              <w:t>CVSS:3.1/</w:t>
+            </w:r>
+            <w:proofErr w:type="gramStart"/>
+            <w:r>
+              <w:rPr>
+                <w:rFonts w:ascii="Raleway" w:eastAsia="Ubuntu" w:hAnsi="Raleway" w:cs="Segoe UI"/>
+                <w:bCs/>
+                <w:caps w:val="0"/>
+                <w:color w:val="000000" w:themeColor="text1"/>
+                <w:sz w:val="18"/>
+                <w:szCs w:val="18"/>
+              </w:rPr>
+              <w:t>AV:N</w:t>
+            </w:r>
+            <w:proofErr w:type="gramEnd"/>
+            <w:r>
+              <w:rPr>
+                <w:rFonts w:ascii="Raleway" w:eastAsia="Ubuntu" w:hAnsi="Raleway" w:cs="Segoe UI"/>
+                <w:bCs/>
+                <w:caps w:val="0"/>
+                <w:color w:val="000000" w:themeColor="text1"/>
+                <w:sz w:val="18"/>
+                <w:szCs w:val="18"/>
+              </w:rPr>
+              <w:t>/</w:t>
+            </w:r>
+            <w:proofErr w:type="gramStart"/>
+            <w:r>
+              <w:rPr>
+                <w:rFonts w:ascii="Raleway" w:eastAsia="Ubuntu" w:hAnsi="Raleway" w:cs="Segoe UI"/>
+                <w:bCs/>
+                <w:caps w:val="0"/>
+                <w:color w:val="000000" w:themeColor="text1"/>
+                <w:sz w:val="18"/>
+                <w:szCs w:val="18"/>
+              </w:rPr>
+              <w:t>AC:L</w:t>
+            </w:r>
+            <w:proofErr w:type="gramEnd"/>
+            <w:r>
+              <w:rPr>
+                <w:rFonts w:ascii="Raleway" w:eastAsia="Ubuntu" w:hAnsi="Raleway" w:cs="Segoe UI"/>
+                <w:bCs/>
+                <w:caps w:val="0"/>
+                <w:color w:val="000000" w:themeColor="text1"/>
+                <w:sz w:val="18"/>
+                <w:szCs w:val="18"/>
+              </w:rPr>
+              <w:t>/</w:t>
+            </w:r>
+            <w:proofErr w:type="gramStart"/>
+            <w:r>
+              <w:rPr>
+                <w:rFonts w:ascii="Raleway" w:eastAsia="Ubuntu" w:hAnsi="Raleway" w:cs="Segoe UI"/>
+                <w:bCs/>
+                <w:caps w:val="0"/>
+                <w:color w:val="000000" w:themeColor="text1"/>
+                <w:sz w:val="18"/>
+                <w:szCs w:val="18"/>
+              </w:rPr>
+              <w:t>PR:N</w:t>
+            </w:r>
+            <w:proofErr w:type="gramEnd"/>
+            <w:r>
+              <w:rPr>
+                <w:rFonts w:ascii="Raleway" w:eastAsia="Ubuntu" w:hAnsi="Raleway" w:cs="Segoe UI"/>
+                <w:bCs/>
+                <w:caps w:val="0"/>
+                <w:color w:val="000000" w:themeColor="text1"/>
+                <w:sz w:val="18"/>
+                <w:szCs w:val="18"/>
+              </w:rPr>
+              <w:t>/</w:t>
+            </w:r>
+            <w:proofErr w:type="gramStart"/>
+            <w:r>
+              <w:rPr>
+                <w:rFonts w:ascii="Raleway" w:eastAsia="Ubuntu" w:hAnsi="Raleway" w:cs="Segoe UI"/>
+                <w:bCs/>
+                <w:caps w:val="0"/>
+                <w:color w:val="000000" w:themeColor="text1"/>
+                <w:sz w:val="18"/>
+                <w:szCs w:val="18"/>
+              </w:rPr>
+              <w:t>UI:R</w:t>
+            </w:r>
+            <w:proofErr w:type="gramEnd"/>
+            <w:r>
+              <w:rPr>
+                <w:rFonts w:ascii="Raleway" w:eastAsia="Ubuntu" w:hAnsi="Raleway" w:cs="Segoe UI"/>
+                <w:bCs/>
+                <w:caps w:val="0"/>
+                <w:color w:val="000000" w:themeColor="text1"/>
+                <w:sz w:val="18"/>
+                <w:szCs w:val="18"/>
+              </w:rPr>
+              <w:t>/S:C/</w:t>
+            </w:r>
+            <w:proofErr w:type="gramStart"/>
+            <w:r>
+              <w:rPr>
+                <w:rFonts w:ascii="Raleway" w:eastAsia="Ubuntu" w:hAnsi="Raleway" w:cs="Segoe UI"/>
+                <w:bCs/>
+                <w:caps w:val="0"/>
+                <w:color w:val="000000" w:themeColor="text1"/>
+                <w:sz w:val="18"/>
+                <w:szCs w:val="18"/>
+              </w:rPr>
+              <w:t>C:L</w:t>
+            </w:r>
+            <w:proofErr w:type="gramEnd"/>
+            <w:r>
+              <w:rPr>
+                <w:rFonts w:ascii="Raleway" w:eastAsia="Ubuntu" w:hAnsi="Raleway" w:cs="Segoe UI"/>
+                <w:bCs/>
+                <w:caps w:val="0"/>
+                <w:color w:val="000000" w:themeColor="text1"/>
+                <w:sz w:val="18"/>
+                <w:szCs w:val="18"/>
+              </w:rPr>
+              <w:t>/</w:t>
+            </w:r>
+            <w:proofErr w:type="gramStart"/>
+            <w:r>
+              <w:rPr>
+                <w:rFonts w:ascii="Raleway" w:eastAsia="Ubuntu" w:hAnsi="Raleway" w:cs="Segoe UI"/>
+                <w:bCs/>
+                <w:caps w:val="0"/>
+                <w:color w:val="000000" w:themeColor="text1"/>
+                <w:sz w:val="18"/>
+                <w:szCs w:val="18"/>
+              </w:rPr>
+              <w:t>I:L</w:t>
+            </w:r>
+            <w:proofErr w:type="gramEnd"/>
+            <w:r>
+              <w:rPr>
+                <w:rFonts w:ascii="Raleway" w:eastAsia="Ubuntu" w:hAnsi="Raleway" w:cs="Segoe UI"/>
+                <w:bCs/>
+                <w:caps w:val="0"/>
+                <w:color w:val="000000" w:themeColor="text1"/>
+                <w:sz w:val="18"/>
+                <w:szCs w:val="18"/>
+              </w:rPr>
+              <w:t>/</w:t>
+            </w:r>
+            <w:proofErr w:type="gramStart"/>
+            <w:r>
+              <w:rPr>
+                <w:rFonts w:ascii="Raleway" w:eastAsia="Ubuntu" w:hAnsi="Raleway" w:cs="Segoe UI"/>
+                <w:bCs/>
+                <w:caps w:val="0"/>
+                <w:color w:val="000000" w:themeColor="text1"/>
+                <w:sz w:val="18"/>
+                <w:szCs w:val="18"/>
+              </w:rPr>
+              <w:t>A:N</w:t>
+            </w:r>
+            <w:proofErr w:type="gramEnd"/>
           </w:p>
         </w:tc>
       </w:tr>
@@ -17115,8 +18808,18 @@
                 <w:color w:val="DE713A"/>
                 <w:lang w:val="en-IN"/>
               </w:rPr>
-              <w:t>/search</w:t>
-            </w:r>
+              <w:t>/</w:t>
+            </w:r>
+            <w:proofErr w:type="gramStart"/>
+            <w:r>
+              <w:rPr>
+                <w:rFonts w:ascii="Raleway" w:hAnsi="Raleway" w:cs="Segoe UI"/>
+                <w:color w:val="DE713A"/>
+                <w:lang w:val="en-IN"/>
+              </w:rPr>
+              <w:t>search</w:t>
+            </w:r>
+            <w:proofErr w:type="gramEnd"/>
           </w:p>
         </w:tc>
       </w:tr>
@@ -17537,7 +19240,25 @@
           <w:sz w:val="20"/>
           <w:szCs w:val="20"/>
         </w:rPr>
-        <w:t>=&lt;script&gt;alert(1)&lt;/script&gt; HTTP/1.1</w:t>
+        <w:t>=&lt;script&gt;alert(</w:t>
+      </w:r>
+      <w:proofErr w:type="gramStart"/>
+      <w:r>
+        <w:rPr>
+          <w:rFonts w:ascii="Raleway" w:hAnsi="Raleway"/>
+          <w:sz w:val="20"/>
+          <w:szCs w:val="20"/>
+        </w:rPr>
+        <w:t>1)&lt;</w:t>
+      </w:r>
+      <w:proofErr w:type="gramEnd"/>
+      <w:r>
+        <w:rPr>
+          <w:rFonts w:ascii="Raleway" w:hAnsi="Raleway"/>
+          <w:sz w:val="20"/>
+          <w:szCs w:val="20"/>
+        </w:rPr>
+        <w:t>/script&gt; HTTP/1.1</w:t>
       </w:r>
     </w:p>
     <w:p>
@@ -17846,8 +19567,18 @@
                 <w:sz w:val="16"/>
                 <w:szCs w:val="16"/>
               </w:rPr>
-              <w:t>CVSS v3.1 Score</w:t>
-            </w:r>
+              <w:t xml:space="preserve">CVSS v3.1 </w:t>
+            </w:r>
+            <w:proofErr w:type="gramStart"/>
+            <w:r>
+              <w:rPr>
+                <w:rFonts w:ascii="Raleway" w:hAnsi="Raleway" w:cs="Segoe UI"/>
+                <w:sz w:val="16"/>
+                <w:szCs w:val="16"/>
+              </w:rPr>
+              <w:t>Score</w:t>
+            </w:r>
+            <w:proofErr w:type="gramEnd"/>
           </w:p>
         </w:tc>
         <w:tc>
@@ -17945,7 +19676,127 @@
                 <w:sz w:val="18"/>
                 <w:szCs w:val="18"/>
               </w:rPr>
-              <w:t>CVSS:3.1/AV:N/AC:L/PR:N/UI:N/S:U/C:H/I:H/A:H</w:t>
+              <w:t>CVSS:3.1/</w:t>
+            </w:r>
+            <w:proofErr w:type="gramStart"/>
+            <w:r>
+              <w:rPr>
+                <w:rFonts w:ascii="Raleway" w:eastAsia="Ubuntu" w:hAnsi="Raleway" w:cs="Segoe UI"/>
+                <w:bCs/>
+                <w:caps w:val="0"/>
+                <w:color w:val="000000" w:themeColor="text1"/>
+                <w:sz w:val="18"/>
+                <w:szCs w:val="18"/>
+              </w:rPr>
+              <w:t>AV:N</w:t>
+            </w:r>
+            <w:proofErr w:type="gramEnd"/>
+            <w:r>
+              <w:rPr>
+                <w:rFonts w:ascii="Raleway" w:eastAsia="Ubuntu" w:hAnsi="Raleway" w:cs="Segoe UI"/>
+                <w:bCs/>
+                <w:caps w:val="0"/>
+                <w:color w:val="000000" w:themeColor="text1"/>
+                <w:sz w:val="18"/>
+                <w:szCs w:val="18"/>
+              </w:rPr>
+              <w:t>/</w:t>
+            </w:r>
+            <w:proofErr w:type="gramStart"/>
+            <w:r>
+              <w:rPr>
+                <w:rFonts w:ascii="Raleway" w:eastAsia="Ubuntu" w:hAnsi="Raleway" w:cs="Segoe UI"/>
+                <w:bCs/>
+                <w:caps w:val="0"/>
+                <w:color w:val="000000" w:themeColor="text1"/>
+                <w:sz w:val="18"/>
+                <w:szCs w:val="18"/>
+              </w:rPr>
+              <w:t>AC:L</w:t>
+            </w:r>
+            <w:proofErr w:type="gramEnd"/>
+            <w:r>
+              <w:rPr>
+                <w:rFonts w:ascii="Raleway" w:eastAsia="Ubuntu" w:hAnsi="Raleway" w:cs="Segoe UI"/>
+                <w:bCs/>
+                <w:caps w:val="0"/>
+                <w:color w:val="000000" w:themeColor="text1"/>
+                <w:sz w:val="18"/>
+                <w:szCs w:val="18"/>
+              </w:rPr>
+              <w:t>/</w:t>
+            </w:r>
+            <w:proofErr w:type="gramStart"/>
+            <w:r>
+              <w:rPr>
+                <w:rFonts w:ascii="Raleway" w:eastAsia="Ubuntu" w:hAnsi="Raleway" w:cs="Segoe UI"/>
+                <w:bCs/>
+                <w:caps w:val="0"/>
+                <w:color w:val="000000" w:themeColor="text1"/>
+                <w:sz w:val="18"/>
+                <w:szCs w:val="18"/>
+              </w:rPr>
+              <w:t>PR:N</w:t>
+            </w:r>
+            <w:proofErr w:type="gramEnd"/>
+            <w:r>
+              <w:rPr>
+                <w:rFonts w:ascii="Raleway" w:eastAsia="Ubuntu" w:hAnsi="Raleway" w:cs="Segoe UI"/>
+                <w:bCs/>
+                <w:caps w:val="0"/>
+                <w:color w:val="000000" w:themeColor="text1"/>
+                <w:sz w:val="18"/>
+                <w:szCs w:val="18"/>
+              </w:rPr>
+              <w:t>/</w:t>
+            </w:r>
+            <w:proofErr w:type="gramStart"/>
+            <w:r>
+              <w:rPr>
+                <w:rFonts w:ascii="Raleway" w:eastAsia="Ubuntu" w:hAnsi="Raleway" w:cs="Segoe UI"/>
+                <w:bCs/>
+                <w:caps w:val="0"/>
+                <w:color w:val="000000" w:themeColor="text1"/>
+                <w:sz w:val="18"/>
+                <w:szCs w:val="18"/>
+              </w:rPr>
+              <w:t>UI:N</w:t>
+            </w:r>
+            <w:proofErr w:type="gramEnd"/>
+            <w:r>
+              <w:rPr>
+                <w:rFonts w:ascii="Raleway" w:eastAsia="Ubuntu" w:hAnsi="Raleway" w:cs="Segoe UI"/>
+                <w:bCs/>
+                <w:caps w:val="0"/>
+                <w:color w:val="000000" w:themeColor="text1"/>
+                <w:sz w:val="18"/>
+                <w:szCs w:val="18"/>
+              </w:rPr>
+              <w:t>/</w:t>
+            </w:r>
+            <w:proofErr w:type="gramStart"/>
+            <w:r>
+              <w:rPr>
+                <w:rFonts w:ascii="Raleway" w:eastAsia="Ubuntu" w:hAnsi="Raleway" w:cs="Segoe UI"/>
+                <w:bCs/>
+                <w:caps w:val="0"/>
+                <w:color w:val="000000" w:themeColor="text1"/>
+                <w:sz w:val="18"/>
+                <w:szCs w:val="18"/>
+              </w:rPr>
+              <w:t>S:U</w:t>
+            </w:r>
+            <w:proofErr w:type="gramEnd"/>
+            <w:r>
+              <w:rPr>
+                <w:rFonts w:ascii="Raleway" w:eastAsia="Ubuntu" w:hAnsi="Raleway" w:cs="Segoe UI"/>
+                <w:bCs/>
+                <w:caps w:val="0"/>
+                <w:color w:val="000000" w:themeColor="text1"/>
+                <w:sz w:val="18"/>
+                <w:szCs w:val="18"/>
+              </w:rPr>
+              <w:t>/C:H/I:H/A:H</w:t>
             </w:r>
           </w:p>
         </w:tc>
@@ -18662,6 +20513,7 @@
               </w:rPr>
               <w:t>/</w:t>
             </w:r>
+            <w:proofErr w:type="gramStart"/>
             <w:r>
               <w:rPr>
                 <w:rFonts w:ascii="Raleway" w:hAnsi="Raleway" w:cs="Segoe UI"/>
@@ -18670,6 +20522,7 @@
               </w:rPr>
               <w:t>login</w:t>
             </w:r>
+            <w:proofErr w:type="gramEnd"/>
           </w:p>
         </w:tc>
       </w:tr>
@@ -21129,7 +22982,7 @@
             </wp:anchor>
           </w:drawing>
         </mc:Choice>
-        <mc:Fallback xmlns:a="http://schemas.openxmlformats.org/drawingml/2006/main" xmlns:a14="http://schemas.microsoft.com/office/drawing/2010/main" xmlns:arto="http://schemas.microsoft.com/office/word/2006/arto">
+        <mc:Fallback xmlns:arto="http://schemas.microsoft.com/office/word/2006/arto" xmlns:a14="http://schemas.microsoft.com/office/drawing/2010/main" xmlns:a="http://schemas.openxmlformats.org/drawingml/2006/main">
           <w:pict w14:anchorId="38CA5F0A">
             <v:line id="Line 4" style="position:absolute;flip:y;z-index:251658241;visibility:visible;mso-wrap-style:square;mso-width-percent:0;mso-height-percent:0;mso-wrap-distance-left:9pt;mso-wrap-distance-top:0;mso-wrap-distance-right:9pt;mso-wrap-distance-bottom:0;mso-position-horizontal:absolute;mso-position-horizontal-relative:text;mso-position-vertical:absolute;mso-position-vertical-relative:text;mso-width-percent:0;mso-height-percent:0;mso-width-relative:page;mso-height-relative:page" o:spid="_x0000_s1026" strokecolor="#f93" from="-3.65pt,-4.3pt" to="504.55pt,-4.3pt" w14:anchorId="5A3C3AEC" o:gfxdata="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">
               <o:lock v:ext="edit" shapetype="f"/>
@@ -21855,7 +23708,7 @@
             </wp:anchor>
           </w:drawing>
         </mc:Choice>
-        <mc:Fallback xmlns:a="http://schemas.openxmlformats.org/drawingml/2006/main" xmlns:pic="http://schemas.openxmlformats.org/drawingml/2006/picture" xmlns:a14="http://schemas.microsoft.com/office/drawing/2010/main" xmlns:arto="http://schemas.microsoft.com/office/word/2006/arto">
+        <mc:Fallback xmlns:arto="http://schemas.microsoft.com/office/word/2006/arto" xmlns:a14="http://schemas.microsoft.com/office/drawing/2010/main" xmlns:pic="http://schemas.openxmlformats.org/drawingml/2006/picture" xmlns:a="http://schemas.openxmlformats.org/drawingml/2006/main">
           <w:pict w14:anchorId="5A5AE9C6">
             <v:line id="Line 2" style="position:absolute;flip:y;z-index:251658240;visibility:visible;mso-wrap-style:square;mso-width-percent:0;mso-height-percent:0;mso-wrap-distance-left:9pt;mso-wrap-distance-top:0;mso-wrap-distance-right:9pt;mso-wrap-distance-bottom:0;mso-position-horizontal:absolute;mso-position-horizontal-relative:text;mso-position-vertical:absolute;mso-position-vertical-relative:text;mso-width-percent:0;mso-height-percent:0;mso-width-relative:page;mso-height-relative:page" o:spid="_x0000_s1026" strokecolor="#f93" from="-3.65pt,11.85pt" to="509.9pt,11.85pt" w14:anchorId="405F419A" o:gfxdata="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">
               <o:lock v:ext="edit" shapetype="f"/>
@@ -21976,6 +23829,155 @@
     </w:lvl>
   </w:abstractNum>
   <w:abstractNum w:abstractNumId="1" w15:restartNumberingAfterBreak="0">
+    <w:nsid w:val="057D4151"/>
+    <w:multiLevelType w:val="multilevel"/>
+    <w:tmpl w:val="51966418"/>
+    <w:lvl w:ilvl="0">
+      <w:start w:val="1"/>
+      <w:numFmt w:val="decimal"/>
+      <w:lvlText w:val="%1."/>
+      <w:lvlJc w:val="left"/>
+      <w:pPr>
+        <w:tabs>
+          <w:tab w:val="num" w:pos="720"/>
+        </w:tabs>
+        <w:ind w:left="720" w:hanging="360"/>
+      </w:pPr>
+      <w:rPr>
+        <w:rFonts w:hint="default"/>
+        <w:sz w:val="20"/>
+      </w:rPr>
+    </w:lvl>
+    <w:lvl w:ilvl="1" w:tentative="1">
+      <w:start w:val="1"/>
+      <w:numFmt w:val="bullet"/>
+      <w:lvlText w:val="o"/>
+      <w:lvlJc w:val="left"/>
+      <w:pPr>
+        <w:tabs>
+          <w:tab w:val="num" w:pos="1440"/>
+        </w:tabs>
+        <w:ind w:left="1440" w:hanging="360"/>
+      </w:pPr>
+      <w:rPr>
+        <w:rFonts w:ascii="Courier New" w:hAnsi="Courier New" w:hint="default"/>
+        <w:sz w:val="20"/>
+      </w:rPr>
+    </w:lvl>
+    <w:lvl w:ilvl="2" w:tentative="1">
+      <w:start w:val="1"/>
+      <w:numFmt w:val="bullet"/>
+      <w:lvlText w:val=""/>
+      <w:lvlJc w:val="left"/>
+      <w:pPr>
+        <w:tabs>
+          <w:tab w:val="num" w:pos="2160"/>
+        </w:tabs>
+        <w:ind w:left="2160" w:hanging="360"/>
+      </w:pPr>
+      <w:rPr>
+        <w:rFonts w:ascii="Wingdings" w:hAnsi="Wingdings" w:hint="default"/>
+        <w:sz w:val="20"/>
+      </w:rPr>
+    </w:lvl>
+    <w:lvl w:ilvl="3" w:tentative="1">
+      <w:start w:val="1"/>
+      <w:numFmt w:val="bullet"/>
+      <w:lvlText w:val=""/>
+      <w:lvlJc w:val="left"/>
+      <w:pPr>
+        <w:tabs>
+          <w:tab w:val="num" w:pos="2880"/>
+        </w:tabs>
+        <w:ind w:left="2880" w:hanging="360"/>
+      </w:pPr>
+      <w:rPr>
+        <w:rFonts w:ascii="Wingdings" w:hAnsi="Wingdings" w:hint="default"/>
+        <w:sz w:val="20"/>
+      </w:rPr>
+    </w:lvl>
+    <w:lvl w:ilvl="4" w:tentative="1">
+      <w:start w:val="1"/>
+      <w:numFmt w:val="bullet"/>
+      <w:lvlText w:val=""/>
+      <w:lvlJc w:val="left"/>
+      <w:pPr>
+        <w:tabs>
+          <w:tab w:val="num" w:pos="3600"/>
+        </w:tabs>
+        <w:ind w:left="3600" w:hanging="360"/>
+      </w:pPr>
+      <w:rPr>
+        <w:rFonts w:ascii="Wingdings" w:hAnsi="Wingdings" w:hint="default"/>
+        <w:sz w:val="20"/>
+      </w:rPr>
+    </w:lvl>
+    <w:lvl w:ilvl="5" w:tentative="1">
+      <w:start w:val="1"/>
+      <w:numFmt w:val="bullet"/>
+      <w:lvlText w:val=""/>
+      <w:lvlJc w:val="left"/>
+      <w:pPr>
+        <w:tabs>
+          <w:tab w:val="num" w:pos="4320"/>
+        </w:tabs>
+        <w:ind w:left="4320" w:hanging="360"/>
+      </w:pPr>
+      <w:rPr>
+        <w:rFonts w:ascii="Wingdings" w:hAnsi="Wingdings" w:hint="default"/>
+        <w:sz w:val="20"/>
+      </w:rPr>
+    </w:lvl>
+    <w:lvl w:ilvl="6" w:tentative="1">
+      <w:start w:val="1"/>
+      <w:numFmt w:val="bullet"/>
+      <w:lvlText w:val=""/>
+      <w:lvlJc w:val="left"/>
+      <w:pPr>
+        <w:tabs>
+          <w:tab w:val="num" w:pos="5040"/>
+        </w:tabs>
+        <w:ind w:left="5040" w:hanging="360"/>
+      </w:pPr>
+      <w:rPr>
+        <w:rFonts w:ascii="Wingdings" w:hAnsi="Wingdings" w:hint="default"/>
+        <w:sz w:val="20"/>
+      </w:rPr>
+    </w:lvl>
+    <w:lvl w:ilvl="7" w:tentative="1">
+      <w:start w:val="1"/>
+      <w:numFmt w:val="bullet"/>
+      <w:lvlText w:val=""/>
+      <w:lvlJc w:val="left"/>
+      <w:pPr>
+        <w:tabs>
+          <w:tab w:val="num" w:pos="5760"/>
+        </w:tabs>
+        <w:ind w:left="5760" w:hanging="360"/>
+      </w:pPr>
+      <w:rPr>
+        <w:rFonts w:ascii="Wingdings" w:hAnsi="Wingdings" w:hint="default"/>
+        <w:sz w:val="20"/>
+      </w:rPr>
+    </w:lvl>
+    <w:lvl w:ilvl="8" w:tentative="1">
+      <w:start w:val="1"/>
+      <w:numFmt w:val="bullet"/>
+      <w:lvlText w:val=""/>
+      <w:lvlJc w:val="left"/>
+      <w:pPr>
+        <w:tabs>
+          <w:tab w:val="num" w:pos="6480"/>
+        </w:tabs>
+        <w:ind w:left="6480" w:hanging="360"/>
+      </w:pPr>
+      <w:rPr>
+        <w:rFonts w:ascii="Wingdings" w:hAnsi="Wingdings" w:hint="default"/>
+        <w:sz w:val="20"/>
+      </w:rPr>
+    </w:lvl>
+  </w:abstractNum>
+  <w:abstractNum w:abstractNumId="2" w15:restartNumberingAfterBreak="0">
     <w:nsid w:val="099B3A19"/>
     <w:multiLevelType w:val="hybridMultilevel"/>
     <w:tmpl w:val="11EE334E"/>
@@ -22088,7 +24090,7 @@
       </w:rPr>
     </w:lvl>
   </w:abstractNum>
-  <w:abstractNum w:abstractNumId="2" w15:restartNumberingAfterBreak="0">
+  <w:abstractNum w:abstractNumId="3" w15:restartNumberingAfterBreak="0">
     <w:nsid w:val="0B031C52"/>
     <w:multiLevelType w:val="hybridMultilevel"/>
     <w:tmpl w:val="514672F2"/>
@@ -22174,7 +24176,156 @@
       </w:pPr>
     </w:lvl>
   </w:abstractNum>
-  <w:abstractNum w:abstractNumId="3" w15:restartNumberingAfterBreak="0">
+  <w:abstractNum w:abstractNumId="4" w15:restartNumberingAfterBreak="0">
+    <w:nsid w:val="12E33486"/>
+    <w:multiLevelType w:val="multilevel"/>
+    <w:tmpl w:val="51966418"/>
+    <w:lvl w:ilvl="0">
+      <w:start w:val="1"/>
+      <w:numFmt w:val="decimal"/>
+      <w:lvlText w:val="%1."/>
+      <w:lvlJc w:val="left"/>
+      <w:pPr>
+        <w:tabs>
+          <w:tab w:val="num" w:pos="720"/>
+        </w:tabs>
+        <w:ind w:left="720" w:hanging="360"/>
+      </w:pPr>
+      <w:rPr>
+        <w:rFonts w:hint="default"/>
+        <w:sz w:val="20"/>
+      </w:rPr>
+    </w:lvl>
+    <w:lvl w:ilvl="1" w:tentative="1">
+      <w:start w:val="1"/>
+      <w:numFmt w:val="bullet"/>
+      <w:lvlText w:val="o"/>
+      <w:lvlJc w:val="left"/>
+      <w:pPr>
+        <w:tabs>
+          <w:tab w:val="num" w:pos="1440"/>
+        </w:tabs>
+        <w:ind w:left="1440" w:hanging="360"/>
+      </w:pPr>
+      <w:rPr>
+        <w:rFonts w:ascii="Courier New" w:hAnsi="Courier New" w:hint="default"/>
+        <w:sz w:val="20"/>
+      </w:rPr>
+    </w:lvl>
+    <w:lvl w:ilvl="2" w:tentative="1">
+      <w:start w:val="1"/>
+      <w:numFmt w:val="bullet"/>
+      <w:lvlText w:val=""/>
+      <w:lvlJc w:val="left"/>
+      <w:pPr>
+        <w:tabs>
+          <w:tab w:val="num" w:pos="2160"/>
+        </w:tabs>
+        <w:ind w:left="2160" w:hanging="360"/>
+      </w:pPr>
+      <w:rPr>
+        <w:rFonts w:ascii="Wingdings" w:hAnsi="Wingdings" w:hint="default"/>
+        <w:sz w:val="20"/>
+      </w:rPr>
+    </w:lvl>
+    <w:lvl w:ilvl="3" w:tentative="1">
+      <w:start w:val="1"/>
+      <w:numFmt w:val="bullet"/>
+      <w:lvlText w:val=""/>
+      <w:lvlJc w:val="left"/>
+      <w:pPr>
+        <w:tabs>
+          <w:tab w:val="num" w:pos="2880"/>
+        </w:tabs>
+        <w:ind w:left="2880" w:hanging="360"/>
+      </w:pPr>
+      <w:rPr>
+        <w:rFonts w:ascii="Wingdings" w:hAnsi="Wingdings" w:hint="default"/>
+        <w:sz w:val="20"/>
+      </w:rPr>
+    </w:lvl>
+    <w:lvl w:ilvl="4" w:tentative="1">
+      <w:start w:val="1"/>
+      <w:numFmt w:val="bullet"/>
+      <w:lvlText w:val=""/>
+      <w:lvlJc w:val="left"/>
+      <w:pPr>
+        <w:tabs>
+          <w:tab w:val="num" w:pos="3600"/>
+        </w:tabs>
+        <w:ind w:left="3600" w:hanging="360"/>
+      </w:pPr>
+      <w:rPr>
+        <w:rFonts w:ascii="Wingdings" w:hAnsi="Wingdings" w:hint="default"/>
+        <w:sz w:val="20"/>
+      </w:rPr>
+    </w:lvl>
+    <w:lvl w:ilvl="5" w:tentative="1">
+      <w:start w:val="1"/>
+      <w:numFmt w:val="bullet"/>
+      <w:lvlText w:val=""/>
+      <w:lvlJc w:val="left"/>
+      <w:pPr>
+        <w:tabs>
+          <w:tab w:val="num" w:pos="4320"/>
+        </w:tabs>
+        <w:ind w:left="4320" w:hanging="360"/>
+      </w:pPr>
+      <w:rPr>
+        <w:rFonts w:ascii="Wingdings" w:hAnsi="Wingdings" w:hint="default"/>
+        <w:sz w:val="20"/>
+      </w:rPr>
+    </w:lvl>
+    <w:lvl w:ilvl="6" w:tentative="1">
+      <w:start w:val="1"/>
+      <w:numFmt w:val="bullet"/>
+      <w:lvlText w:val=""/>
+      <w:lvlJc w:val="left"/>
+      <w:pPr>
+        <w:tabs>
+          <w:tab w:val="num" w:pos="5040"/>
+        </w:tabs>
+        <w:ind w:left="5040" w:hanging="360"/>
+      </w:pPr>
+      <w:rPr>
+        <w:rFonts w:ascii="Wingdings" w:hAnsi="Wingdings" w:hint="default"/>
+        <w:sz w:val="20"/>
+      </w:rPr>
+    </w:lvl>
+    <w:lvl w:ilvl="7" w:tentative="1">
+      <w:start w:val="1"/>
+      <w:numFmt w:val="bullet"/>
+      <w:lvlText w:val=""/>
+      <w:lvlJc w:val="left"/>
+      <w:pPr>
+        <w:tabs>
+          <w:tab w:val="num" w:pos="5760"/>
+        </w:tabs>
+        <w:ind w:left="5760" w:hanging="360"/>
+      </w:pPr>
+      <w:rPr>
+        <w:rFonts w:ascii="Wingdings" w:hAnsi="Wingdings" w:hint="default"/>
+        <w:sz w:val="20"/>
+      </w:rPr>
+    </w:lvl>
+    <w:lvl w:ilvl="8" w:tentative="1">
+      <w:start w:val="1"/>
+      <w:numFmt w:val="bullet"/>
+      <w:lvlText w:val=""/>
+      <w:lvlJc w:val="left"/>
+      <w:pPr>
+        <w:tabs>
+          <w:tab w:val="num" w:pos="6480"/>
+        </w:tabs>
+        <w:ind w:left="6480" w:hanging="360"/>
+      </w:pPr>
+      <w:rPr>
+        <w:rFonts w:ascii="Wingdings" w:hAnsi="Wingdings" w:hint="default"/>
+        <w:sz w:val="20"/>
+      </w:rPr>
+    </w:lvl>
+  </w:abstractNum>
+  <w:abstractNum w:abstractNumId="5" w15:restartNumberingAfterBreak="0">
     <w:nsid w:val="1CEE1DCB"/>
     <w:multiLevelType w:val="hybridMultilevel"/>
     <w:tmpl w:val="3A74BD78"/>
@@ -22287,7 +24438,7 @@
       </w:rPr>
     </w:lvl>
   </w:abstractNum>
-  <w:abstractNum w:abstractNumId="4" w15:restartNumberingAfterBreak="0">
+  <w:abstractNum w:abstractNumId="6" w15:restartNumberingAfterBreak="0">
     <w:nsid w:val="3A674A9C"/>
     <w:multiLevelType w:val="hybridMultilevel"/>
     <w:tmpl w:val="11EE334E"/>
@@ -22400,7 +24551,156 @@
       </w:rPr>
     </w:lvl>
   </w:abstractNum>
-  <w:abstractNum w:abstractNumId="5" w15:restartNumberingAfterBreak="0">
+  <w:abstractNum w:abstractNumId="7" w15:restartNumberingAfterBreak="0">
+    <w:nsid w:val="3E976168"/>
+    <w:multiLevelType w:val="multilevel"/>
+    <w:tmpl w:val="51966418"/>
+    <w:lvl w:ilvl="0">
+      <w:start w:val="1"/>
+      <w:numFmt w:val="decimal"/>
+      <w:lvlText w:val="%1."/>
+      <w:lvlJc w:val="left"/>
+      <w:pPr>
+        <w:tabs>
+          <w:tab w:val="num" w:pos="720"/>
+        </w:tabs>
+        <w:ind w:left="720" w:hanging="360"/>
+      </w:pPr>
+      <w:rPr>
+        <w:rFonts w:hint="default"/>
+        <w:sz w:val="20"/>
+      </w:rPr>
+    </w:lvl>
+    <w:lvl w:ilvl="1" w:tentative="1">
+      <w:start w:val="1"/>
+      <w:numFmt w:val="bullet"/>
+      <w:lvlText w:val="o"/>
+      <w:lvlJc w:val="left"/>
+      <w:pPr>
+        <w:tabs>
+          <w:tab w:val="num" w:pos="1440"/>
+        </w:tabs>
+        <w:ind w:left="1440" w:hanging="360"/>
+      </w:pPr>
+      <w:rPr>
+        <w:rFonts w:ascii="Courier New" w:hAnsi="Courier New" w:hint="default"/>
+        <w:sz w:val="20"/>
+      </w:rPr>
+    </w:lvl>
+    <w:lvl w:ilvl="2" w:tentative="1">
+      <w:start w:val="1"/>
+      <w:numFmt w:val="bullet"/>
+      <w:lvlText w:val=""/>
+      <w:lvlJc w:val="left"/>
+      <w:pPr>
+        <w:tabs>
+          <w:tab w:val="num" w:pos="2160"/>
+        </w:tabs>
+        <w:ind w:left="2160" w:hanging="360"/>
+      </w:pPr>
+      <w:rPr>
+        <w:rFonts w:ascii="Wingdings" w:hAnsi="Wingdings" w:hint="default"/>
+        <w:sz w:val="20"/>
+      </w:rPr>
+    </w:lvl>
+    <w:lvl w:ilvl="3" w:tentative="1">
+      <w:start w:val="1"/>
+      <w:numFmt w:val="bullet"/>
+      <w:lvlText w:val=""/>
+      <w:lvlJc w:val="left"/>
+      <w:pPr>
+        <w:tabs>
+          <w:tab w:val="num" w:pos="2880"/>
+        </w:tabs>
+        <w:ind w:left="2880" w:hanging="360"/>
+      </w:pPr>
+      <w:rPr>
+        <w:rFonts w:ascii="Wingdings" w:hAnsi="Wingdings" w:hint="default"/>
+        <w:sz w:val="20"/>
+      </w:rPr>
+    </w:lvl>
+    <w:lvl w:ilvl="4" w:tentative="1">
+      <w:start w:val="1"/>
+      <w:numFmt w:val="bullet"/>
+      <w:lvlText w:val=""/>
+      <w:lvlJc w:val="left"/>
+      <w:pPr>
+        <w:tabs>
+          <w:tab w:val="num" w:pos="3600"/>
+        </w:tabs>
+        <w:ind w:left="3600" w:hanging="360"/>
+      </w:pPr>
+      <w:rPr>
+        <w:rFonts w:ascii="Wingdings" w:hAnsi="Wingdings" w:hint="default"/>
+        <w:sz w:val="20"/>
+      </w:rPr>
+    </w:lvl>
+    <w:lvl w:ilvl="5" w:tentative="1">
+      <w:start w:val="1"/>
+      <w:numFmt w:val="bullet"/>
+      <w:lvlText w:val=""/>
+      <w:lvlJc w:val="left"/>
+      <w:pPr>
+        <w:tabs>
+          <w:tab w:val="num" w:pos="4320"/>
+        </w:tabs>
+        <w:ind w:left="4320" w:hanging="360"/>
+      </w:pPr>
+      <w:rPr>
+        <w:rFonts w:ascii="Wingdings" w:hAnsi="Wingdings" w:hint="default"/>
+        <w:sz w:val="20"/>
+      </w:rPr>
+    </w:lvl>
+    <w:lvl w:ilvl="6" w:tentative="1">
+      <w:start w:val="1"/>
+      <w:numFmt w:val="bullet"/>
+      <w:lvlText w:val=""/>
+      <w:lvlJc w:val="left"/>
+      <w:pPr>
+        <w:tabs>
+          <w:tab w:val="num" w:pos="5040"/>
+        </w:tabs>
+        <w:ind w:left="5040" w:hanging="360"/>
+      </w:pPr>
+      <w:rPr>
+        <w:rFonts w:ascii="Wingdings" w:hAnsi="Wingdings" w:hint="default"/>
+        <w:sz w:val="20"/>
+      </w:rPr>
+    </w:lvl>
+    <w:lvl w:ilvl="7" w:tentative="1">
+      <w:start w:val="1"/>
+      <w:numFmt w:val="bullet"/>
+      <w:lvlText w:val=""/>
+      <w:lvlJc w:val="left"/>
+      <w:pPr>
+        <w:tabs>
+          <w:tab w:val="num" w:pos="5760"/>
+        </w:tabs>
+        <w:ind w:left="5760" w:hanging="360"/>
+      </w:pPr>
+      <w:rPr>
+        <w:rFonts w:ascii="Wingdings" w:hAnsi="Wingdings" w:hint="default"/>
+        <w:sz w:val="20"/>
+      </w:rPr>
+    </w:lvl>
+    <w:lvl w:ilvl="8" w:tentative="1">
+      <w:start w:val="1"/>
+      <w:numFmt w:val="bullet"/>
+      <w:lvlText w:val=""/>
+      <w:lvlJc w:val="left"/>
+      <w:pPr>
+        <w:tabs>
+          <w:tab w:val="num" w:pos="6480"/>
+        </w:tabs>
+        <w:ind w:left="6480" w:hanging="360"/>
+      </w:pPr>
+      <w:rPr>
+        <w:rFonts w:ascii="Wingdings" w:hAnsi="Wingdings" w:hint="default"/>
+        <w:sz w:val="20"/>
+      </w:rPr>
+    </w:lvl>
+  </w:abstractNum>
+  <w:abstractNum w:abstractNumId="8" w15:restartNumberingAfterBreak="0">
     <w:nsid w:val="412F6573"/>
     <w:multiLevelType w:val="hybridMultilevel"/>
     <w:tmpl w:val="514672F2"/>
@@ -22486,7 +24786,7 @@
       </w:pPr>
     </w:lvl>
   </w:abstractNum>
-  <w:abstractNum w:abstractNumId="6" w15:restartNumberingAfterBreak="0">
+  <w:abstractNum w:abstractNumId="9" w15:restartNumberingAfterBreak="0">
     <w:nsid w:val="41465C0B"/>
     <w:multiLevelType w:val="hybridMultilevel"/>
     <w:tmpl w:val="514672F2"/>
@@ -22572,7 +24872,7 @@
       </w:pPr>
     </w:lvl>
   </w:abstractNum>
-  <w:abstractNum w:abstractNumId="7" w15:restartNumberingAfterBreak="0">
+  <w:abstractNum w:abstractNumId="10" w15:restartNumberingAfterBreak="0">
     <w:nsid w:val="47BD6D77"/>
     <w:multiLevelType w:val="hybridMultilevel"/>
     <w:tmpl w:val="9DFE81F8"/>
@@ -22659,7 +24959,7 @@
       </w:pPr>
     </w:lvl>
   </w:abstractNum>
-  <w:abstractNum w:abstractNumId="8" w15:restartNumberingAfterBreak="0">
+  <w:abstractNum w:abstractNumId="11" w15:restartNumberingAfterBreak="0">
     <w:nsid w:val="52AD799A"/>
     <w:multiLevelType w:val="hybridMultilevel"/>
     <w:tmpl w:val="11EE334E"/>
@@ -22772,7 +25072,7 @@
       </w:rPr>
     </w:lvl>
   </w:abstractNum>
-  <w:abstractNum w:abstractNumId="9" w15:restartNumberingAfterBreak="0">
+  <w:abstractNum w:abstractNumId="12" w15:restartNumberingAfterBreak="0">
     <w:nsid w:val="60E03449"/>
     <w:multiLevelType w:val="hybridMultilevel"/>
     <w:tmpl w:val="514672F2"/>
@@ -22858,7 +25158,7 @@
       </w:pPr>
     </w:lvl>
   </w:abstractNum>
-  <w:abstractNum w:abstractNumId="10" w15:restartNumberingAfterBreak="0">
+  <w:abstractNum w:abstractNumId="13" w15:restartNumberingAfterBreak="0">
     <w:nsid w:val="61054A66"/>
     <w:multiLevelType w:val="hybridMultilevel"/>
     <w:tmpl w:val="514672F2"/>
@@ -22944,7 +25244,156 @@
       </w:pPr>
     </w:lvl>
   </w:abstractNum>
-  <w:abstractNum w:abstractNumId="11" w15:restartNumberingAfterBreak="0">
+  <w:abstractNum w:abstractNumId="14" w15:restartNumberingAfterBreak="0">
+    <w:nsid w:val="650E23AF"/>
+    <w:multiLevelType w:val="multilevel"/>
+    <w:tmpl w:val="51966418"/>
+    <w:lvl w:ilvl="0">
+      <w:start w:val="1"/>
+      <w:numFmt w:val="decimal"/>
+      <w:lvlText w:val="%1."/>
+      <w:lvlJc w:val="left"/>
+      <w:pPr>
+        <w:tabs>
+          <w:tab w:val="num" w:pos="720"/>
+        </w:tabs>
+        <w:ind w:left="720" w:hanging="360"/>
+      </w:pPr>
+      <w:rPr>
+        <w:rFonts w:hint="default"/>
+        <w:sz w:val="20"/>
+      </w:rPr>
+    </w:lvl>
+    <w:lvl w:ilvl="1" w:tentative="1">
+      <w:start w:val="1"/>
+      <w:numFmt w:val="bullet"/>
+      <w:lvlText w:val="o"/>
+      <w:lvlJc w:val="left"/>
+      <w:pPr>
+        <w:tabs>
+          <w:tab w:val="num" w:pos="1440"/>
+        </w:tabs>
+        <w:ind w:left="1440" w:hanging="360"/>
+      </w:pPr>
+      <w:rPr>
+        <w:rFonts w:ascii="Courier New" w:hAnsi="Courier New" w:hint="default"/>
+        <w:sz w:val="20"/>
+      </w:rPr>
+    </w:lvl>
+    <w:lvl w:ilvl="2" w:tentative="1">
+      <w:start w:val="1"/>
+      <w:numFmt w:val="bullet"/>
+      <w:lvlText w:val=""/>
+      <w:lvlJc w:val="left"/>
+      <w:pPr>
+        <w:tabs>
+          <w:tab w:val="num" w:pos="2160"/>
+        </w:tabs>
+        <w:ind w:left="2160" w:hanging="360"/>
+      </w:pPr>
+      <w:rPr>
+        <w:rFonts w:ascii="Wingdings" w:hAnsi="Wingdings" w:hint="default"/>
+        <w:sz w:val="20"/>
+      </w:rPr>
+    </w:lvl>
+    <w:lvl w:ilvl="3" w:tentative="1">
+      <w:start w:val="1"/>
+      <w:numFmt w:val="bullet"/>
+      <w:lvlText w:val=""/>
+      <w:lvlJc w:val="left"/>
+      <w:pPr>
+        <w:tabs>
+          <w:tab w:val="num" w:pos="2880"/>
+        </w:tabs>
+        <w:ind w:left="2880" w:hanging="360"/>
+      </w:pPr>
+      <w:rPr>
+        <w:rFonts w:ascii="Wingdings" w:hAnsi="Wingdings" w:hint="default"/>
+        <w:sz w:val="20"/>
+      </w:rPr>
+    </w:lvl>
+    <w:lvl w:ilvl="4" w:tentative="1">
+      <w:start w:val="1"/>
+      <w:numFmt w:val="bullet"/>
+      <w:lvlText w:val=""/>
+      <w:lvlJc w:val="left"/>
+      <w:pPr>
+        <w:tabs>
+          <w:tab w:val="num" w:pos="3600"/>
+        </w:tabs>
+        <w:ind w:left="3600" w:hanging="360"/>
+      </w:pPr>
+      <w:rPr>
+        <w:rFonts w:ascii="Wingdings" w:hAnsi="Wingdings" w:hint="default"/>
+        <w:sz w:val="20"/>
+      </w:rPr>
+    </w:lvl>
+    <w:lvl w:ilvl="5" w:tentative="1">
+      <w:start w:val="1"/>
+      <w:numFmt w:val="bullet"/>
+      <w:lvlText w:val=""/>
+      <w:lvlJc w:val="left"/>
+      <w:pPr>
+        <w:tabs>
+          <w:tab w:val="num" w:pos="4320"/>
+        </w:tabs>
+        <w:ind w:left="4320" w:hanging="360"/>
+      </w:pPr>
+      <w:rPr>
+        <w:rFonts w:ascii="Wingdings" w:hAnsi="Wingdings" w:hint="default"/>
+        <w:sz w:val="20"/>
+      </w:rPr>
+    </w:lvl>
+    <w:lvl w:ilvl="6" w:tentative="1">
+      <w:start w:val="1"/>
+      <w:numFmt w:val="bullet"/>
+      <w:lvlText w:val=""/>
+      <w:lvlJc w:val="left"/>
+      <w:pPr>
+        <w:tabs>
+          <w:tab w:val="num" w:pos="5040"/>
+        </w:tabs>
+        <w:ind w:left="5040" w:hanging="360"/>
+      </w:pPr>
+      <w:rPr>
+        <w:rFonts w:ascii="Wingdings" w:hAnsi="Wingdings" w:hint="default"/>
+        <w:sz w:val="20"/>
+      </w:rPr>
+    </w:lvl>
+    <w:lvl w:ilvl="7" w:tentative="1">
+      <w:start w:val="1"/>
+      <w:numFmt w:val="bullet"/>
+      <w:lvlText w:val=""/>
+      <w:lvlJc w:val="left"/>
+      <w:pPr>
+        <w:tabs>
+          <w:tab w:val="num" w:pos="5760"/>
+        </w:tabs>
+        <w:ind w:left="5760" w:hanging="360"/>
+      </w:pPr>
+      <w:rPr>
+        <w:rFonts w:ascii="Wingdings" w:hAnsi="Wingdings" w:hint="default"/>
+        <w:sz w:val="20"/>
+      </w:rPr>
+    </w:lvl>
+    <w:lvl w:ilvl="8" w:tentative="1">
+      <w:start w:val="1"/>
+      <w:numFmt w:val="bullet"/>
+      <w:lvlText w:val=""/>
+      <w:lvlJc w:val="left"/>
+      <w:pPr>
+        <w:tabs>
+          <w:tab w:val="num" w:pos="6480"/>
+        </w:tabs>
+        <w:ind w:left="6480" w:hanging="360"/>
+      </w:pPr>
+      <w:rPr>
+        <w:rFonts w:ascii="Wingdings" w:hAnsi="Wingdings" w:hint="default"/>
+        <w:sz w:val="20"/>
+      </w:rPr>
+    </w:lvl>
+  </w:abstractNum>
+  <w:abstractNum w:abstractNumId="15" w15:restartNumberingAfterBreak="0">
     <w:nsid w:val="655B0E8C"/>
     <w:multiLevelType w:val="hybridMultilevel"/>
     <w:tmpl w:val="11EE334E"/>
@@ -23057,7 +25506,7 @@
       </w:rPr>
     </w:lvl>
   </w:abstractNum>
-  <w:abstractNum w:abstractNumId="12" w15:restartNumberingAfterBreak="0">
+  <w:abstractNum w:abstractNumId="16" w15:restartNumberingAfterBreak="0">
     <w:nsid w:val="66A64C46"/>
     <w:multiLevelType w:val="hybridMultilevel"/>
     <w:tmpl w:val="514672F2"/>
@@ -23143,7 +25592,7 @@
       </w:pPr>
     </w:lvl>
   </w:abstractNum>
-  <w:abstractNum w:abstractNumId="13" w15:restartNumberingAfterBreak="0">
+  <w:abstractNum w:abstractNumId="17" w15:restartNumberingAfterBreak="0">
     <w:nsid w:val="6CBC4620"/>
     <w:multiLevelType w:val="hybridMultilevel"/>
     <w:tmpl w:val="11EE334E"/>
@@ -23256,7 +25705,7 @@
       </w:rPr>
     </w:lvl>
   </w:abstractNum>
-  <w:abstractNum w:abstractNumId="14" w15:restartNumberingAfterBreak="0">
+  <w:abstractNum w:abstractNumId="18" w15:restartNumberingAfterBreak="0">
     <w:nsid w:val="6D331ED9"/>
     <w:multiLevelType w:val="hybridMultilevel"/>
     <w:tmpl w:val="244284F2"/>
@@ -23342,7 +25791,7 @@
       </w:pPr>
     </w:lvl>
   </w:abstractNum>
-  <w:abstractNum w:abstractNumId="15" w15:restartNumberingAfterBreak="0">
+  <w:abstractNum w:abstractNumId="19" w15:restartNumberingAfterBreak="0">
     <w:nsid w:val="76823649"/>
     <w:multiLevelType w:val="hybridMultilevel"/>
     <w:tmpl w:val="514672F2"/>
@@ -23428,7 +25877,7 @@
       </w:pPr>
     </w:lvl>
   </w:abstractNum>
-  <w:abstractNum w:abstractNumId="16" w15:restartNumberingAfterBreak="0">
+  <w:abstractNum w:abstractNumId="20" w15:restartNumberingAfterBreak="0">
     <w:nsid w:val="76CF277D"/>
     <w:multiLevelType w:val="hybridMultilevel"/>
     <w:tmpl w:val="514672F2"/>
@@ -23514,7 +25963,7 @@
       </w:pPr>
     </w:lvl>
   </w:abstractNum>
-  <w:abstractNum w:abstractNumId="17" w15:restartNumberingAfterBreak="0">
+  <w:abstractNum w:abstractNumId="21" w15:restartNumberingAfterBreak="0">
     <w:nsid w:val="7838473C"/>
     <w:multiLevelType w:val="hybridMultilevel"/>
     <w:tmpl w:val="11EE334E"/>
@@ -23627,7 +26076,7 @@
       </w:rPr>
     </w:lvl>
   </w:abstractNum>
-  <w:abstractNum w:abstractNumId="18" w15:restartNumberingAfterBreak="0">
+  <w:abstractNum w:abstractNumId="22" w15:restartNumberingAfterBreak="0">
     <w:nsid w:val="793D6C9F"/>
     <w:multiLevelType w:val="hybridMultilevel"/>
     <w:tmpl w:val="514672F2"/>
@@ -23713,7 +26162,7 @@
       </w:pPr>
     </w:lvl>
   </w:abstractNum>
-  <w:abstractNum w:abstractNumId="19" w15:restartNumberingAfterBreak="0">
+  <w:abstractNum w:abstractNumId="23" w15:restartNumberingAfterBreak="0">
     <w:nsid w:val="7CA3431B"/>
     <w:multiLevelType w:val="hybridMultilevel"/>
     <w:tmpl w:val="514672F2"/>
@@ -23799,7 +26248,7 @@
       </w:pPr>
     </w:lvl>
   </w:abstractNum>
-  <w:abstractNum w:abstractNumId="20" w15:restartNumberingAfterBreak="0">
+  <w:abstractNum w:abstractNumId="24" w15:restartNumberingAfterBreak="0">
     <w:nsid w:val="7DB27AB6"/>
     <w:multiLevelType w:val="hybridMultilevel"/>
     <w:tmpl w:val="F60E27FE"/>
@@ -23913,67 +26362,79 @@
     </w:lvl>
   </w:abstractNum>
   <w:num w:numId="1" w16cid:durableId="220136500">
+    <w:abstractNumId w:val="24"/>
+  </w:num>
+  <w:num w:numId="2" w16cid:durableId="922647808">
+    <w:abstractNumId w:val="10"/>
+  </w:num>
+  <w:num w:numId="3" w16cid:durableId="693919930">
+    <w:abstractNumId w:val="5"/>
+  </w:num>
+  <w:num w:numId="4" w16cid:durableId="1151289061">
+    <w:abstractNumId w:val="15"/>
+  </w:num>
+  <w:num w:numId="5" w16cid:durableId="985627518">
+    <w:abstractNumId w:val="18"/>
+  </w:num>
+  <w:num w:numId="6" w16cid:durableId="1229999792">
+    <w:abstractNumId w:val="3"/>
+  </w:num>
+  <w:num w:numId="7" w16cid:durableId="279458931">
+    <w:abstractNumId w:val="6"/>
+  </w:num>
+  <w:num w:numId="8" w16cid:durableId="1366829062">
+    <w:abstractNumId w:val="9"/>
+  </w:num>
+  <w:num w:numId="9" w16cid:durableId="327753722">
+    <w:abstractNumId w:val="21"/>
+  </w:num>
+  <w:num w:numId="10" w16cid:durableId="1715890310">
+    <w:abstractNumId w:val="16"/>
+  </w:num>
+  <w:num w:numId="11" w16cid:durableId="1699429000">
+    <w:abstractNumId w:val="11"/>
+  </w:num>
+  <w:num w:numId="12" w16cid:durableId="236399501">
     <w:abstractNumId w:val="20"/>
   </w:num>
-  <w:num w:numId="2" w16cid:durableId="922647808">
-    <w:abstractNumId w:val="7"/>
-  </w:num>
-  <w:num w:numId="3" w16cid:durableId="693919930">
-    <w:abstractNumId w:val="3"/>
-  </w:num>
-  <w:num w:numId="4" w16cid:durableId="1151289061">
-    <w:abstractNumId w:val="11"/>
-  </w:num>
-  <w:num w:numId="5" w16cid:durableId="985627518">
-    <w:abstractNumId w:val="14"/>
-  </w:num>
-  <w:num w:numId="6" w16cid:durableId="1229999792">
+  <w:num w:numId="13" w16cid:durableId="376053009">
     <w:abstractNumId w:val="2"/>
   </w:num>
-  <w:num w:numId="7" w16cid:durableId="279458931">
-    <w:abstractNumId w:val="4"/>
+  <w:num w:numId="14" w16cid:durableId="2126003694">
+    <w:abstractNumId w:val="13"/>
   </w:num>
-  <w:num w:numId="8" w16cid:durableId="1366829062">
-    <w:abstractNumId w:val="6"/>
-  </w:num>
-  <w:num w:numId="9" w16cid:durableId="327753722">
+  <w:num w:numId="15" w16cid:durableId="1864130525">
     <w:abstractNumId w:val="17"/>
   </w:num>
-  <w:num w:numId="10" w16cid:durableId="1715890310">
+  <w:num w:numId="16" w16cid:durableId="313339338">
     <w:abstractNumId w:val="12"/>
   </w:num>
-  <w:num w:numId="11" w16cid:durableId="1699429000">
-    <w:abstractNumId w:val="8"/>
-  </w:num>
-  <w:num w:numId="12" w16cid:durableId="236399501">
-    <w:abstractNumId w:val="16"/>
-  </w:num>
-  <w:num w:numId="13" w16cid:durableId="376053009">
-    <w:abstractNumId w:val="1"/>
-  </w:num>
-  <w:num w:numId="14" w16cid:durableId="2126003694">
-    <w:abstractNumId w:val="10"/>
-  </w:num>
-  <w:num w:numId="15" w16cid:durableId="1864130525">
-    <w:abstractNumId w:val="13"/>
-  </w:num>
-  <w:num w:numId="16" w16cid:durableId="313339338">
-    <w:abstractNumId w:val="9"/>
-  </w:num>
   <w:num w:numId="17" w16cid:durableId="1546942958">
-    <w:abstractNumId w:val="18"/>
+    <w:abstractNumId w:val="22"/>
   </w:num>
   <w:num w:numId="18" w16cid:durableId="670302402">
-    <w:abstractNumId w:val="5"/>
+    <w:abstractNumId w:val="8"/>
   </w:num>
   <w:num w:numId="19" w16cid:durableId="1106660611">
     <w:abstractNumId w:val="0"/>
   </w:num>
   <w:num w:numId="20" w16cid:durableId="1181352318">
-    <w:abstractNumId w:val="15"/>
+    <w:abstractNumId w:val="19"/>
   </w:num>
   <w:num w:numId="21" w16cid:durableId="839078963">
-    <w:abstractNumId w:val="19"/>
+    <w:abstractNumId w:val="23"/>
+  </w:num>
+  <w:num w:numId="22" w16cid:durableId="1693921945">
+    <w:abstractNumId w:val="1"/>
+  </w:num>
+  <w:num w:numId="23" w16cid:durableId="912474333">
+    <w:abstractNumId w:val="4"/>
+  </w:num>
+  <w:num w:numId="24" w16cid:durableId="1425347422">
+    <w:abstractNumId w:val="14"/>
+  </w:num>
+  <w:num w:numId="25" w16cid:durableId="1171918065">
+    <w:abstractNumId w:val="7"/>
   </w:num>
   <w:numIdMacAtCleanup w:val="21"/>
 </w:numbering>
@@ -24591,7 +27052,6 @@
   <w:style w:type="character" w:default="1" w:styleId="DefaultParagraphFont">
     <w:name w:val="Default Paragraph Font"/>
     <w:uiPriority w:val="1"/>
-    <w:semiHidden/>
     <w:unhideWhenUsed/>
   </w:style>
   <w:style w:type="table" w:default="1" w:styleId="TableNormal">

</xml_diff>